<commit_message>
Added file with notes on subdivision of tasks
</commit_message>
<xml_diff>
--- a/report/Report_framework.docx
+++ b/report/Report_framework.docx
@@ -49,12 +49,21 @@
           <w:u w:val="single"/>
         </w:rPr>
       </w:pPr>
+      <w:proofErr w:type="spellStart"/>
       <w:r>
         <w:rPr>
           <w:rFonts w:ascii="Times New Roman" w:hAnsi="Times New Roman" w:cs="Times New Roman"/>
           <w:u w:val="single"/>
         </w:rPr>
-        <w:t xml:space="preserve">Mekayle Rajoo: </w:t>
+        <w:t>Mekayle</w:t>
+      </w:r>
+      <w:proofErr w:type="spellEnd"/>
+      <w:r>
+        <w:rPr>
+          <w:rFonts w:ascii="Times New Roman" w:hAnsi="Times New Roman" w:cs="Times New Roman"/>
+          <w:u w:val="single"/>
+        </w:rPr>
+        <w:t xml:space="preserve"> Rajoo: </w:t>
       </w:r>
       <w:r>
         <w:rPr>
@@ -75,13 +84,23 @@
           <w:u w:val="single"/>
         </w:rPr>
       </w:pPr>
+      <w:proofErr w:type="spellStart"/>
       <w:r>
         <w:rPr>
           <w:rFonts w:ascii="Times New Roman" w:hAnsi="Times New Roman" w:cs="Times New Roman"/>
           <w:u w:val="single"/>
         </w:rPr>
-        <w:t xml:space="preserve">Github repository link: </w:t>
-      </w:r>
+        <w:t>Github</w:t>
+      </w:r>
+      <w:proofErr w:type="spellEnd"/>
+      <w:r>
+        <w:rPr>
+          <w:rFonts w:ascii="Times New Roman" w:hAnsi="Times New Roman" w:cs="Times New Roman"/>
+          <w:u w:val="single"/>
+        </w:rPr>
+        <w:t xml:space="preserve"> repository link: </w:t>
+      </w:r>
+      <w:proofErr w:type="spellStart"/>
       <w:r>
         <w:rPr>
           <w:rFonts w:ascii="Times New Roman" w:hAnsi="Times New Roman" w:cs="Times New Roman"/>
@@ -90,6 +109,7 @@
         </w:rPr>
         <w:t>xxxxxxxxxxxxx</w:t>
       </w:r>
+      <w:proofErr w:type="spellEnd"/>
     </w:p>
     <w:p>
       <w:pPr>
@@ -105,7 +125,6 @@
           <w:bCs/>
           <w:sz w:val="20"/>
           <w:szCs w:val="20"/>
-          <w:lang w:val="fr-FR"/>
         </w:rPr>
       </w:pPr>
       <w:r>
@@ -115,9 +134,19 @@
           <w:bCs/>
           <w:sz w:val="20"/>
           <w:szCs w:val="20"/>
-          <w:lang w:val="fr-FR"/>
         </w:rPr>
         <w:t>Data provenance and description</w:t>
+      </w:r>
+      <w:r>
+        <w:rPr>
+          <w:rFonts w:ascii="Times New Roman" w:hAnsi="Times New Roman" w:cs="Times New Roman"/>
+          <w:b/>
+          <w:bCs/>
+          <w:color w:val="EE0000"/>
+          <w:sz w:val="20"/>
+          <w:szCs w:val="20"/>
+        </w:rPr>
+        <w:t xml:space="preserve"> - -Savannah </w:t>
       </w:r>
     </w:p>
     <w:p>
@@ -177,25 +206,7 @@
             <w:sz w:val="20"/>
             <w:szCs w:val="20"/>
           </w:rPr>
-          <w:t>https://www.nyc.gov/site/tlc/about/tlc-trip-record-data.p</w:t>
-        </w:r>
-        <w:r>
-          <w:rPr>
-            <w:rStyle w:val="Hyperlink"/>
-            <w:rFonts w:ascii="Times New Roman" w:hAnsi="Times New Roman" w:cs="Times New Roman"/>
-            <w:sz w:val="20"/>
-            <w:szCs w:val="20"/>
-          </w:rPr>
-          <w:t>a</w:t>
-        </w:r>
-        <w:r>
-          <w:rPr>
-            <w:rStyle w:val="Hyperlink"/>
-            <w:rFonts w:ascii="Times New Roman" w:hAnsi="Times New Roman" w:cs="Times New Roman"/>
-            <w:sz w:val="20"/>
-            <w:szCs w:val="20"/>
-          </w:rPr>
-          <w:t>ge</w:t>
+          <w:t>https://www.nyc.gov/site/tlc/about/tlc-trip-record-data.page</w:t>
         </w:r>
       </w:hyperlink>
       <w:r>
@@ -214,6 +225,14 @@
         </w:rPr>
         <w:t xml:space="preserve"> This dataset </w:t>
       </w:r>
+      <w:r>
+        <w:rPr>
+          <w:rFonts w:ascii="Times New Roman" w:hAnsi="Times New Roman" w:cs="Times New Roman"/>
+          <w:sz w:val="20"/>
+          <w:szCs w:val="20"/>
+        </w:rPr>
+        <w:t xml:space="preserve">contains </w:t>
+      </w:r>
       <w:proofErr w:type="gramStart"/>
       <w:r>
         <w:rPr>
@@ -221,7 +240,7 @@
           <w:sz w:val="20"/>
           <w:szCs w:val="20"/>
         </w:rPr>
-        <w:t xml:space="preserve">contains </w:t>
+        <w:t xml:space="preserve">XXXX </w:t>
       </w:r>
       <w:r>
         <w:rPr>
@@ -248,7 +267,24 @@
           <w:sz w:val="20"/>
           <w:szCs w:val="20"/>
         </w:rPr>
-        <w:t>The data set is available for public use… licensing etc….</w:t>
+        <w:t>The data set is available for public use</w:t>
+      </w:r>
+      <w:r>
+        <w:rPr>
+          <w:rFonts w:ascii="Times New Roman" w:hAnsi="Times New Roman" w:cs="Times New Roman"/>
+          <w:sz w:val="20"/>
+          <w:szCs w:val="20"/>
+          <w:highlight w:val="yellow"/>
+        </w:rPr>
+        <w:t>… licensing etc….</w:t>
+      </w:r>
+      <w:r>
+        <w:rPr>
+          <w:rFonts w:ascii="Times New Roman" w:hAnsi="Times New Roman" w:cs="Times New Roman"/>
+          <w:sz w:val="20"/>
+          <w:szCs w:val="20"/>
+        </w:rPr>
+        <w:t xml:space="preserve">  </w:t>
       </w:r>
     </w:p>
     <w:p>
@@ -277,6 +313,40 @@
         </w:rPr>
         <w:t>Dataset size and characteristics</w:t>
       </w:r>
+      <w:r>
+        <w:rPr>
+          <w:rFonts w:ascii="Times New Roman" w:hAnsi="Times New Roman" w:cs="Times New Roman"/>
+          <w:b/>
+          <w:bCs/>
+          <w:sz w:val="20"/>
+          <w:szCs w:val="20"/>
+        </w:rPr>
+        <w:t xml:space="preserve"> </w:t>
+      </w:r>
+      <w:r>
+        <w:rPr>
+          <w:rFonts w:ascii="Times New Roman" w:hAnsi="Times New Roman" w:cs="Times New Roman"/>
+          <w:b/>
+          <w:bCs/>
+          <w:color w:val="EE0000"/>
+          <w:sz w:val="20"/>
+          <w:szCs w:val="20"/>
+        </w:rPr>
+        <w:t xml:space="preserve">- </w:t>
+      </w:r>
+      <w:proofErr w:type="spellStart"/>
+      <w:r>
+        <w:rPr>
+          <w:rFonts w:ascii="Times New Roman" w:hAnsi="Times New Roman" w:cs="Times New Roman"/>
+          <w:b/>
+          <w:bCs/>
+          <w:color w:val="EE0000"/>
+          <w:sz w:val="20"/>
+          <w:szCs w:val="20"/>
+        </w:rPr>
+        <w:t>Mekayle</w:t>
+      </w:r>
+      <w:proofErr w:type="spellEnd"/>
     </w:p>
     <w:p>
       <w:pPr>
@@ -877,6 +947,49 @@
         </w:rPr>
         <w:t>Preparation and quality of the dataset</w:t>
       </w:r>
+      <w:r>
+        <w:rPr>
+          <w:rFonts w:ascii="Times New Roman" w:hAnsi="Times New Roman" w:cs="Times New Roman"/>
+          <w:b/>
+          <w:bCs/>
+          <w:sz w:val="20"/>
+          <w:szCs w:val="20"/>
+        </w:rPr>
+        <w:t xml:space="preserve"> </w:t>
+      </w:r>
+      <w:r>
+        <w:rPr>
+          <w:rFonts w:ascii="Times New Roman" w:hAnsi="Times New Roman" w:cs="Times New Roman"/>
+          <w:b/>
+          <w:bCs/>
+          <w:color w:val="EE0000"/>
+          <w:sz w:val="20"/>
+          <w:szCs w:val="20"/>
+        </w:rPr>
+        <w:t>–</w:t>
+      </w:r>
+      <w:r>
+        <w:rPr>
+          <w:rFonts w:ascii="Times New Roman" w:hAnsi="Times New Roman" w:cs="Times New Roman"/>
+          <w:b/>
+          <w:bCs/>
+          <w:color w:val="EE0000"/>
+          <w:sz w:val="20"/>
+          <w:szCs w:val="20"/>
+        </w:rPr>
+        <w:t xml:space="preserve"> Savannah</w:t>
+      </w:r>
+      <w:r>
+        <w:rPr>
+          <w:rFonts w:ascii="Times New Roman" w:hAnsi="Times New Roman" w:cs="Times New Roman"/>
+          <w:b/>
+          <w:bCs/>
+          <w:color w:val="EE0000"/>
+          <w:sz w:val="20"/>
+          <w:szCs w:val="20"/>
+        </w:rPr>
+        <w:t xml:space="preserve"> – mention ranges</w:t>
+      </w:r>
     </w:p>
     <w:p>
       <w:pPr>
@@ -893,7 +1006,23 @@
           <w:sz w:val="20"/>
           <w:szCs w:val="20"/>
         </w:rPr>
-        <w:t xml:space="preserve">The following was done to prepare the dataset for analysis, the code used for cleaning is available in Appendix A: </w:t>
+        <w:t>The following was done to prepare the dataset for analysis, the code used for cleaning is available in Appendix A</w:t>
+      </w:r>
+      <w:r>
+        <w:rPr>
+          <w:rFonts w:ascii="Times New Roman" w:hAnsi="Times New Roman" w:cs="Times New Roman"/>
+          <w:sz w:val="20"/>
+          <w:szCs w:val="20"/>
+        </w:rPr>
+        <w:t>. Summaries from cleaning the dataset are presented in Appendix B</w:t>
+      </w:r>
+      <w:r>
+        <w:rPr>
+          <w:rFonts w:ascii="Times New Roman" w:hAnsi="Times New Roman" w:cs="Times New Roman"/>
+          <w:sz w:val="20"/>
+          <w:szCs w:val="20"/>
+        </w:rPr>
+        <w:t xml:space="preserve">: </w:t>
       </w:r>
     </w:p>
     <w:p>
@@ -965,7 +1094,59 @@
           <w:sz w:val="20"/>
           <w:szCs w:val="20"/>
         </w:rPr>
-        <w:t xml:space="preserve"> “valid trips”, this involved removing all entries were the passenger count, </w:t>
+        <w:t xml:space="preserve"> “valid trips”, this involved removing all entries w</w:t>
+      </w:r>
+      <w:r>
+        <w:rPr>
+          <w:rFonts w:ascii="Times New Roman" w:hAnsi="Times New Roman" w:cs="Times New Roman"/>
+          <w:sz w:val="20"/>
+          <w:szCs w:val="20"/>
+        </w:rPr>
+        <w:t>h</w:t>
+      </w:r>
+      <w:r>
+        <w:rPr>
+          <w:rFonts w:ascii="Times New Roman" w:hAnsi="Times New Roman" w:cs="Times New Roman"/>
+          <w:sz w:val="20"/>
+          <w:szCs w:val="20"/>
+        </w:rPr>
+        <w:t xml:space="preserve">ere the passenger count, </w:t>
+      </w:r>
+      <w:proofErr w:type="spellStart"/>
+      <w:r>
+        <w:rPr>
+          <w:rFonts w:ascii="Times New Roman" w:hAnsi="Times New Roman" w:cs="Times New Roman"/>
+          <w:sz w:val="20"/>
+          <w:szCs w:val="20"/>
+        </w:rPr>
+        <w:t>trip_distance</w:t>
+      </w:r>
+      <w:proofErr w:type="spellEnd"/>
+      <w:r>
+        <w:rPr>
+          <w:rFonts w:ascii="Times New Roman" w:hAnsi="Times New Roman" w:cs="Times New Roman"/>
+          <w:sz w:val="20"/>
+          <w:szCs w:val="20"/>
+        </w:rPr>
+        <w:t xml:space="preserve"> or </w:t>
+      </w:r>
+      <w:proofErr w:type="spellStart"/>
+      <w:r>
+        <w:rPr>
+          <w:rFonts w:ascii="Times New Roman" w:hAnsi="Times New Roman" w:cs="Times New Roman"/>
+          <w:sz w:val="20"/>
+          <w:szCs w:val="20"/>
+        </w:rPr>
+        <w:t>fare_amount</w:t>
+      </w:r>
+      <w:proofErr w:type="spellEnd"/>
+      <w:r>
+        <w:rPr>
+          <w:rFonts w:ascii="Times New Roman" w:hAnsi="Times New Roman" w:cs="Times New Roman"/>
+          <w:sz w:val="20"/>
+          <w:szCs w:val="20"/>
+        </w:rPr>
+        <w:t xml:space="preserve"> was not greater than zero. </w:t>
       </w:r>
     </w:p>
     <w:p>
@@ -1019,7 +1200,25 @@
           <w:sz w:val="20"/>
           <w:szCs w:val="20"/>
         </w:rPr>
-        <w:t xml:space="preserve">These variables were store_and_fwd_flag, </w:t>
+        <w:t xml:space="preserve">These variables were </w:t>
+      </w:r>
+      <w:proofErr w:type="spellStart"/>
+      <w:r>
+        <w:rPr>
+          <w:rFonts w:ascii="Times New Roman" w:hAnsi="Times New Roman" w:cs="Times New Roman"/>
+          <w:sz w:val="20"/>
+          <w:szCs w:val="20"/>
+        </w:rPr>
+        <w:t>store_and_fwd_flag</w:t>
+      </w:r>
+      <w:proofErr w:type="spellEnd"/>
+      <w:r>
+        <w:rPr>
+          <w:rFonts w:ascii="Times New Roman" w:hAnsi="Times New Roman" w:cs="Times New Roman"/>
+          <w:sz w:val="20"/>
+          <w:szCs w:val="20"/>
+        </w:rPr>
+        <w:t xml:space="preserve">, </w:t>
       </w:r>
       <w:r>
         <w:rPr>
@@ -1145,13 +1344,550 @@
     <w:p>
       <w:pPr>
         <w:pStyle w:val="ListParagraph"/>
+        <w:numPr>
+          <w:ilvl w:val="0"/>
+          <w:numId w:val="3"/>
+        </w:numPr>
         <w:jc w:val="both"/>
         <w:rPr>
           <w:rFonts w:ascii="Times New Roman" w:hAnsi="Times New Roman" w:cs="Times New Roman"/>
-          <w:sz w:val="20"/>
-          <w:szCs w:val="20"/>
-        </w:rPr>
-      </w:pPr>
+          <w:b/>
+          <w:bCs/>
+          <w:sz w:val="20"/>
+          <w:szCs w:val="20"/>
+        </w:rPr>
+      </w:pPr>
+      <w:r>
+        <w:rPr>
+          <w:rFonts w:ascii="Times New Roman" w:hAnsi="Times New Roman" w:cs="Times New Roman"/>
+          <w:b/>
+          <w:bCs/>
+          <w:sz w:val="20"/>
+          <w:szCs w:val="20"/>
+        </w:rPr>
+        <w:lastRenderedPageBreak/>
+        <w:t>Exploratory data analysis (EDA)</w:t>
+      </w:r>
+    </w:p>
+    <w:p>
+      <w:pPr>
+        <w:jc w:val="both"/>
+        <w:rPr>
+          <w:rFonts w:ascii="Times New Roman" w:hAnsi="Times New Roman" w:cs="Times New Roman"/>
+          <w:sz w:val="20"/>
+          <w:szCs w:val="20"/>
+        </w:rPr>
+      </w:pPr>
+      <w:r>
+        <w:rPr>
+          <w:rFonts w:ascii="Times New Roman" w:hAnsi="Times New Roman" w:cs="Times New Roman"/>
+          <w:sz w:val="20"/>
+          <w:szCs w:val="20"/>
+        </w:rPr>
+        <w:t xml:space="preserve">An exploratory data analysis was undertaken </w:t>
+      </w:r>
+      <w:proofErr w:type="gramStart"/>
+      <w:r>
+        <w:rPr>
+          <w:rFonts w:ascii="Times New Roman" w:hAnsi="Times New Roman" w:cs="Times New Roman"/>
+          <w:sz w:val="20"/>
+          <w:szCs w:val="20"/>
+        </w:rPr>
+        <w:t>in order to</w:t>
+      </w:r>
+      <w:proofErr w:type="gramEnd"/>
+      <w:r>
+        <w:rPr>
+          <w:rFonts w:ascii="Times New Roman" w:hAnsi="Times New Roman" w:cs="Times New Roman"/>
+          <w:sz w:val="20"/>
+          <w:szCs w:val="20"/>
+        </w:rPr>
+        <w:t xml:space="preserve"> better define </w:t>
+      </w:r>
+      <w:r>
+        <w:rPr>
+          <w:rFonts w:ascii="Times New Roman" w:hAnsi="Times New Roman" w:cs="Times New Roman"/>
+          <w:sz w:val="20"/>
+          <w:szCs w:val="20"/>
+        </w:rPr>
+        <w:t xml:space="preserve">the dataset and narrow down the business objective of the MIT805 group project. </w:t>
+      </w:r>
+      <w:r>
+        <w:rPr>
+          <w:rFonts w:ascii="Times New Roman" w:hAnsi="Times New Roman" w:cs="Times New Roman"/>
+          <w:sz w:val="20"/>
+          <w:szCs w:val="20"/>
+        </w:rPr>
+        <w:t xml:space="preserve">The EDA was done in line with exploring the feasibility of the business objective. </w:t>
+      </w:r>
+    </w:p>
+    <w:p>
+      <w:pPr>
+        <w:jc w:val="both"/>
+        <w:rPr>
+          <w:rFonts w:ascii="Times New Roman" w:hAnsi="Times New Roman" w:cs="Times New Roman"/>
+          <w:sz w:val="20"/>
+          <w:szCs w:val="20"/>
+        </w:rPr>
+      </w:pPr>
+      <w:r>
+        <w:rPr>
+          <w:rFonts w:ascii="Times New Roman" w:hAnsi="Times New Roman" w:cs="Times New Roman"/>
+          <w:sz w:val="20"/>
+          <w:szCs w:val="20"/>
+        </w:rPr>
+        <w:t>The correlation matrix for the variables is indicated in</w:t>
+      </w:r>
+      <w:r>
+        <w:rPr>
+          <w:rFonts w:ascii="Times New Roman" w:hAnsi="Times New Roman" w:cs="Times New Roman"/>
+          <w:sz w:val="20"/>
+          <w:szCs w:val="20"/>
+        </w:rPr>
+        <w:t xml:space="preserve"> </w:t>
+      </w:r>
+      <w:r>
+        <w:rPr>
+          <w:rFonts w:ascii="Times New Roman" w:hAnsi="Times New Roman" w:cs="Times New Roman"/>
+          <w:sz w:val="20"/>
+          <w:szCs w:val="20"/>
+          <w:highlight w:val="yellow"/>
+        </w:rPr>
+        <w:t>xxx</w:t>
+      </w:r>
+      <w:r>
+        <w:rPr>
+          <w:rFonts w:ascii="Times New Roman" w:hAnsi="Times New Roman" w:cs="Times New Roman"/>
+          <w:sz w:val="20"/>
+          <w:szCs w:val="20"/>
+        </w:rPr>
+        <w:t xml:space="preserve"> </w:t>
+      </w:r>
+      <w:r>
+        <w:rPr>
+          <w:rFonts w:ascii="Times New Roman" w:hAnsi="Times New Roman" w:cs="Times New Roman"/>
+          <w:sz w:val="20"/>
+          <w:szCs w:val="20"/>
+        </w:rPr>
+        <w:t xml:space="preserve">in Appendix </w:t>
+      </w:r>
+      <w:r>
+        <w:rPr>
+          <w:rFonts w:ascii="Times New Roman" w:hAnsi="Times New Roman" w:cs="Times New Roman"/>
+          <w:sz w:val="20"/>
+          <w:szCs w:val="20"/>
+        </w:rPr>
+        <w:t>C</w:t>
+      </w:r>
+      <w:r>
+        <w:rPr>
+          <w:rFonts w:ascii="Times New Roman" w:hAnsi="Times New Roman" w:cs="Times New Roman"/>
+          <w:sz w:val="20"/>
+          <w:szCs w:val="20"/>
+        </w:rPr>
+        <w:t xml:space="preserve">. </w:t>
+      </w:r>
+      <w:r>
+        <w:rPr>
+          <w:rFonts w:ascii="Times New Roman" w:hAnsi="Times New Roman" w:cs="Times New Roman"/>
+          <w:sz w:val="20"/>
+          <w:szCs w:val="20"/>
+        </w:rPr>
+        <w:t xml:space="preserve"> Variables such as </w:t>
+      </w:r>
+      <w:proofErr w:type="spellStart"/>
+      <w:r>
+        <w:rPr>
+          <w:rFonts w:ascii="Times New Roman" w:hAnsi="Times New Roman" w:cs="Times New Roman"/>
+          <w:sz w:val="20"/>
+          <w:szCs w:val="20"/>
+          <w:highlight w:val="yellow"/>
+        </w:rPr>
+        <w:t>xxxx</w:t>
+      </w:r>
+      <w:proofErr w:type="spellEnd"/>
+      <w:r>
+        <w:rPr>
+          <w:rFonts w:ascii="Times New Roman" w:hAnsi="Times New Roman" w:cs="Times New Roman"/>
+          <w:sz w:val="20"/>
+          <w:szCs w:val="20"/>
+        </w:rPr>
+        <w:t xml:space="preserve"> had notably high correlation with one another. </w:t>
+      </w:r>
+    </w:p>
+    <w:p>
+      <w:pPr>
+        <w:jc w:val="both"/>
+        <w:rPr>
+          <w:rFonts w:ascii="Times New Roman" w:hAnsi="Times New Roman" w:cs="Times New Roman"/>
+          <w:sz w:val="20"/>
+          <w:szCs w:val="20"/>
+        </w:rPr>
+      </w:pPr>
+      <w:r>
+        <w:rPr>
+          <w:rFonts w:ascii="Times New Roman" w:hAnsi="Times New Roman" w:cs="Times New Roman"/>
+          <w:sz w:val="20"/>
+          <w:szCs w:val="20"/>
+        </w:rPr>
+        <w:t xml:space="preserve">Some statistical characteristics of the </w:t>
+      </w:r>
+      <w:r>
+        <w:rPr>
+          <w:rFonts w:ascii="Times New Roman" w:hAnsi="Times New Roman" w:cs="Times New Roman"/>
+          <w:sz w:val="20"/>
+          <w:szCs w:val="20"/>
+        </w:rPr>
+        <w:t xml:space="preserve">numerical </w:t>
+      </w:r>
+      <w:r>
+        <w:rPr>
+          <w:rFonts w:ascii="Times New Roman" w:hAnsi="Times New Roman" w:cs="Times New Roman"/>
+          <w:sz w:val="20"/>
+          <w:szCs w:val="20"/>
+        </w:rPr>
+        <w:t>variables</w:t>
+      </w:r>
+      <w:r>
+        <w:rPr>
+          <w:rFonts w:ascii="Times New Roman" w:hAnsi="Times New Roman" w:cs="Times New Roman"/>
+          <w:sz w:val="20"/>
+          <w:szCs w:val="20"/>
+        </w:rPr>
+        <w:t>, such as the range and average over the dataset,</w:t>
+      </w:r>
+      <w:r>
+        <w:rPr>
+          <w:rFonts w:ascii="Times New Roman" w:hAnsi="Times New Roman" w:cs="Times New Roman"/>
+          <w:sz w:val="20"/>
+          <w:szCs w:val="20"/>
+        </w:rPr>
+        <w:t xml:space="preserve"> considered necessary are described </w:t>
+      </w:r>
+      <w:r>
+        <w:rPr>
+          <w:rFonts w:ascii="Times New Roman" w:hAnsi="Times New Roman" w:cs="Times New Roman"/>
+          <w:sz w:val="20"/>
+          <w:szCs w:val="20"/>
+        </w:rPr>
+        <w:t xml:space="preserve">in </w:t>
+      </w:r>
+      <w:r>
+        <w:rPr>
+          <w:rFonts w:ascii="Times New Roman" w:hAnsi="Times New Roman" w:cs="Times New Roman"/>
+          <w:sz w:val="20"/>
+          <w:szCs w:val="20"/>
+        </w:rPr>
+        <w:fldChar w:fldCharType="begin"/>
+      </w:r>
+      <w:r>
+        <w:rPr>
+          <w:rFonts w:ascii="Times New Roman" w:hAnsi="Times New Roman" w:cs="Times New Roman"/>
+          <w:sz w:val="20"/>
+          <w:szCs w:val="20"/>
+        </w:rPr>
+        <w:instrText xml:space="preserve"> REF _Ref238916291 \h  \* MERGEFORMAT </w:instrText>
+      </w:r>
+      <w:r>
+        <w:rPr>
+          <w:rFonts w:ascii="Times New Roman" w:hAnsi="Times New Roman" w:cs="Times New Roman"/>
+          <w:sz w:val="20"/>
+          <w:szCs w:val="20"/>
+        </w:rPr>
+      </w:r>
+      <w:r>
+        <w:rPr>
+          <w:rFonts w:ascii="Times New Roman" w:hAnsi="Times New Roman" w:cs="Times New Roman"/>
+          <w:sz w:val="20"/>
+          <w:szCs w:val="20"/>
+        </w:rPr>
+        <w:fldChar w:fldCharType="separate"/>
+      </w:r>
+      <w:r>
+        <w:rPr>
+          <w:rFonts w:ascii="Times New Roman" w:hAnsi="Times New Roman" w:cs="Times New Roman"/>
+          <w:sz w:val="20"/>
+          <w:szCs w:val="20"/>
+        </w:rPr>
+        <w:t>Table 3</w:t>
+      </w:r>
+      <w:r>
+        <w:rPr>
+          <w:rFonts w:ascii="Times New Roman" w:hAnsi="Times New Roman" w:cs="Times New Roman"/>
+          <w:sz w:val="20"/>
+          <w:szCs w:val="20"/>
+        </w:rPr>
+        <w:fldChar w:fldCharType="end"/>
+      </w:r>
+      <w:r>
+        <w:rPr>
+          <w:rFonts w:ascii="Times New Roman" w:hAnsi="Times New Roman" w:cs="Times New Roman"/>
+          <w:sz w:val="20"/>
+          <w:szCs w:val="20"/>
+        </w:rPr>
+        <w:t xml:space="preserve"> and </w:t>
+      </w:r>
+      <w:r>
+        <w:rPr>
+          <w:rFonts w:ascii="Times New Roman" w:hAnsi="Times New Roman" w:cs="Times New Roman"/>
+          <w:sz w:val="20"/>
+          <w:szCs w:val="20"/>
+        </w:rPr>
+        <w:fldChar w:fldCharType="begin"/>
+      </w:r>
+      <w:r>
+        <w:rPr>
+          <w:rFonts w:ascii="Times New Roman" w:hAnsi="Times New Roman" w:cs="Times New Roman"/>
+          <w:sz w:val="20"/>
+          <w:szCs w:val="20"/>
+        </w:rPr>
+        <w:instrText xml:space="preserve"> REF _Ref238916300 \h  \* MERGEFORMAT </w:instrText>
+      </w:r>
+      <w:r>
+        <w:rPr>
+          <w:rFonts w:ascii="Times New Roman" w:hAnsi="Times New Roman" w:cs="Times New Roman"/>
+          <w:sz w:val="20"/>
+          <w:szCs w:val="20"/>
+        </w:rPr>
+      </w:r>
+      <w:r>
+        <w:rPr>
+          <w:rFonts w:ascii="Times New Roman" w:hAnsi="Times New Roman" w:cs="Times New Roman"/>
+          <w:sz w:val="20"/>
+          <w:szCs w:val="20"/>
+        </w:rPr>
+        <w:fldChar w:fldCharType="separate"/>
+      </w:r>
+      <w:r>
+        <w:rPr>
+          <w:rFonts w:ascii="Times New Roman" w:hAnsi="Times New Roman" w:cs="Times New Roman"/>
+          <w:sz w:val="20"/>
+          <w:szCs w:val="20"/>
+        </w:rPr>
+        <w:t>Table 4</w:t>
+      </w:r>
+      <w:r>
+        <w:rPr>
+          <w:rFonts w:ascii="Times New Roman" w:hAnsi="Times New Roman" w:cs="Times New Roman"/>
+          <w:sz w:val="20"/>
+          <w:szCs w:val="20"/>
+        </w:rPr>
+        <w:fldChar w:fldCharType="end"/>
+      </w:r>
+      <w:r>
+        <w:rPr>
+          <w:rFonts w:ascii="Times New Roman" w:hAnsi="Times New Roman" w:cs="Times New Roman"/>
+          <w:sz w:val="20"/>
+          <w:szCs w:val="20"/>
+        </w:rPr>
+        <w:t xml:space="preserve"> </w:t>
+      </w:r>
+      <w:r>
+        <w:rPr>
+          <w:rFonts w:ascii="Times New Roman" w:hAnsi="Times New Roman" w:cs="Times New Roman"/>
+          <w:sz w:val="20"/>
+          <w:szCs w:val="20"/>
+        </w:rPr>
+        <w:t>in</w:t>
+      </w:r>
+      <w:r>
+        <w:rPr>
+          <w:rFonts w:ascii="Times New Roman" w:hAnsi="Times New Roman" w:cs="Times New Roman"/>
+          <w:sz w:val="20"/>
+          <w:szCs w:val="20"/>
+        </w:rPr>
+        <w:t xml:space="preserve"> Appendix </w:t>
+      </w:r>
+      <w:r>
+        <w:rPr>
+          <w:rFonts w:ascii="Times New Roman" w:hAnsi="Times New Roman" w:cs="Times New Roman"/>
+          <w:sz w:val="20"/>
+          <w:szCs w:val="20"/>
+        </w:rPr>
+        <w:t>C</w:t>
+      </w:r>
+      <w:r>
+        <w:rPr>
+          <w:rFonts w:ascii="Times New Roman" w:hAnsi="Times New Roman" w:cs="Times New Roman"/>
+          <w:sz w:val="20"/>
+          <w:szCs w:val="20"/>
+        </w:rPr>
+        <w:t xml:space="preserve">. </w:t>
+      </w:r>
+    </w:p>
+    <w:p>
+      <w:pPr>
+        <w:jc w:val="both"/>
+        <w:rPr>
+          <w:rFonts w:ascii="Times New Roman" w:hAnsi="Times New Roman" w:cs="Times New Roman"/>
+          <w:sz w:val="20"/>
+          <w:szCs w:val="20"/>
+        </w:rPr>
+      </w:pPr>
+      <w:r>
+        <w:rPr>
+          <w:rFonts w:ascii="Times New Roman" w:hAnsi="Times New Roman" w:cs="Times New Roman"/>
+          <w:sz w:val="20"/>
+          <w:szCs w:val="20"/>
+        </w:rPr>
+        <w:t xml:space="preserve">Another topic explored during EDA was </w:t>
+      </w:r>
+      <w:proofErr w:type="spellStart"/>
+      <w:r>
+        <w:rPr>
+          <w:rFonts w:ascii="Times New Roman" w:hAnsi="Times New Roman" w:cs="Times New Roman"/>
+          <w:sz w:val="20"/>
+          <w:szCs w:val="20"/>
+          <w:highlight w:val="yellow"/>
+        </w:rPr>
+        <w:t>xxxxx</w:t>
+      </w:r>
+      <w:proofErr w:type="spellEnd"/>
+      <w:r>
+        <w:rPr>
+          <w:rFonts w:ascii="Times New Roman" w:hAnsi="Times New Roman" w:cs="Times New Roman"/>
+          <w:sz w:val="20"/>
+          <w:szCs w:val="20"/>
+        </w:rPr>
+        <w:t xml:space="preserve"> </w:t>
+      </w:r>
+    </w:p>
+    <w:p>
+      <w:pPr>
+        <w:jc w:val="both"/>
+        <w:rPr>
+          <w:rFonts w:ascii="Times New Roman" w:hAnsi="Times New Roman" w:cs="Times New Roman"/>
+          <w:color w:val="EE0000"/>
+          <w:sz w:val="20"/>
+          <w:szCs w:val="20"/>
+          <w:lang w:val="fr-FR"/>
+        </w:rPr>
+      </w:pPr>
+      <w:r>
+        <w:rPr>
+          <w:rFonts w:ascii="Times New Roman" w:hAnsi="Times New Roman" w:cs="Times New Roman"/>
+          <w:color w:val="EE0000"/>
+          <w:sz w:val="20"/>
+          <w:szCs w:val="20"/>
+          <w:lang w:val="fr-FR"/>
+        </w:rPr>
+        <w:t>Matrix – Savannah</w:t>
+      </w:r>
+    </w:p>
+    <w:p>
+      <w:pPr>
+        <w:jc w:val="both"/>
+        <w:rPr>
+          <w:rFonts w:ascii="Times New Roman" w:hAnsi="Times New Roman" w:cs="Times New Roman"/>
+          <w:color w:val="EE0000"/>
+          <w:sz w:val="20"/>
+          <w:szCs w:val="20"/>
+          <w:lang w:val="fr-FR"/>
+        </w:rPr>
+      </w:pPr>
+      <w:proofErr w:type="gramStart"/>
+      <w:r>
+        <w:rPr>
+          <w:rFonts w:ascii="Times New Roman" w:hAnsi="Times New Roman" w:cs="Times New Roman"/>
+          <w:color w:val="EE0000"/>
+          <w:sz w:val="20"/>
+          <w:szCs w:val="20"/>
+          <w:lang w:val="fr-FR"/>
+        </w:rPr>
+        <w:t>Ranges</w:t>
+      </w:r>
+      <w:proofErr w:type="gramEnd"/>
+      <w:r>
+        <w:rPr>
+          <w:rFonts w:ascii="Times New Roman" w:hAnsi="Times New Roman" w:cs="Times New Roman"/>
+          <w:color w:val="EE0000"/>
+          <w:sz w:val="20"/>
+          <w:szCs w:val="20"/>
+          <w:lang w:val="fr-FR"/>
+        </w:rPr>
+        <w:t xml:space="preserve"> – </w:t>
+      </w:r>
+      <w:proofErr w:type="spellStart"/>
+      <w:r>
+        <w:rPr>
+          <w:rFonts w:ascii="Times New Roman" w:hAnsi="Times New Roman" w:cs="Times New Roman"/>
+          <w:color w:val="EE0000"/>
+          <w:sz w:val="20"/>
+          <w:szCs w:val="20"/>
+          <w:lang w:val="fr-FR"/>
+        </w:rPr>
+        <w:t>Mekayle</w:t>
+      </w:r>
+      <w:proofErr w:type="spellEnd"/>
+    </w:p>
+    <w:p>
+      <w:pPr>
+        <w:jc w:val="both"/>
+        <w:rPr>
+          <w:rFonts w:ascii="Times New Roman" w:hAnsi="Times New Roman" w:cs="Times New Roman"/>
+          <w:color w:val="EE0000"/>
+          <w:sz w:val="20"/>
+          <w:szCs w:val="20"/>
+        </w:rPr>
+      </w:pPr>
+      <w:r>
+        <w:rPr>
+          <w:rFonts w:ascii="Times New Roman" w:hAnsi="Times New Roman" w:cs="Times New Roman"/>
+          <w:color w:val="EE0000"/>
+          <w:sz w:val="20"/>
+          <w:szCs w:val="20"/>
+        </w:rPr>
+        <w:t xml:space="preserve">If time – add summaries of </w:t>
+      </w:r>
+      <w:r>
+        <w:rPr>
+          <w:rFonts w:ascii="Times New Roman" w:hAnsi="Times New Roman" w:cs="Times New Roman"/>
+          <w:color w:val="EE0000"/>
+          <w:sz w:val="20"/>
+          <w:szCs w:val="20"/>
+        </w:rPr>
+        <w:t>one or two aspects over time in a graph: No trips vs time (</w:t>
+      </w:r>
+      <w:proofErr w:type="spellStart"/>
+      <w:r>
+        <w:rPr>
+          <w:rFonts w:ascii="Times New Roman" w:hAnsi="Times New Roman" w:cs="Times New Roman"/>
+          <w:color w:val="EE0000"/>
+          <w:sz w:val="20"/>
+          <w:szCs w:val="20"/>
+        </w:rPr>
+        <w:t>Mekayle</w:t>
+      </w:r>
+      <w:proofErr w:type="spellEnd"/>
+      <w:r>
+        <w:rPr>
+          <w:rFonts w:ascii="Times New Roman" w:hAnsi="Times New Roman" w:cs="Times New Roman"/>
+          <w:color w:val="EE0000"/>
+          <w:sz w:val="20"/>
+          <w:szCs w:val="20"/>
+        </w:rPr>
+        <w:t>), Fare amounts over time (Savannah), payment methods over time (</w:t>
+      </w:r>
+      <w:proofErr w:type="gramStart"/>
+      <w:r>
+        <w:rPr>
+          <w:rFonts w:ascii="Times New Roman" w:hAnsi="Times New Roman" w:cs="Times New Roman"/>
+          <w:color w:val="EE0000"/>
+          <w:sz w:val="20"/>
+          <w:szCs w:val="20"/>
+        </w:rPr>
+        <w:t>too</w:t>
+      </w:r>
+      <w:proofErr w:type="gramEnd"/>
+      <w:r>
+        <w:rPr>
+          <w:rFonts w:ascii="Times New Roman" w:hAnsi="Times New Roman" w:cs="Times New Roman"/>
+          <w:color w:val="EE0000"/>
+          <w:sz w:val="20"/>
+          <w:szCs w:val="20"/>
+        </w:rPr>
+        <w:t xml:space="preserve"> see if cash decreases). </w:t>
+      </w:r>
     </w:p>
     <w:p>
       <w:pPr>
@@ -1177,8 +1913,7 @@
           <w:sz w:val="20"/>
           <w:szCs w:val="20"/>
         </w:rPr>
-        <w:lastRenderedPageBreak/>
-        <w:t>Exploratory data analysis (EDA)</w:t>
+        <w:t>The dataset in the context of the 7 Vs of big data</w:t>
       </w:r>
     </w:p>
     <w:p>
@@ -1196,182 +1931,6 @@
           <w:sz w:val="20"/>
           <w:szCs w:val="20"/>
         </w:rPr>
-        <w:t xml:space="preserve">An exploratory data analysis was undertaken </w:t>
-      </w:r>
-      <w:proofErr w:type="gramStart"/>
-      <w:r>
-        <w:rPr>
-          <w:rFonts w:ascii="Times New Roman" w:hAnsi="Times New Roman" w:cs="Times New Roman"/>
-          <w:sz w:val="20"/>
-          <w:szCs w:val="20"/>
-        </w:rPr>
-        <w:t>in order to</w:t>
-      </w:r>
-      <w:proofErr w:type="gramEnd"/>
-      <w:r>
-        <w:rPr>
-          <w:rFonts w:ascii="Times New Roman" w:hAnsi="Times New Roman" w:cs="Times New Roman"/>
-          <w:sz w:val="20"/>
-          <w:szCs w:val="20"/>
-        </w:rPr>
-        <w:t xml:space="preserve"> better define </w:t>
-      </w:r>
-      <w:r>
-        <w:rPr>
-          <w:rFonts w:ascii="Times New Roman" w:hAnsi="Times New Roman" w:cs="Times New Roman"/>
-          <w:sz w:val="20"/>
-          <w:szCs w:val="20"/>
-        </w:rPr>
-        <w:t xml:space="preserve">the dataset and narrow down the business objective of the MIT805 group project. </w:t>
-      </w:r>
-      <w:r>
-        <w:rPr>
-          <w:rFonts w:ascii="Times New Roman" w:hAnsi="Times New Roman" w:cs="Times New Roman"/>
-          <w:sz w:val="20"/>
-          <w:szCs w:val="20"/>
-        </w:rPr>
-        <w:t xml:space="preserve">The EDA was done in line with exploring the feasibility of the business objective. </w:t>
-      </w:r>
-    </w:p>
-    <w:p>
-      <w:pPr>
-        <w:jc w:val="both"/>
-        <w:rPr>
-          <w:rFonts w:ascii="Times New Roman" w:hAnsi="Times New Roman" w:cs="Times New Roman"/>
-          <w:sz w:val="20"/>
-          <w:szCs w:val="20"/>
-        </w:rPr>
-      </w:pPr>
-      <w:r>
-        <w:rPr>
-          <w:rFonts w:ascii="Times New Roman" w:hAnsi="Times New Roman" w:cs="Times New Roman"/>
-          <w:sz w:val="20"/>
-          <w:szCs w:val="20"/>
-        </w:rPr>
-        <w:t>The correlation matrix for the variables is indicated in</w:t>
-      </w:r>
-      <w:r>
-        <w:rPr>
-          <w:rFonts w:ascii="Times New Roman" w:hAnsi="Times New Roman" w:cs="Times New Roman"/>
-          <w:sz w:val="20"/>
-          <w:szCs w:val="20"/>
-        </w:rPr>
-        <w:t xml:space="preserve"> </w:t>
-      </w:r>
-      <w:r>
-        <w:rPr>
-          <w:rFonts w:ascii="Times New Roman" w:hAnsi="Times New Roman" w:cs="Times New Roman"/>
-          <w:sz w:val="20"/>
-          <w:szCs w:val="20"/>
-          <w:highlight w:val="yellow"/>
-        </w:rPr>
-        <w:t>xxx</w:t>
-      </w:r>
-      <w:r>
-        <w:rPr>
-          <w:rFonts w:ascii="Times New Roman" w:hAnsi="Times New Roman" w:cs="Times New Roman"/>
-          <w:sz w:val="20"/>
-          <w:szCs w:val="20"/>
-        </w:rPr>
-        <w:t xml:space="preserve"> </w:t>
-      </w:r>
-      <w:r>
-        <w:rPr>
-          <w:rFonts w:ascii="Times New Roman" w:hAnsi="Times New Roman" w:cs="Times New Roman"/>
-          <w:sz w:val="20"/>
-          <w:szCs w:val="20"/>
-        </w:rPr>
-        <w:t xml:space="preserve">in Appendix B. </w:t>
-      </w:r>
-      <w:r>
-        <w:rPr>
-          <w:rFonts w:ascii="Times New Roman" w:hAnsi="Times New Roman" w:cs="Times New Roman"/>
-          <w:sz w:val="20"/>
-          <w:szCs w:val="20"/>
-        </w:rPr>
-        <w:t xml:space="preserve"> Variables such as </w:t>
-      </w:r>
-      <w:r>
-        <w:rPr>
-          <w:rFonts w:ascii="Times New Roman" w:hAnsi="Times New Roman" w:cs="Times New Roman"/>
-          <w:sz w:val="20"/>
-          <w:szCs w:val="20"/>
-          <w:highlight w:val="yellow"/>
-        </w:rPr>
-        <w:t>xxxx</w:t>
-      </w:r>
-      <w:r>
-        <w:rPr>
-          <w:rFonts w:ascii="Times New Roman" w:hAnsi="Times New Roman" w:cs="Times New Roman"/>
-          <w:sz w:val="20"/>
-          <w:szCs w:val="20"/>
-        </w:rPr>
-        <w:t xml:space="preserve"> had notably high correlation with one another. </w:t>
-      </w:r>
-    </w:p>
-    <w:p>
-      <w:pPr>
-        <w:jc w:val="both"/>
-        <w:rPr>
-          <w:rFonts w:ascii="Times New Roman" w:hAnsi="Times New Roman" w:cs="Times New Roman"/>
-          <w:sz w:val="20"/>
-          <w:szCs w:val="20"/>
-        </w:rPr>
-      </w:pPr>
-      <w:r>
-        <w:rPr>
-          <w:rFonts w:ascii="Times New Roman" w:hAnsi="Times New Roman" w:cs="Times New Roman"/>
-          <w:sz w:val="20"/>
-          <w:szCs w:val="20"/>
-        </w:rPr>
-        <w:t xml:space="preserve">Some statistical characteristics of the </w:t>
-      </w:r>
-      <w:r>
-        <w:rPr>
-          <w:rFonts w:ascii="Times New Roman" w:hAnsi="Times New Roman" w:cs="Times New Roman"/>
-          <w:sz w:val="20"/>
-          <w:szCs w:val="20"/>
-        </w:rPr>
-        <w:t xml:space="preserve">numerical </w:t>
-      </w:r>
-      <w:r>
-        <w:rPr>
-          <w:rFonts w:ascii="Times New Roman" w:hAnsi="Times New Roman" w:cs="Times New Roman"/>
-          <w:sz w:val="20"/>
-          <w:szCs w:val="20"/>
-        </w:rPr>
-        <w:t>variables</w:t>
-      </w:r>
-      <w:r>
-        <w:rPr>
-          <w:rFonts w:ascii="Times New Roman" w:hAnsi="Times New Roman" w:cs="Times New Roman"/>
-          <w:sz w:val="20"/>
-          <w:szCs w:val="20"/>
-        </w:rPr>
-        <w:t>, such as the range and average over the dataset,</w:t>
-      </w:r>
-      <w:r>
-        <w:rPr>
-          <w:rFonts w:ascii="Times New Roman" w:hAnsi="Times New Roman" w:cs="Times New Roman"/>
-          <w:sz w:val="20"/>
-          <w:szCs w:val="20"/>
-        </w:rPr>
-        <w:t xml:space="preserve"> considered necessary are described </w:t>
-      </w:r>
-      <w:r>
-        <w:rPr>
-          <w:rFonts w:ascii="Times New Roman" w:hAnsi="Times New Roman" w:cs="Times New Roman"/>
-          <w:sz w:val="20"/>
-          <w:szCs w:val="20"/>
-        </w:rPr>
-        <w:t xml:space="preserve">in </w:t>
-      </w:r>
-      <w:r>
-        <w:rPr>
-          <w:rFonts w:ascii="Times New Roman" w:hAnsi="Times New Roman" w:cs="Times New Roman"/>
-          <w:sz w:val="20"/>
-          <w:szCs w:val="20"/>
-        </w:rPr>
         <w:fldChar w:fldCharType="begin"/>
       </w:r>
       <w:r>
@@ -1380,260 +1939,14 @@
           <w:sz w:val="20"/>
           <w:szCs w:val="20"/>
         </w:rPr>
-        <w:instrText xml:space="preserve"> REF _Ref238916291 \h </w:instrText>
-      </w:r>
-      <w:r>
-        <w:rPr>
-          <w:rFonts w:ascii="Times New Roman" w:hAnsi="Times New Roman" w:cs="Times New Roman"/>
-          <w:sz w:val="20"/>
-          <w:szCs w:val="20"/>
-        </w:rPr>
-      </w:r>
-      <w:r>
-        <w:rPr>
-          <w:rFonts w:ascii="Times New Roman" w:hAnsi="Times New Roman" w:cs="Times New Roman"/>
-          <w:sz w:val="20"/>
-          <w:szCs w:val="20"/>
-        </w:rPr>
-        <w:instrText xml:space="preserve"> \* MERGEFORMAT </w:instrText>
-      </w:r>
-      <w:r>
-        <w:rPr>
-          <w:rFonts w:ascii="Times New Roman" w:hAnsi="Times New Roman" w:cs="Times New Roman"/>
-          <w:sz w:val="20"/>
-          <w:szCs w:val="20"/>
-        </w:rPr>
-        <w:fldChar w:fldCharType="separate"/>
-      </w:r>
-      <w:r>
-        <w:rPr>
-          <w:rFonts w:ascii="Times New Roman" w:hAnsi="Times New Roman" w:cs="Times New Roman"/>
-          <w:sz w:val="20"/>
-          <w:szCs w:val="20"/>
-        </w:rPr>
-        <w:t xml:space="preserve">Table </w:t>
-      </w:r>
-      <w:r>
-        <w:rPr>
-          <w:rFonts w:ascii="Times New Roman" w:hAnsi="Times New Roman" w:cs="Times New Roman"/>
-          <w:sz w:val="20"/>
-          <w:szCs w:val="20"/>
-        </w:rPr>
-        <w:t>3</w:t>
-      </w:r>
-      <w:r>
-        <w:rPr>
-          <w:rFonts w:ascii="Times New Roman" w:hAnsi="Times New Roman" w:cs="Times New Roman"/>
-          <w:sz w:val="20"/>
-          <w:szCs w:val="20"/>
-        </w:rPr>
-        <w:fldChar w:fldCharType="end"/>
-      </w:r>
-      <w:r>
-        <w:rPr>
-          <w:rFonts w:ascii="Times New Roman" w:hAnsi="Times New Roman" w:cs="Times New Roman"/>
-          <w:sz w:val="20"/>
-          <w:szCs w:val="20"/>
-        </w:rPr>
-        <w:t xml:space="preserve"> and </w:t>
-      </w:r>
-      <w:r>
-        <w:rPr>
-          <w:rFonts w:ascii="Times New Roman" w:hAnsi="Times New Roman" w:cs="Times New Roman"/>
-          <w:sz w:val="20"/>
-          <w:szCs w:val="20"/>
-        </w:rPr>
-        <w:fldChar w:fldCharType="begin"/>
-      </w:r>
-      <w:r>
-        <w:rPr>
-          <w:rFonts w:ascii="Times New Roman" w:hAnsi="Times New Roman" w:cs="Times New Roman"/>
-          <w:sz w:val="20"/>
-          <w:szCs w:val="20"/>
-        </w:rPr>
-        <w:instrText xml:space="preserve"> REF _Ref238916300 \h </w:instrText>
-      </w:r>
-      <w:r>
-        <w:rPr>
-          <w:rFonts w:ascii="Times New Roman" w:hAnsi="Times New Roman" w:cs="Times New Roman"/>
-          <w:sz w:val="20"/>
-          <w:szCs w:val="20"/>
-        </w:rPr>
-      </w:r>
-      <w:r>
-        <w:rPr>
-          <w:rFonts w:ascii="Times New Roman" w:hAnsi="Times New Roman" w:cs="Times New Roman"/>
-          <w:sz w:val="20"/>
-          <w:szCs w:val="20"/>
-        </w:rPr>
-        <w:instrText xml:space="preserve"> \* MERGEFORMAT </w:instrText>
-      </w:r>
-      <w:r>
-        <w:rPr>
-          <w:rFonts w:ascii="Times New Roman" w:hAnsi="Times New Roman" w:cs="Times New Roman"/>
-          <w:sz w:val="20"/>
-          <w:szCs w:val="20"/>
-        </w:rPr>
-        <w:fldChar w:fldCharType="separate"/>
-      </w:r>
-      <w:r>
-        <w:rPr>
-          <w:rFonts w:ascii="Times New Roman" w:hAnsi="Times New Roman" w:cs="Times New Roman"/>
-          <w:sz w:val="20"/>
-          <w:szCs w:val="20"/>
-        </w:rPr>
-        <w:t xml:space="preserve">Table </w:t>
-      </w:r>
-      <w:r>
-        <w:rPr>
-          <w:rFonts w:ascii="Times New Roman" w:hAnsi="Times New Roman" w:cs="Times New Roman"/>
-          <w:sz w:val="20"/>
-          <w:szCs w:val="20"/>
-        </w:rPr>
-        <w:t>4</w:t>
-      </w:r>
-      <w:r>
-        <w:rPr>
-          <w:rFonts w:ascii="Times New Roman" w:hAnsi="Times New Roman" w:cs="Times New Roman"/>
-          <w:sz w:val="20"/>
-          <w:szCs w:val="20"/>
-        </w:rPr>
-        <w:fldChar w:fldCharType="end"/>
-      </w:r>
-      <w:r>
-        <w:rPr>
-          <w:rFonts w:ascii="Times New Roman" w:hAnsi="Times New Roman" w:cs="Times New Roman"/>
-          <w:sz w:val="20"/>
-          <w:szCs w:val="20"/>
-        </w:rPr>
-        <w:t xml:space="preserve"> </w:t>
-      </w:r>
-      <w:r>
-        <w:rPr>
-          <w:rFonts w:ascii="Times New Roman" w:hAnsi="Times New Roman" w:cs="Times New Roman"/>
-          <w:sz w:val="20"/>
-          <w:szCs w:val="20"/>
-        </w:rPr>
-        <w:t>in</w:t>
-      </w:r>
-      <w:r>
-        <w:rPr>
-          <w:rFonts w:ascii="Times New Roman" w:hAnsi="Times New Roman" w:cs="Times New Roman"/>
-          <w:sz w:val="20"/>
-          <w:szCs w:val="20"/>
-        </w:rPr>
-        <w:t xml:space="preserve"> Appendix B</w:t>
-      </w:r>
-      <w:r>
-        <w:rPr>
-          <w:rFonts w:ascii="Times New Roman" w:hAnsi="Times New Roman" w:cs="Times New Roman"/>
-          <w:sz w:val="20"/>
-          <w:szCs w:val="20"/>
-        </w:rPr>
-        <w:t xml:space="preserve">. </w:t>
-      </w:r>
-    </w:p>
-    <w:p>
-      <w:pPr>
-        <w:jc w:val="both"/>
-        <w:rPr>
-          <w:rFonts w:ascii="Times New Roman" w:hAnsi="Times New Roman" w:cs="Times New Roman"/>
-          <w:sz w:val="20"/>
-          <w:szCs w:val="20"/>
-        </w:rPr>
-      </w:pPr>
-      <w:r>
-        <w:rPr>
-          <w:rFonts w:ascii="Times New Roman" w:hAnsi="Times New Roman" w:cs="Times New Roman"/>
-          <w:sz w:val="20"/>
-          <w:szCs w:val="20"/>
-        </w:rPr>
-        <w:t xml:space="preserve">Another topic explored during EDA was </w:t>
-      </w:r>
-      <w:r>
-        <w:rPr>
-          <w:rFonts w:ascii="Times New Roman" w:hAnsi="Times New Roman" w:cs="Times New Roman"/>
-          <w:sz w:val="20"/>
-          <w:szCs w:val="20"/>
-          <w:highlight w:val="yellow"/>
-        </w:rPr>
-        <w:t>xxxxx</w:t>
-      </w:r>
-      <w:r>
-        <w:rPr>
-          <w:rFonts w:ascii="Times New Roman" w:hAnsi="Times New Roman" w:cs="Times New Roman"/>
-          <w:sz w:val="20"/>
-          <w:szCs w:val="20"/>
-        </w:rPr>
-        <w:t xml:space="preserve"> </w:t>
-      </w:r>
-    </w:p>
-    <w:p>
-      <w:pPr>
-        <w:pStyle w:val="ListParagraph"/>
-        <w:numPr>
-          <w:ilvl w:val="0"/>
-          <w:numId w:val="3"/>
-        </w:numPr>
-        <w:jc w:val="both"/>
-        <w:rPr>
-          <w:rFonts w:ascii="Times New Roman" w:hAnsi="Times New Roman" w:cs="Times New Roman"/>
-          <w:b/>
-          <w:bCs/>
-          <w:sz w:val="20"/>
-          <w:szCs w:val="20"/>
-        </w:rPr>
-      </w:pPr>
-      <w:r>
-        <w:rPr>
-          <w:rFonts w:ascii="Times New Roman" w:hAnsi="Times New Roman" w:cs="Times New Roman"/>
-          <w:b/>
-          <w:bCs/>
-          <w:sz w:val="20"/>
-          <w:szCs w:val="20"/>
-        </w:rPr>
-        <w:t>The dataset in the context of the 7 Vs of big data</w:t>
-      </w:r>
-    </w:p>
-    <w:p>
-      <w:pPr>
-        <w:jc w:val="both"/>
-        <w:rPr>
-          <w:rFonts w:ascii="Times New Roman" w:hAnsi="Times New Roman" w:cs="Times New Roman"/>
-          <w:sz w:val="20"/>
-          <w:szCs w:val="20"/>
-        </w:rPr>
-      </w:pPr>
-      <w:r>
-        <w:rPr>
-          <w:rFonts w:ascii="Times New Roman" w:hAnsi="Times New Roman" w:cs="Times New Roman"/>
-          <w:sz w:val="20"/>
-          <w:szCs w:val="20"/>
-        </w:rPr>
-        <w:fldChar w:fldCharType="begin"/>
-      </w:r>
-      <w:r>
-        <w:rPr>
-          <w:rFonts w:ascii="Times New Roman" w:hAnsi="Times New Roman" w:cs="Times New Roman"/>
-          <w:sz w:val="20"/>
-          <w:szCs w:val="20"/>
-        </w:rPr>
-        <w:instrText xml:space="preserve"> REF _Ref238915678 \h </w:instrText>
-      </w:r>
-      <w:r>
-        <w:rPr>
-          <w:rFonts w:ascii="Times New Roman" w:hAnsi="Times New Roman" w:cs="Times New Roman"/>
-          <w:sz w:val="20"/>
-          <w:szCs w:val="20"/>
-        </w:rPr>
-      </w:r>
-      <w:r>
-        <w:rPr>
-          <w:rFonts w:ascii="Times New Roman" w:hAnsi="Times New Roman" w:cs="Times New Roman"/>
-          <w:sz w:val="20"/>
-          <w:szCs w:val="20"/>
-        </w:rPr>
-        <w:instrText xml:space="preserve"> \* MERGEFORMAT </w:instrText>
+        <w:instrText xml:space="preserve"> REF _Ref238915678 \h  \* MERGEFORMAT </w:instrText>
+      </w:r>
+      <w:r>
+        <w:rPr>
+          <w:rFonts w:ascii="Times New Roman" w:hAnsi="Times New Roman" w:cs="Times New Roman"/>
+          <w:sz w:val="20"/>
+          <w:szCs w:val="20"/>
+        </w:rPr>
       </w:r>
       <w:r>
         <w:rPr>
@@ -1874,6 +2187,15 @@
               </w:rPr>
               <w:t xml:space="preserve">The total dataset size, trying to analyse it using pandas for example was xxx. </w:t>
             </w:r>
+            <w:r>
+              <w:rPr>
+                <w:rFonts w:ascii="Times New Roman" w:hAnsi="Times New Roman" w:cs="Times New Roman"/>
+                <w:color w:val="EE0000"/>
+                <w:sz w:val="20"/>
+                <w:szCs w:val="20"/>
+              </w:rPr>
+              <w:t>Savannah</w:t>
+            </w:r>
           </w:p>
         </w:tc>
       </w:tr>
@@ -1944,6 +2266,17 @@
               </w:rPr>
               <w:t xml:space="preserve"> </w:t>
             </w:r>
+            <w:proofErr w:type="spellStart"/>
+            <w:r>
+              <w:rPr>
+                <w:rFonts w:ascii="Times New Roman" w:hAnsi="Times New Roman" w:cs="Times New Roman"/>
+                <w:color w:val="EE0000"/>
+                <w:sz w:val="20"/>
+                <w:szCs w:val="20"/>
+              </w:rPr>
+              <w:t>Mekayle</w:t>
+            </w:r>
+            <w:proofErr w:type="spellEnd"/>
           </w:p>
         </w:tc>
       </w:tr>
@@ -1984,10 +2317,20 @@
               <w:jc w:val="both"/>
               <w:rPr>
                 <w:rFonts w:ascii="Times New Roman" w:hAnsi="Times New Roman" w:cs="Times New Roman"/>
+                <w:color w:val="EE0000"/>
                 <w:sz w:val="20"/>
                 <w:szCs w:val="20"/>
               </w:rPr>
             </w:pPr>
+            <w:r>
+              <w:rPr>
+                <w:rFonts w:ascii="Times New Roman" w:hAnsi="Times New Roman" w:cs="Times New Roman"/>
+                <w:color w:val="EE0000"/>
+                <w:sz w:val="20"/>
+                <w:szCs w:val="20"/>
+              </w:rPr>
+              <w:t>Savannah</w:t>
+            </w:r>
           </w:p>
         </w:tc>
       </w:tr>
@@ -2032,6 +2375,17 @@
                 <w:szCs w:val="20"/>
               </w:rPr>
             </w:pPr>
+            <w:proofErr w:type="spellStart"/>
+            <w:r>
+              <w:rPr>
+                <w:rFonts w:ascii="Times New Roman" w:hAnsi="Times New Roman" w:cs="Times New Roman"/>
+                <w:color w:val="EE0000"/>
+                <w:sz w:val="20"/>
+                <w:szCs w:val="20"/>
+              </w:rPr>
+              <w:t>Mekayle</w:t>
+            </w:r>
+            <w:proofErr w:type="spellEnd"/>
           </w:p>
         </w:tc>
       </w:tr>
@@ -2076,6 +2430,15 @@
                 <w:szCs w:val="20"/>
               </w:rPr>
             </w:pPr>
+            <w:r>
+              <w:rPr>
+                <w:rFonts w:ascii="Times New Roman" w:hAnsi="Times New Roman" w:cs="Times New Roman"/>
+                <w:color w:val="EE0000"/>
+                <w:sz w:val="20"/>
+                <w:szCs w:val="20"/>
+              </w:rPr>
+              <w:t>Savannah</w:t>
+            </w:r>
           </w:p>
         </w:tc>
       </w:tr>
@@ -2120,6 +2483,17 @@
                 <w:szCs w:val="20"/>
               </w:rPr>
             </w:pPr>
+            <w:proofErr w:type="spellStart"/>
+            <w:r>
+              <w:rPr>
+                <w:rFonts w:ascii="Times New Roman" w:hAnsi="Times New Roman" w:cs="Times New Roman"/>
+                <w:color w:val="EE0000"/>
+                <w:sz w:val="20"/>
+                <w:szCs w:val="20"/>
+              </w:rPr>
+              <w:t>Mekayle</w:t>
+            </w:r>
+            <w:proofErr w:type="spellEnd"/>
           </w:p>
         </w:tc>
       </w:tr>
@@ -2164,6 +2538,15 @@
                 <w:szCs w:val="20"/>
               </w:rPr>
             </w:pPr>
+            <w:r>
+              <w:rPr>
+                <w:rFonts w:ascii="Times New Roman" w:hAnsi="Times New Roman" w:cs="Times New Roman"/>
+                <w:color w:val="EE0000"/>
+                <w:sz w:val="20"/>
+                <w:szCs w:val="20"/>
+              </w:rPr>
+              <w:t>Savannah</w:t>
+            </w:r>
           </w:p>
         </w:tc>
       </w:tr>
@@ -2440,9 +2823,510 @@
           <w:szCs w:val="40"/>
         </w:rPr>
         <w:lastRenderedPageBreak/>
-        <w:t xml:space="preserve">Appendix </w:t>
-      </w:r>
-      <w:r>
+        <w:t>Appendix B – Data cleaning summaries</w:t>
+      </w:r>
+    </w:p>
+    <w:p>
+      <w:pPr>
+        <w:pStyle w:val="Caption"/>
+        <w:keepNext/>
+        <w:rPr>
+          <w:i w:val="0"/>
+          <w:iCs w:val="0"/>
+          <w:color w:val="EE0000"/>
+        </w:rPr>
+      </w:pPr>
+      <w:r>
+        <w:rPr>
+          <w:i w:val="0"/>
+          <w:iCs w:val="0"/>
+          <w:color w:val="EE0000"/>
+          <w:highlight w:val="yellow"/>
+        </w:rPr>
+        <w:t xml:space="preserve"># </w:t>
+      </w:r>
+      <w:r>
+        <w:rPr>
+          <w:i w:val="0"/>
+          <w:iCs w:val="0"/>
+          <w:color w:val="EE0000"/>
+          <w:highlight w:val="yellow"/>
+        </w:rPr>
+        <w:t>Add s</w:t>
+      </w:r>
+      <w:r>
+        <w:rPr>
+          <w:i w:val="0"/>
+          <w:iCs w:val="0"/>
+          <w:color w:val="EE0000"/>
+          <w:highlight w:val="yellow"/>
+        </w:rPr>
+        <w:t>ummary of pre-cleaning ranges</w:t>
+      </w:r>
+    </w:p>
+    <w:p>
+      <w:pPr>
+        <w:pStyle w:val="Caption"/>
+        <w:keepNext/>
+      </w:pPr>
+      <w:r>
+        <w:t xml:space="preserve">Table </w:t>
+      </w:r>
+      <w:fldSimple w:instr=" SEQ Table \* ARABIC ">
+        <w:r>
+          <w:rPr>
+            <w:noProof/>
+          </w:rPr>
+          <w:t>3</w:t>
+        </w:r>
+      </w:fldSimple>
+      <w:r>
+        <w:t xml:space="preserve">: </w:t>
+      </w:r>
+      <w:r>
+        <w:t>Data cleaning summary</w:t>
+      </w:r>
+      <w:r>
+        <w:t>.</w:t>
+      </w:r>
+    </w:p>
+    <w:tbl>
+      <w:tblPr>
+        <w:tblStyle w:val="TableGrid"/>
+        <w:tblW w:w="0" w:type="auto"/>
+        <w:tblLook w:val="04A0" w:firstRow="1" w:lastRow="0" w:firstColumn="1" w:lastColumn="0" w:noHBand="0" w:noVBand="1"/>
+      </w:tblPr>
+      <w:tblGrid>
+        <w:gridCol w:w="2425"/>
+        <w:gridCol w:w="2340"/>
+        <w:gridCol w:w="2430"/>
+        <w:gridCol w:w="1821"/>
+      </w:tblGrid>
+      <w:tr>
+        <w:trPr>
+          <w:trHeight w:val="269"/>
+          <w:tblHeader/>
+        </w:trPr>
+        <w:tc>
+          <w:tcPr>
+            <w:tcW w:w="2425" w:type="dxa"/>
+            <w:tcBorders>
+              <w:right w:val="single" w:sz="4" w:space="0" w:color="FFFFFF" w:themeColor="background1"/>
+            </w:tcBorders>
+            <w:shd w:val="clear" w:color="auto" w:fill="262626" w:themeFill="text1" w:themeFillTint="D9"/>
+            <w:vAlign w:val="center"/>
+          </w:tcPr>
+          <w:p>
+            <w:pPr>
+              <w:jc w:val="center"/>
+              <w:rPr>
+                <w:rFonts w:ascii="Times New Roman" w:hAnsi="Times New Roman" w:cs="Times New Roman"/>
+                <w:b/>
+                <w:bCs/>
+                <w:sz w:val="22"/>
+                <w:szCs w:val="22"/>
+              </w:rPr>
+            </w:pPr>
+            <w:r>
+              <w:rPr>
+                <w:rFonts w:ascii="Times New Roman" w:hAnsi="Times New Roman" w:cs="Times New Roman"/>
+                <w:b/>
+                <w:bCs/>
+                <w:sz w:val="22"/>
+                <w:szCs w:val="22"/>
+              </w:rPr>
+              <w:t>Variable</w:t>
+            </w:r>
+          </w:p>
+        </w:tc>
+        <w:tc>
+          <w:tcPr>
+            <w:tcW w:w="2340" w:type="dxa"/>
+            <w:tcBorders>
+              <w:left w:val="single" w:sz="4" w:space="0" w:color="FFFFFF" w:themeColor="background1"/>
+              <w:right w:val="single" w:sz="4" w:space="0" w:color="FFFFFF" w:themeColor="background1"/>
+            </w:tcBorders>
+            <w:shd w:val="clear" w:color="auto" w:fill="262626" w:themeFill="text1" w:themeFillTint="D9"/>
+          </w:tcPr>
+          <w:p>
+            <w:pPr>
+              <w:jc w:val="center"/>
+              <w:rPr>
+                <w:rFonts w:ascii="Times New Roman" w:hAnsi="Times New Roman" w:cs="Times New Roman"/>
+                <w:b/>
+                <w:bCs/>
+                <w:sz w:val="22"/>
+                <w:szCs w:val="22"/>
+              </w:rPr>
+            </w:pPr>
+            <w:r>
+              <w:rPr>
+                <w:rFonts w:ascii="Times New Roman" w:hAnsi="Times New Roman" w:cs="Times New Roman"/>
+                <w:b/>
+                <w:bCs/>
+                <w:sz w:val="22"/>
+                <w:szCs w:val="22"/>
+              </w:rPr>
+              <w:t>2014 - 2017</w:t>
+            </w:r>
+          </w:p>
+        </w:tc>
+        <w:tc>
+          <w:tcPr>
+            <w:tcW w:w="2430" w:type="dxa"/>
+            <w:tcBorders>
+              <w:left w:val="single" w:sz="4" w:space="0" w:color="FFFFFF" w:themeColor="background1"/>
+              <w:right w:val="single" w:sz="4" w:space="0" w:color="FFFFFF" w:themeColor="background1"/>
+            </w:tcBorders>
+            <w:shd w:val="clear" w:color="auto" w:fill="262626" w:themeFill="text1" w:themeFillTint="D9"/>
+          </w:tcPr>
+          <w:p>
+            <w:pPr>
+              <w:jc w:val="center"/>
+              <w:rPr>
+                <w:rFonts w:ascii="Times New Roman" w:hAnsi="Times New Roman" w:cs="Times New Roman"/>
+                <w:b/>
+                <w:bCs/>
+                <w:sz w:val="22"/>
+                <w:szCs w:val="22"/>
+              </w:rPr>
+            </w:pPr>
+            <w:r>
+              <w:rPr>
+                <w:rFonts w:ascii="Times New Roman" w:hAnsi="Times New Roman" w:cs="Times New Roman"/>
+                <w:b/>
+                <w:bCs/>
+                <w:sz w:val="22"/>
+                <w:szCs w:val="22"/>
+              </w:rPr>
+              <w:t>2017 - present</w:t>
+            </w:r>
+          </w:p>
+        </w:tc>
+        <w:tc>
+          <w:tcPr>
+            <w:tcW w:w="1821" w:type="dxa"/>
+            <w:tcBorders>
+              <w:left w:val="single" w:sz="4" w:space="0" w:color="FFFFFF" w:themeColor="background1"/>
+            </w:tcBorders>
+            <w:shd w:val="clear" w:color="auto" w:fill="262626" w:themeFill="text1" w:themeFillTint="D9"/>
+            <w:vAlign w:val="center"/>
+          </w:tcPr>
+          <w:p>
+            <w:pPr>
+              <w:jc w:val="center"/>
+              <w:rPr>
+                <w:rFonts w:ascii="Times New Roman" w:hAnsi="Times New Roman" w:cs="Times New Roman"/>
+                <w:b/>
+                <w:bCs/>
+                <w:sz w:val="22"/>
+                <w:szCs w:val="22"/>
+              </w:rPr>
+            </w:pPr>
+            <w:r>
+              <w:rPr>
+                <w:rFonts w:ascii="Times New Roman" w:hAnsi="Times New Roman" w:cs="Times New Roman"/>
+                <w:b/>
+                <w:bCs/>
+                <w:sz w:val="22"/>
+                <w:szCs w:val="22"/>
+              </w:rPr>
+              <w:t>Total</w:t>
+            </w:r>
+          </w:p>
+        </w:tc>
+      </w:tr>
+      <w:tr>
+        <w:tc>
+          <w:tcPr>
+            <w:tcW w:w="2425" w:type="dxa"/>
+          </w:tcPr>
+          <w:p>
+            <w:pPr>
+              <w:jc w:val="both"/>
+              <w:rPr>
+                <w:rFonts w:ascii="Times New Roman" w:hAnsi="Times New Roman" w:cs="Times New Roman"/>
+                <w:sz w:val="22"/>
+                <w:szCs w:val="22"/>
+              </w:rPr>
+            </w:pPr>
+            <w:r>
+              <w:rPr>
+                <w:rFonts w:ascii="Times New Roman" w:hAnsi="Times New Roman" w:cs="Times New Roman"/>
+                <w:sz w:val="22"/>
+                <w:szCs w:val="22"/>
+              </w:rPr>
+              <w:t>Total original entries</w:t>
+            </w:r>
+          </w:p>
+        </w:tc>
+        <w:tc>
+          <w:tcPr>
+            <w:tcW w:w="2340" w:type="dxa"/>
+          </w:tcPr>
+          <w:p>
+            <w:pPr>
+              <w:jc w:val="center"/>
+              <w:rPr>
+                <w:rFonts w:ascii="Times New Roman" w:hAnsi="Times New Roman" w:cs="Times New Roman"/>
+                <w:sz w:val="22"/>
+                <w:szCs w:val="22"/>
+              </w:rPr>
+            </w:pPr>
+          </w:p>
+        </w:tc>
+        <w:tc>
+          <w:tcPr>
+            <w:tcW w:w="2430" w:type="dxa"/>
+          </w:tcPr>
+          <w:p>
+            <w:pPr>
+              <w:jc w:val="center"/>
+              <w:rPr>
+                <w:rFonts w:ascii="Times New Roman" w:hAnsi="Times New Roman" w:cs="Times New Roman"/>
+                <w:sz w:val="22"/>
+                <w:szCs w:val="22"/>
+              </w:rPr>
+            </w:pPr>
+          </w:p>
+        </w:tc>
+        <w:tc>
+          <w:tcPr>
+            <w:tcW w:w="1821" w:type="dxa"/>
+          </w:tcPr>
+          <w:p>
+            <w:pPr>
+              <w:jc w:val="center"/>
+              <w:rPr>
+                <w:rFonts w:ascii="Times New Roman" w:hAnsi="Times New Roman" w:cs="Times New Roman"/>
+                <w:sz w:val="22"/>
+                <w:szCs w:val="22"/>
+              </w:rPr>
+            </w:pPr>
+          </w:p>
+        </w:tc>
+      </w:tr>
+      <w:tr>
+        <w:tc>
+          <w:tcPr>
+            <w:tcW w:w="2425" w:type="dxa"/>
+          </w:tcPr>
+          <w:p>
+            <w:pPr>
+              <w:jc w:val="both"/>
+              <w:rPr>
+                <w:rFonts w:ascii="Times New Roman" w:hAnsi="Times New Roman" w:cs="Times New Roman"/>
+                <w:sz w:val="22"/>
+                <w:szCs w:val="22"/>
+              </w:rPr>
+            </w:pPr>
+            <w:r>
+              <w:rPr>
+                <w:rFonts w:ascii="Times New Roman" w:hAnsi="Times New Roman" w:cs="Times New Roman"/>
+                <w:sz w:val="22"/>
+                <w:szCs w:val="22"/>
+              </w:rPr>
+              <w:t>Total entries after removal of duplicates</w:t>
+            </w:r>
+          </w:p>
+        </w:tc>
+        <w:tc>
+          <w:tcPr>
+            <w:tcW w:w="2340" w:type="dxa"/>
+          </w:tcPr>
+          <w:p>
+            <w:pPr>
+              <w:jc w:val="center"/>
+              <w:rPr>
+                <w:rFonts w:ascii="Times New Roman" w:hAnsi="Times New Roman" w:cs="Times New Roman"/>
+                <w:sz w:val="22"/>
+                <w:szCs w:val="22"/>
+              </w:rPr>
+            </w:pPr>
+          </w:p>
+        </w:tc>
+        <w:tc>
+          <w:tcPr>
+            <w:tcW w:w="2430" w:type="dxa"/>
+          </w:tcPr>
+          <w:p>
+            <w:pPr>
+              <w:jc w:val="center"/>
+              <w:rPr>
+                <w:rFonts w:ascii="Times New Roman" w:hAnsi="Times New Roman" w:cs="Times New Roman"/>
+                <w:sz w:val="22"/>
+                <w:szCs w:val="22"/>
+              </w:rPr>
+            </w:pPr>
+          </w:p>
+        </w:tc>
+        <w:tc>
+          <w:tcPr>
+            <w:tcW w:w="1821" w:type="dxa"/>
+          </w:tcPr>
+          <w:p>
+            <w:pPr>
+              <w:jc w:val="center"/>
+              <w:rPr>
+                <w:rFonts w:ascii="Times New Roman" w:hAnsi="Times New Roman" w:cs="Times New Roman"/>
+                <w:sz w:val="22"/>
+                <w:szCs w:val="22"/>
+              </w:rPr>
+            </w:pPr>
+          </w:p>
+        </w:tc>
+      </w:tr>
+      <w:tr>
+        <w:tc>
+          <w:tcPr>
+            <w:tcW w:w="2425" w:type="dxa"/>
+          </w:tcPr>
+          <w:p>
+            <w:pPr>
+              <w:jc w:val="both"/>
+              <w:rPr>
+                <w:rFonts w:ascii="Times New Roman" w:hAnsi="Times New Roman" w:cs="Times New Roman"/>
+                <w:sz w:val="22"/>
+                <w:szCs w:val="22"/>
+              </w:rPr>
+            </w:pPr>
+            <w:r>
+              <w:rPr>
+                <w:rFonts w:ascii="Times New Roman" w:hAnsi="Times New Roman" w:cs="Times New Roman"/>
+                <w:sz w:val="22"/>
+                <w:szCs w:val="22"/>
+              </w:rPr>
+              <w:t>Total entries after removal of invalid trips</w:t>
+            </w:r>
+          </w:p>
+        </w:tc>
+        <w:tc>
+          <w:tcPr>
+            <w:tcW w:w="2340" w:type="dxa"/>
+          </w:tcPr>
+          <w:p>
+            <w:pPr>
+              <w:jc w:val="center"/>
+              <w:rPr>
+                <w:rFonts w:ascii="Times New Roman" w:hAnsi="Times New Roman" w:cs="Times New Roman"/>
+                <w:sz w:val="22"/>
+                <w:szCs w:val="22"/>
+              </w:rPr>
+            </w:pPr>
+          </w:p>
+        </w:tc>
+        <w:tc>
+          <w:tcPr>
+            <w:tcW w:w="2430" w:type="dxa"/>
+          </w:tcPr>
+          <w:p>
+            <w:pPr>
+              <w:jc w:val="center"/>
+              <w:rPr>
+                <w:rFonts w:ascii="Times New Roman" w:hAnsi="Times New Roman" w:cs="Times New Roman"/>
+                <w:sz w:val="22"/>
+                <w:szCs w:val="22"/>
+              </w:rPr>
+            </w:pPr>
+          </w:p>
+        </w:tc>
+        <w:tc>
+          <w:tcPr>
+            <w:tcW w:w="1821" w:type="dxa"/>
+          </w:tcPr>
+          <w:p>
+            <w:pPr>
+              <w:jc w:val="center"/>
+              <w:rPr>
+                <w:rFonts w:ascii="Times New Roman" w:hAnsi="Times New Roman" w:cs="Times New Roman"/>
+                <w:sz w:val="22"/>
+                <w:szCs w:val="22"/>
+              </w:rPr>
+            </w:pPr>
+          </w:p>
+        </w:tc>
+      </w:tr>
+      <w:tr>
+        <w:tc>
+          <w:tcPr>
+            <w:tcW w:w="2425" w:type="dxa"/>
+          </w:tcPr>
+          <w:p>
+            <w:pPr>
+              <w:jc w:val="both"/>
+              <w:rPr>
+                <w:rFonts w:ascii="Times New Roman" w:hAnsi="Times New Roman" w:cs="Times New Roman"/>
+                <w:sz w:val="22"/>
+                <w:szCs w:val="22"/>
+              </w:rPr>
+            </w:pPr>
+            <w:r>
+              <w:rPr>
+                <w:rFonts w:ascii="Times New Roman" w:hAnsi="Times New Roman" w:cs="Times New Roman"/>
+                <w:sz w:val="22"/>
+                <w:szCs w:val="22"/>
+              </w:rPr>
+              <w:t>Final no. entries to be used in processing dataset</w:t>
+            </w:r>
+          </w:p>
+        </w:tc>
+        <w:tc>
+          <w:tcPr>
+            <w:tcW w:w="2340" w:type="dxa"/>
+          </w:tcPr>
+          <w:p>
+            <w:pPr>
+              <w:jc w:val="center"/>
+              <w:rPr>
+                <w:rFonts w:ascii="Times New Roman" w:hAnsi="Times New Roman" w:cs="Times New Roman"/>
+                <w:b/>
+                <w:bCs/>
+                <w:sz w:val="22"/>
+                <w:szCs w:val="22"/>
+              </w:rPr>
+            </w:pPr>
+          </w:p>
+        </w:tc>
+        <w:tc>
+          <w:tcPr>
+            <w:tcW w:w="2430" w:type="dxa"/>
+          </w:tcPr>
+          <w:p>
+            <w:pPr>
+              <w:jc w:val="center"/>
+              <w:rPr>
+                <w:rFonts w:ascii="Times New Roman" w:hAnsi="Times New Roman" w:cs="Times New Roman"/>
+                <w:b/>
+                <w:bCs/>
+                <w:sz w:val="22"/>
+                <w:szCs w:val="22"/>
+              </w:rPr>
+            </w:pPr>
+          </w:p>
+        </w:tc>
+        <w:tc>
+          <w:tcPr>
+            <w:tcW w:w="1821" w:type="dxa"/>
+          </w:tcPr>
+          <w:p>
+            <w:pPr>
+              <w:jc w:val="center"/>
+              <w:rPr>
+                <w:rFonts w:ascii="Times New Roman" w:hAnsi="Times New Roman" w:cs="Times New Roman"/>
+                <w:b/>
+                <w:bCs/>
+                <w:sz w:val="22"/>
+                <w:szCs w:val="22"/>
+              </w:rPr>
+            </w:pPr>
+          </w:p>
+        </w:tc>
+      </w:tr>
+    </w:tbl>
+    <w:p>
+      <w:pPr>
+        <w:ind w:left="360"/>
+        <w:jc w:val="both"/>
         <w:rPr>
           <w:rFonts w:ascii="Times New Roman" w:hAnsi="Times New Roman" w:cs="Times New Roman"/>
           <w:b/>
@@ -2450,7 +3334,46 @@
           <w:sz w:val="40"/>
           <w:szCs w:val="40"/>
         </w:rPr>
-        <w:t>B</w:t>
+        <w:sectPr>
+          <w:pgSz w:w="11906" w:h="16838"/>
+          <w:pgMar w:top="1440" w:right="1440" w:bottom="1440" w:left="1440" w:header="720" w:footer="720" w:gutter="0"/>
+          <w:cols w:space="720"/>
+          <w:docGrid w:linePitch="360"/>
+        </w:sectPr>
+      </w:pPr>
+    </w:p>
+    <w:p>
+      <w:pPr>
+        <w:ind w:left="360"/>
+        <w:jc w:val="both"/>
+        <w:rPr>
+          <w:rFonts w:ascii="Times New Roman" w:hAnsi="Times New Roman" w:cs="Times New Roman"/>
+          <w:b/>
+          <w:bCs/>
+          <w:sz w:val="40"/>
+          <w:szCs w:val="40"/>
+        </w:rPr>
+      </w:pPr>
+      <w:r>
+        <w:rPr>
+          <w:rFonts w:ascii="Times New Roman" w:hAnsi="Times New Roman" w:cs="Times New Roman"/>
+          <w:b/>
+          <w:bCs/>
+          <w:sz w:val="40"/>
+          <w:szCs w:val="40"/>
+        </w:rPr>
+        <w:lastRenderedPageBreak/>
+        <w:t xml:space="preserve">Appendix </w:t>
+      </w:r>
+      <w:r>
+        <w:rPr>
+          <w:rFonts w:ascii="Times New Roman" w:hAnsi="Times New Roman" w:cs="Times New Roman"/>
+          <w:b/>
+          <w:bCs/>
+          <w:sz w:val="40"/>
+          <w:szCs w:val="40"/>
+        </w:rPr>
+        <w:t>C</w:t>
       </w:r>
       <w:r>
         <w:rPr>
@@ -2648,24 +3571,14 @@
       <w:r>
         <w:t xml:space="preserve">Table </w:t>
       </w:r>
-      <w:r>
-        <w:fldChar w:fldCharType="begin"/>
-      </w:r>
-      <w:r>
-        <w:instrText xml:space="preserve"> SEQ Table \* ARABIC </w:instrText>
-      </w:r>
-      <w:r>
-        <w:fldChar w:fldCharType="separate"/>
-      </w:r>
-      <w:r>
-        <w:rPr>
-          <w:noProof/>
-        </w:rPr>
-        <w:t>4</w:t>
-      </w:r>
-      <w:r>
-        <w:fldChar w:fldCharType="end"/>
-      </w:r>
+      <w:fldSimple w:instr=" SEQ Table \* ARABIC ">
+        <w:r>
+          <w:rPr>
+            <w:noProof/>
+          </w:rPr>
+          <w:t>4</w:t>
+        </w:r>
+      </w:fldSimple>
       <w:bookmarkEnd w:id="2"/>
       <w:r>
         <w:t>: Numerical variables statistical summary.</w:t>
@@ -3360,24 +4273,14 @@
       <w:r>
         <w:t xml:space="preserve">Table </w:t>
       </w:r>
-      <w:r>
-        <w:fldChar w:fldCharType="begin"/>
-      </w:r>
-      <w:r>
-        <w:instrText xml:space="preserve"> SEQ Table \* ARABIC </w:instrText>
-      </w:r>
-      <w:r>
-        <w:fldChar w:fldCharType="separate"/>
-      </w:r>
-      <w:r>
-        <w:rPr>
-          <w:noProof/>
-        </w:rPr>
-        <w:t>5</w:t>
-      </w:r>
-      <w:r>
-        <w:fldChar w:fldCharType="end"/>
-      </w:r>
+      <w:fldSimple w:instr=" SEQ Table \* ARABIC ">
+        <w:r>
+          <w:rPr>
+            <w:noProof/>
+          </w:rPr>
+          <w:t>5</w:t>
+        </w:r>
+      </w:fldSimple>
       <w:bookmarkEnd w:id="3"/>
       <w:r>
         <w:t>: Categorical variables summary.</w:t>
@@ -3735,7 +4638,27 @@
           <w:szCs w:val="40"/>
         </w:rPr>
         <w:lastRenderedPageBreak/>
-        <w:t xml:space="preserve">Appendix C – Code used for the EDA </w:t>
+        <w:t xml:space="preserve">Appendix </w:t>
+      </w:r>
+      <w:r>
+        <w:rPr>
+          <w:rFonts w:ascii="Times New Roman" w:hAnsi="Times New Roman" w:cs="Times New Roman"/>
+          <w:b/>
+          <w:bCs/>
+          <w:sz w:val="40"/>
+          <w:szCs w:val="40"/>
+        </w:rPr>
+        <w:t>D</w:t>
+      </w:r>
+      <w:r>
+        <w:rPr>
+          <w:rFonts w:ascii="Times New Roman" w:hAnsi="Times New Roman" w:cs="Times New Roman"/>
+          <w:b/>
+          <w:bCs/>
+          <w:sz w:val="40"/>
+          <w:szCs w:val="40"/>
+        </w:rPr>
+        <w:t xml:space="preserve"> – Code used for the EDA </w:t>
       </w:r>
     </w:p>
     <w:p>
@@ -4096,18 +5019,18 @@
           <w:szCs w:val="22"/>
         </w:rPr>
         <w:tab/>
-        <w:t>Location_ID versus the trip times by vendor</w:t>
-      </w:r>
-    </w:p>
-    <w:p>
-      <w:pPr>
+      </w:r>
+      <w:proofErr w:type="spellStart"/>
+      <w:r>
         <w:rPr>
           <w:rFonts w:ascii="Times New Roman" w:hAnsi="Times New Roman" w:cs="Times New Roman"/>
           <w:color w:val="EE0000"/>
           <w:sz w:val="22"/>
           <w:szCs w:val="22"/>
         </w:rPr>
-      </w:pPr>
+        <w:t>Location_ID</w:t>
+      </w:r>
+      <w:proofErr w:type="spellEnd"/>
       <w:r>
         <w:rPr>
           <w:rFonts w:ascii="Times New Roman" w:hAnsi="Times New Roman" w:cs="Times New Roman"/>
@@ -4115,13 +5038,11 @@
           <w:sz w:val="22"/>
           <w:szCs w:val="22"/>
         </w:rPr>
-        <w:tab/>
-        <w:t>Location_IDs – are the start and end ones the same</w:t>
-      </w:r>
-    </w:p>
-    <w:p>
-      <w:pPr>
-        <w:pStyle w:val="ListParagraph"/>
+        <w:t xml:space="preserve"> versus the trip times by vendor</w:t>
+      </w:r>
+    </w:p>
+    <w:p>
+      <w:pPr>
         <w:rPr>
           <w:rFonts w:ascii="Times New Roman" w:hAnsi="Times New Roman" w:cs="Times New Roman"/>
           <w:color w:val="EE0000"/>
@@ -4136,8 +5057,9 @@
           <w:sz w:val="22"/>
           <w:szCs w:val="22"/>
         </w:rPr>
-        <w:t>Visualisation</w:t>
-      </w:r>
+        <w:tab/>
+      </w:r>
+      <w:proofErr w:type="spellStart"/>
       <w:r>
         <w:rPr>
           <w:rFonts w:ascii="Times New Roman" w:hAnsi="Times New Roman" w:cs="Times New Roman"/>
@@ -4145,8 +5067,9 @@
           <w:sz w:val="22"/>
           <w:szCs w:val="22"/>
         </w:rPr>
-        <w:t xml:space="preserve"> </w:t>
-      </w:r>
+        <w:t>Location_IDs</w:t>
+      </w:r>
+      <w:proofErr w:type="spellEnd"/>
       <w:r>
         <w:rPr>
           <w:rFonts w:ascii="Times New Roman" w:hAnsi="Times New Roman" w:cs="Times New Roman"/>
@@ -4154,7 +5077,7 @@
           <w:sz w:val="22"/>
           <w:szCs w:val="22"/>
         </w:rPr>
-        <w:t>Variety</w:t>
+        <w:t xml:space="preserve"> – are the start and end ones the same</w:t>
       </w:r>
     </w:p>
     <w:sectPr>
@@ -4170,6 +5093,118 @@
 <file path=word/numbering.xml><?xml version="1.0" encoding="utf-8"?>
 <w:numbering xmlns:wpc="http://schemas.microsoft.com/office/word/2010/wordprocessingCanvas" xmlns:cx="http://schemas.microsoft.com/office/drawing/2014/chartex" xmlns:cx1="http://schemas.microsoft.com/office/drawing/2015/9/8/chartex" xmlns:cx2="http://schemas.microsoft.com/office/drawing/2015/10/21/chartex" xmlns:cx3="http://schemas.microsoft.com/office/drawing/2016/5/9/chartex" xmlns:cx4="http://schemas.microsoft.com/office/drawing/2016/5/10/chartex" xmlns:cx5="http://schemas.microsoft.com/office/drawing/2016/5/11/chartex" xmlns:cx6="http://schemas.microsoft.com/office/drawing/2016/5/12/chartex" xmlns:cx7="http://schemas.microsoft.com/office/drawing/2016/5/13/chartex" xmlns:cx8="http://schemas.microsoft.com/office/drawing/2016/5/14/chartex" xmlns:mc="http://schemas.openxmlformats.org/markup-compatibility/2006" xmlns:aink="http://schemas.microsoft.com/office/drawing/2016/ink" xmlns:am3d="http://schemas.microsoft.com/office/drawing/2017/model3d" xmlns:o="urn:schemas-microsoft-com:office:office" xmlns:oel="http://schemas.microsoft.com/office/2019/extlst" xmlns:r="http://schemas.openxmlformats.org/officeDocument/2006/relationships" xmlns:m="http://schemas.openxmlformats.org/officeDocument/2006/math" xmlns:v="urn:schemas-microsoft-com:vml" xmlns:wp14="http://schemas.microsoft.com/office/word/2010/wordprocessingDrawing" xmlns:wp="http://schemas.openxmlformats.org/drawingml/2006/wordprocessingDrawing" xmlns:w10="urn:schemas-microsoft-com:office:word" xmlns:w="http://schemas.openxmlformats.org/wordprocessingml/2006/main" xmlns:w14="http://schemas.microsoft.com/office/word/2010/wordml" xmlns:w15="http://schemas.microsoft.com/office/word/2012/wordml" xmlns:w16cex="http://schemas.microsoft.com/office/word/2018/wordml/cex" xmlns:w16cid="http://schemas.microsoft.com/office/word/2016/wordml/cid" xmlns:w16="http://schemas.microsoft.com/office/word/2018/wordml" xmlns:w16du="http://schemas.microsoft.com/office/word/2023/wordml/word16du" xmlns:w16sdtdh="http://schemas.microsoft.com/office/word/2020/wordml/sdtdatahash" xmlns:w16sdtfl="http://schemas.microsoft.com/office/word/2024/wordml/sdtformatlock" xmlns:w16se="http://schemas.microsoft.com/office/word/2015/wordml/symex" xmlns:wpg="http://schemas.microsoft.com/office/word/2010/wordprocessingGroup" xmlns:wpi="http://schemas.microsoft.com/office/word/2010/wordprocessingInk" xmlns:wne="http://schemas.microsoft.com/office/word/2006/wordml" xmlns:wps="http://schemas.microsoft.com/office/word/2010/wordprocessingShape" mc:Ignorable="w14 w15 w16se w16cid w16 w16cex w16sdtdh w16sdtfl w16du wp14">
   <w:abstractNum w:abstractNumId="0" w15:restartNumberingAfterBreak="0">
+    <w:nsid w:val="082D693F"/>
+    <w:multiLevelType w:val="hybridMultilevel"/>
+    <w:tmpl w:val="A336DB0E"/>
+    <w:lvl w:ilvl="0" w:tplc="705008E6">
+      <w:numFmt w:val="bullet"/>
+      <w:lvlText w:val="-"/>
+      <w:lvlJc w:val="left"/>
+      <w:pPr>
+        <w:ind w:left="720" w:hanging="360"/>
+      </w:pPr>
+      <w:rPr>
+        <w:rFonts w:ascii="Times New Roman" w:eastAsiaTheme="minorHAnsi" w:hAnsi="Times New Roman" w:cs="Times New Roman" w:hint="default"/>
+      </w:rPr>
+    </w:lvl>
+    <w:lvl w:ilvl="1" w:tplc="1C090003" w:tentative="1">
+      <w:start w:val="1"/>
+      <w:numFmt w:val="bullet"/>
+      <w:lvlText w:val="o"/>
+      <w:lvlJc w:val="left"/>
+      <w:pPr>
+        <w:ind w:left="1440" w:hanging="360"/>
+      </w:pPr>
+      <w:rPr>
+        <w:rFonts w:ascii="Courier New" w:hAnsi="Courier New" w:cs="Courier New" w:hint="default"/>
+      </w:rPr>
+    </w:lvl>
+    <w:lvl w:ilvl="2" w:tplc="1C090005" w:tentative="1">
+      <w:start w:val="1"/>
+      <w:numFmt w:val="bullet"/>
+      <w:lvlText w:val=""/>
+      <w:lvlJc w:val="left"/>
+      <w:pPr>
+        <w:ind w:left="2160" w:hanging="360"/>
+      </w:pPr>
+      <w:rPr>
+        <w:rFonts w:ascii="Wingdings" w:hAnsi="Wingdings" w:hint="default"/>
+      </w:rPr>
+    </w:lvl>
+    <w:lvl w:ilvl="3" w:tplc="1C090001" w:tentative="1">
+      <w:start w:val="1"/>
+      <w:numFmt w:val="bullet"/>
+      <w:lvlText w:val=""/>
+      <w:lvlJc w:val="left"/>
+      <w:pPr>
+        <w:ind w:left="2880" w:hanging="360"/>
+      </w:pPr>
+      <w:rPr>
+        <w:rFonts w:ascii="Symbol" w:hAnsi="Symbol" w:hint="default"/>
+      </w:rPr>
+    </w:lvl>
+    <w:lvl w:ilvl="4" w:tplc="1C090003" w:tentative="1">
+      <w:start w:val="1"/>
+      <w:numFmt w:val="bullet"/>
+      <w:lvlText w:val="o"/>
+      <w:lvlJc w:val="left"/>
+      <w:pPr>
+        <w:ind w:left="3600" w:hanging="360"/>
+      </w:pPr>
+      <w:rPr>
+        <w:rFonts w:ascii="Courier New" w:hAnsi="Courier New" w:cs="Courier New" w:hint="default"/>
+      </w:rPr>
+    </w:lvl>
+    <w:lvl w:ilvl="5" w:tplc="1C090005" w:tentative="1">
+      <w:start w:val="1"/>
+      <w:numFmt w:val="bullet"/>
+      <w:lvlText w:val=""/>
+      <w:lvlJc w:val="left"/>
+      <w:pPr>
+        <w:ind w:left="4320" w:hanging="360"/>
+      </w:pPr>
+      <w:rPr>
+        <w:rFonts w:ascii="Wingdings" w:hAnsi="Wingdings" w:hint="default"/>
+      </w:rPr>
+    </w:lvl>
+    <w:lvl w:ilvl="6" w:tplc="1C090001" w:tentative="1">
+      <w:start w:val="1"/>
+      <w:numFmt w:val="bullet"/>
+      <w:lvlText w:val=""/>
+      <w:lvlJc w:val="left"/>
+      <w:pPr>
+        <w:ind w:left="5040" w:hanging="360"/>
+      </w:pPr>
+      <w:rPr>
+        <w:rFonts w:ascii="Symbol" w:hAnsi="Symbol" w:hint="default"/>
+      </w:rPr>
+    </w:lvl>
+    <w:lvl w:ilvl="7" w:tplc="1C090003" w:tentative="1">
+      <w:start w:val="1"/>
+      <w:numFmt w:val="bullet"/>
+      <w:lvlText w:val="o"/>
+      <w:lvlJc w:val="left"/>
+      <w:pPr>
+        <w:ind w:left="5760" w:hanging="360"/>
+      </w:pPr>
+      <w:rPr>
+        <w:rFonts w:ascii="Courier New" w:hAnsi="Courier New" w:cs="Courier New" w:hint="default"/>
+      </w:rPr>
+    </w:lvl>
+    <w:lvl w:ilvl="8" w:tplc="1C090005" w:tentative="1">
+      <w:start w:val="1"/>
+      <w:numFmt w:val="bullet"/>
+      <w:lvlText w:val=""/>
+      <w:lvlJc w:val="left"/>
+      <w:pPr>
+        <w:ind w:left="6480" w:hanging="360"/>
+      </w:pPr>
+      <w:rPr>
+        <w:rFonts w:ascii="Wingdings" w:hAnsi="Wingdings" w:hint="default"/>
+      </w:rPr>
+    </w:lvl>
+  </w:abstractNum>
+  <w:abstractNum w:abstractNumId="1" w15:restartNumberingAfterBreak="0">
     <w:nsid w:val="13BA7354"/>
     <w:multiLevelType w:val="hybridMultilevel"/>
     <w:tmpl w:val="49F81904"/>
@@ -4258,7 +5293,7 @@
       </w:pPr>
     </w:lvl>
   </w:abstractNum>
-  <w:abstractNum w:abstractNumId="1" w15:restartNumberingAfterBreak="0">
+  <w:abstractNum w:abstractNumId="2" w15:restartNumberingAfterBreak="0">
     <w:nsid w:val="3F611D7C"/>
     <w:multiLevelType w:val="hybridMultilevel"/>
     <w:tmpl w:val="C85E3314"/>
@@ -4371,7 +5406,7 @@
       </w:rPr>
     </w:lvl>
   </w:abstractNum>
-  <w:abstractNum w:abstractNumId="2" w15:restartNumberingAfterBreak="0">
+  <w:abstractNum w:abstractNumId="3" w15:restartNumberingAfterBreak="0">
     <w:nsid w:val="51F912E1"/>
     <w:multiLevelType w:val="hybridMultilevel"/>
     <w:tmpl w:val="CC383E44"/>
@@ -4484,7 +5519,7 @@
       </w:rPr>
     </w:lvl>
   </w:abstractNum>
-  <w:abstractNum w:abstractNumId="3" w15:restartNumberingAfterBreak="0">
+  <w:abstractNum w:abstractNumId="4" w15:restartNumberingAfterBreak="0">
     <w:nsid w:val="7DB73372"/>
     <w:multiLevelType w:val="hybridMultilevel"/>
     <w:tmpl w:val="356CC6A0"/>
@@ -4574,16 +5609,19 @@
     </w:lvl>
   </w:abstractNum>
   <w:num w:numId="1" w16cid:durableId="72746291">
-    <w:abstractNumId w:val="0"/>
+    <w:abstractNumId w:val="1"/>
   </w:num>
   <w:num w:numId="2" w16cid:durableId="1820880094">
-    <w:abstractNumId w:val="1"/>
+    <w:abstractNumId w:val="2"/>
   </w:num>
   <w:num w:numId="3" w16cid:durableId="885605262">
+    <w:abstractNumId w:val="4"/>
+  </w:num>
+  <w:num w:numId="4" w16cid:durableId="2089157516">
     <w:abstractNumId w:val="3"/>
   </w:num>
-  <w:num w:numId="4" w16cid:durableId="2089157516">
-    <w:abstractNumId w:val="2"/>
+  <w:num w:numId="5" w16cid:durableId="1357271366">
+    <w:abstractNumId w:val="0"/>
   </w:num>
 </w:numbering>
 </file>

</xml_diff>

<commit_message>
Added data description and data cleaning sections, pearson correlation matrix
</commit_message>
<xml_diff>
--- a/report/Report_framework.docx
+++ b/report/Report_framework.docx
@@ -87,35 +87,7 @@
             <w:rStyle w:val="Hyperlink"/>
             <w:rFonts w:ascii="Times New Roman" w:hAnsi="Times New Roman" w:cs="Times New Roman"/>
           </w:rPr>
-          <w:t>G</w:t>
-        </w:r>
-        <w:r>
-          <w:rPr>
-            <w:rStyle w:val="Hyperlink"/>
-            <w:rFonts w:ascii="Times New Roman" w:hAnsi="Times New Roman" w:cs="Times New Roman"/>
-          </w:rPr>
-          <w:t>i</w:t>
-        </w:r>
-        <w:r>
-          <w:rPr>
-            <w:rStyle w:val="Hyperlink"/>
-            <w:rFonts w:ascii="Times New Roman" w:hAnsi="Times New Roman" w:cs="Times New Roman"/>
-          </w:rPr>
-          <w:t>thub re</w:t>
-        </w:r>
-        <w:r>
-          <w:rPr>
-            <w:rStyle w:val="Hyperlink"/>
-            <w:rFonts w:ascii="Times New Roman" w:hAnsi="Times New Roman" w:cs="Times New Roman"/>
-          </w:rPr>
-          <w:t>p</w:t>
-        </w:r>
-        <w:r>
-          <w:rPr>
-            <w:rStyle w:val="Hyperlink"/>
-            <w:rFonts w:ascii="Times New Roman" w:hAnsi="Times New Roman" w:cs="Times New Roman"/>
-          </w:rPr>
-          <w:t>ository link</w:t>
+          <w:t>Github repository link</w:t>
         </w:r>
       </w:hyperlink>
     </w:p>
@@ -154,7 +126,7 @@
           <w:sz w:val="20"/>
           <w:szCs w:val="20"/>
         </w:rPr>
-        <w:t xml:space="preserve"> - -Savannah </w:t>
+        <w:t xml:space="preserve"> </w:t>
       </w:r>
     </w:p>
     <w:p>
@@ -172,39 +144,7 @@
           <w:sz w:val="20"/>
           <w:szCs w:val="20"/>
         </w:rPr>
-        <w:t xml:space="preserve">The dataset selected for analysis was the NYC </w:t>
-      </w:r>
-      <w:r>
-        <w:rPr>
-          <w:rFonts w:ascii="Times New Roman" w:hAnsi="Times New Roman" w:cs="Times New Roman"/>
-          <w:sz w:val="20"/>
-          <w:szCs w:val="20"/>
-        </w:rPr>
-        <w:t xml:space="preserve">TLC </w:t>
-      </w:r>
-      <w:r>
-        <w:rPr>
-          <w:rFonts w:ascii="Times New Roman" w:hAnsi="Times New Roman" w:cs="Times New Roman"/>
-          <w:sz w:val="20"/>
-          <w:szCs w:val="20"/>
-        </w:rPr>
-        <w:t xml:space="preserve">Yellow Taxi </w:t>
-      </w:r>
-      <w:r>
-        <w:rPr>
-          <w:rFonts w:ascii="Times New Roman" w:hAnsi="Times New Roman" w:cs="Times New Roman"/>
-          <w:sz w:val="20"/>
-          <w:szCs w:val="20"/>
-        </w:rPr>
-        <w:t xml:space="preserve">Trip Record </w:t>
-      </w:r>
-      <w:r>
-        <w:rPr>
-          <w:rFonts w:ascii="Times New Roman" w:hAnsi="Times New Roman" w:cs="Times New Roman"/>
-          <w:sz w:val="20"/>
-          <w:szCs w:val="20"/>
-        </w:rPr>
-        <w:t xml:space="preserve">dataset, available at </w:t>
+        <w:t xml:space="preserve">The dataset selected for analysis was the NYC TLC Yellow Taxi Trip Record dataset, available at </w:t>
       </w:r>
       <w:hyperlink r:id="rId6" w:history="1">
         <w:r>
@@ -223,76 +163,7 @@
           <w:sz w:val="20"/>
           <w:szCs w:val="20"/>
         </w:rPr>
-        <w:t>. The data was collected by the NYC Taxi and Limousine Commission.</w:t>
-      </w:r>
-      <w:r>
-        <w:rPr>
-          <w:rFonts w:ascii="Times New Roman" w:hAnsi="Times New Roman" w:cs="Times New Roman"/>
-          <w:sz w:val="20"/>
-          <w:szCs w:val="20"/>
-        </w:rPr>
-        <w:t xml:space="preserve"> This dataset </w:t>
-      </w:r>
-      <w:r>
-        <w:rPr>
-          <w:rFonts w:ascii="Times New Roman" w:hAnsi="Times New Roman" w:cs="Times New Roman"/>
-          <w:sz w:val="20"/>
-          <w:szCs w:val="20"/>
-        </w:rPr>
-        <w:t xml:space="preserve">contains </w:t>
-      </w:r>
-      <w:proofErr w:type="gramStart"/>
-      <w:r>
-        <w:rPr>
-          <w:rFonts w:ascii="Times New Roman" w:hAnsi="Times New Roman" w:cs="Times New Roman"/>
-          <w:sz w:val="20"/>
-          <w:szCs w:val="20"/>
-        </w:rPr>
-        <w:t xml:space="preserve">XXXX </w:t>
-      </w:r>
-      <w:r>
-        <w:rPr>
-          <w:rFonts w:ascii="Times New Roman" w:hAnsi="Times New Roman" w:cs="Times New Roman"/>
-          <w:sz w:val="20"/>
-          <w:szCs w:val="20"/>
-        </w:rPr>
-        <w:t>.</w:t>
-      </w:r>
-      <w:proofErr w:type="gramEnd"/>
-    </w:p>
-    <w:p>
-      <w:pPr>
-        <w:jc w:val="both"/>
-        <w:rPr>
-          <w:rFonts w:ascii="Times New Roman" w:hAnsi="Times New Roman" w:cs="Times New Roman"/>
-          <w:sz w:val="20"/>
-          <w:szCs w:val="20"/>
-        </w:rPr>
-      </w:pPr>
-      <w:r>
-        <w:rPr>
-          <w:rFonts w:ascii="Times New Roman" w:hAnsi="Times New Roman" w:cs="Times New Roman"/>
-          <w:sz w:val="20"/>
-          <w:szCs w:val="20"/>
-        </w:rPr>
-        <w:t>The data set is available for public use</w:t>
-      </w:r>
-      <w:r>
-        <w:rPr>
-          <w:rFonts w:ascii="Times New Roman" w:hAnsi="Times New Roman" w:cs="Times New Roman"/>
-          <w:sz w:val="20"/>
-          <w:szCs w:val="20"/>
-          <w:highlight w:val="yellow"/>
-        </w:rPr>
-        <w:t>… licensing etc….</w:t>
-      </w:r>
-      <w:r>
-        <w:rPr>
-          <w:rFonts w:ascii="Times New Roman" w:hAnsi="Times New Roman" w:cs="Times New Roman"/>
-          <w:sz w:val="20"/>
-          <w:szCs w:val="20"/>
-        </w:rPr>
-        <w:t xml:space="preserve">  </w:t>
+        <w:t>. The data was collected by the NYC Taxi and Limousine Commission and is made publicly available every month by the City of New York. This dataset contains information on trips completed by Yellow Taxis in the New York Boroughs and information such as the trip distances, pick-up and drop-off areas, payment information and fees collected are provided.</w:t>
       </w:r>
     </w:p>
     <w:p>
@@ -320,27 +191,6 @@
           <w:szCs w:val="20"/>
         </w:rPr>
         <w:t>Dataset size and characteristics</w:t>
-      </w:r>
-      <w:r>
-        <w:rPr>
-          <w:rFonts w:ascii="Times New Roman" w:hAnsi="Times New Roman" w:cs="Times New Roman"/>
-          <w:b/>
-          <w:bCs/>
-          <w:sz w:val="20"/>
-          <w:szCs w:val="20"/>
-        </w:rPr>
-        <w:t xml:space="preserve"> </w:t>
-      </w:r>
-      <w:r>
-        <w:rPr>
-          <w:rFonts w:ascii="Times New Roman" w:hAnsi="Times New Roman" w:cs="Times New Roman"/>
-          <w:b/>
-          <w:bCs/>
-          <w:color w:val="EE0000"/>
-          <w:sz w:val="20"/>
-          <w:szCs w:val="20"/>
-        </w:rPr>
-        <w:t>- Mekayle</w:t>
       </w:r>
     </w:p>
     <w:p>
@@ -874,25 +724,7 @@
                 <w:sz w:val="20"/>
                 <w:szCs w:val="20"/>
               </w:rPr>
-              <w:t xml:space="preserve">Data is usually uploaded monthly with a </w:t>
-            </w:r>
-            <w:proofErr w:type="gramStart"/>
-            <w:r>
-              <w:rPr>
-                <w:rFonts w:ascii="Times New Roman" w:hAnsi="Times New Roman" w:cs="Times New Roman"/>
-                <w:sz w:val="20"/>
-                <w:szCs w:val="20"/>
-              </w:rPr>
-              <w:t>2 month</w:t>
-            </w:r>
-            <w:proofErr w:type="gramEnd"/>
-            <w:r>
-              <w:rPr>
-                <w:rFonts w:ascii="Times New Roman" w:hAnsi="Times New Roman" w:cs="Times New Roman"/>
-                <w:sz w:val="20"/>
-                <w:szCs w:val="20"/>
-              </w:rPr>
-              <w:t xml:space="preserve"> delay. </w:t>
+              <w:t xml:space="preserve">Data is usually uploaded monthly with a 2 month delay. </w:t>
             </w:r>
             <w:r>
               <w:rPr>
@@ -1058,17 +890,6 @@
         </w:rPr>
         <w:t xml:space="preserve"> </w:t>
       </w:r>
-      <w:r>
-        <w:rPr>
-          <w:rFonts w:ascii="Times New Roman" w:hAnsi="Times New Roman" w:cs="Times New Roman"/>
-          <w:b/>
-          <w:bCs/>
-          <w:color w:val="EE0000"/>
-          <w:sz w:val="20"/>
-          <w:szCs w:val="20"/>
-        </w:rPr>
-        <w:t>– Savannah – mention ranges</w:t>
-      </w:r>
     </w:p>
     <w:p>
       <w:pPr>
@@ -1124,7 +945,55 @@
           <w:sz w:val="20"/>
           <w:szCs w:val="20"/>
         </w:rPr>
-        <w:t xml:space="preserve">The individual parquet files were checked for uniformity in terms of datatypes, all numerical data types were converted to doubles as it was determined that the original had a mixture of numerical data types including xx, xx and xx. </w:t>
+        <w:t xml:space="preserve">The individual parquet files were checked for uniformity in terms of datatypes, all numerical data types were converted to doubles </w:t>
+      </w:r>
+      <w:r>
+        <w:rPr>
+          <w:rFonts w:ascii="Times New Roman" w:hAnsi="Times New Roman" w:cs="Times New Roman"/>
+          <w:sz w:val="20"/>
+          <w:szCs w:val="20"/>
+        </w:rPr>
+        <w:t>since</w:t>
+      </w:r>
+      <w:r>
+        <w:rPr>
+          <w:rFonts w:ascii="Times New Roman" w:hAnsi="Times New Roman" w:cs="Times New Roman"/>
+          <w:sz w:val="20"/>
+          <w:szCs w:val="20"/>
+        </w:rPr>
+        <w:t xml:space="preserve"> the original </w:t>
+      </w:r>
+      <w:r>
+        <w:rPr>
+          <w:rFonts w:ascii="Times New Roman" w:hAnsi="Times New Roman" w:cs="Times New Roman"/>
+          <w:sz w:val="20"/>
+          <w:szCs w:val="20"/>
+        </w:rPr>
+        <w:t>dataset had</w:t>
+      </w:r>
+      <w:r>
+        <w:rPr>
+          <w:rFonts w:ascii="Times New Roman" w:hAnsi="Times New Roman" w:cs="Times New Roman"/>
+          <w:sz w:val="20"/>
+          <w:szCs w:val="20"/>
+        </w:rPr>
+        <w:t xml:space="preserve"> </w:t>
+      </w:r>
+      <w:r>
+        <w:rPr>
+          <w:rFonts w:ascii="Times New Roman" w:hAnsi="Times New Roman" w:cs="Times New Roman"/>
+          <w:sz w:val="20"/>
+          <w:szCs w:val="20"/>
+        </w:rPr>
+        <w:t>long, integer and double datatypes</w:t>
+      </w:r>
+      <w:r>
+        <w:rPr>
+          <w:rFonts w:ascii="Times New Roman" w:hAnsi="Times New Roman" w:cs="Times New Roman"/>
+          <w:sz w:val="20"/>
+          <w:szCs w:val="20"/>
+        </w:rPr>
+        <w:t xml:space="preserve">. </w:t>
       </w:r>
     </w:p>
     <w:p>
@@ -1147,67 +1016,126 @@
           <w:sz w:val="20"/>
           <w:szCs w:val="20"/>
         </w:rPr>
-        <w:t>The data</w:t>
-      </w:r>
-      <w:r>
-        <w:rPr>
-          <w:rFonts w:ascii="Times New Roman" w:hAnsi="Times New Roman" w:cs="Times New Roman"/>
-          <w:sz w:val="20"/>
-          <w:szCs w:val="20"/>
-        </w:rPr>
-        <w:t>set was filtered for what was considered to be “valid trips”, this involved removing all entries w</w:t>
-      </w:r>
-      <w:r>
-        <w:rPr>
-          <w:rFonts w:ascii="Times New Roman" w:hAnsi="Times New Roman" w:cs="Times New Roman"/>
-          <w:sz w:val="20"/>
-          <w:szCs w:val="20"/>
-        </w:rPr>
-        <w:t>h</w:t>
-      </w:r>
-      <w:r>
-        <w:rPr>
-          <w:rFonts w:ascii="Times New Roman" w:hAnsi="Times New Roman" w:cs="Times New Roman"/>
-          <w:sz w:val="20"/>
-          <w:szCs w:val="20"/>
-        </w:rPr>
-        <w:t xml:space="preserve">ere the passenger count, </w:t>
-      </w:r>
-      <w:proofErr w:type="spellStart"/>
-      <w:r>
-        <w:rPr>
-          <w:rFonts w:ascii="Times New Roman" w:hAnsi="Times New Roman" w:cs="Times New Roman"/>
-          <w:sz w:val="20"/>
-          <w:szCs w:val="20"/>
-        </w:rPr>
-        <w:t>trip_distance</w:t>
-      </w:r>
-      <w:proofErr w:type="spellEnd"/>
-      <w:r>
-        <w:rPr>
-          <w:rFonts w:ascii="Times New Roman" w:hAnsi="Times New Roman" w:cs="Times New Roman"/>
-          <w:sz w:val="20"/>
-          <w:szCs w:val="20"/>
-        </w:rPr>
-        <w:t xml:space="preserve"> or </w:t>
-      </w:r>
-      <w:proofErr w:type="spellStart"/>
-      <w:r>
-        <w:rPr>
-          <w:rFonts w:ascii="Times New Roman" w:hAnsi="Times New Roman" w:cs="Times New Roman"/>
-          <w:sz w:val="20"/>
-          <w:szCs w:val="20"/>
-        </w:rPr>
-        <w:t>fare_amount</w:t>
-      </w:r>
-      <w:proofErr w:type="spellEnd"/>
-      <w:r>
-        <w:rPr>
-          <w:rFonts w:ascii="Times New Roman" w:hAnsi="Times New Roman" w:cs="Times New Roman"/>
-          <w:sz w:val="20"/>
-          <w:szCs w:val="20"/>
-        </w:rPr>
-        <w:t xml:space="preserve"> was not greater than zero. </w:t>
+        <w:t>The</w:t>
+      </w:r>
+      <w:r>
+        <w:rPr>
+          <w:rFonts w:ascii="Times New Roman" w:hAnsi="Times New Roman" w:cs="Times New Roman"/>
+          <w:sz w:val="20"/>
+          <w:szCs w:val="20"/>
+        </w:rPr>
+        <w:t xml:space="preserve"> business objective was defined as described in Section </w:t>
+      </w:r>
+      <w:r>
+        <w:rPr>
+          <w:rFonts w:ascii="Times New Roman" w:hAnsi="Times New Roman" w:cs="Times New Roman"/>
+          <w:sz w:val="20"/>
+          <w:szCs w:val="20"/>
+        </w:rPr>
+        <w:t>6</w:t>
+      </w:r>
+      <w:r>
+        <w:rPr>
+          <w:rFonts w:ascii="Times New Roman" w:hAnsi="Times New Roman" w:cs="Times New Roman"/>
+          <w:sz w:val="20"/>
+          <w:szCs w:val="20"/>
+        </w:rPr>
+        <w:t xml:space="preserve"> and columns were seen as redundant to the business objective </w:t>
+      </w:r>
+      <w:r>
+        <w:rPr>
+          <w:rFonts w:ascii="Times New Roman" w:hAnsi="Times New Roman" w:cs="Times New Roman"/>
+          <w:sz w:val="20"/>
+          <w:szCs w:val="20"/>
+        </w:rPr>
+        <w:t>(see list i</w:t>
+      </w:r>
+      <w:r>
+        <w:rPr>
+          <w:rFonts w:ascii="Times New Roman" w:hAnsi="Times New Roman" w:cs="Times New Roman"/>
+          <w:sz w:val="20"/>
+          <w:szCs w:val="20"/>
+        </w:rPr>
+        <w:t xml:space="preserve">n </w:t>
+      </w:r>
+      <w:r>
+        <w:rPr>
+          <w:rFonts w:ascii="Times New Roman" w:hAnsi="Times New Roman" w:cs="Times New Roman"/>
+          <w:sz w:val="20"/>
+          <w:szCs w:val="20"/>
+        </w:rPr>
+        <w:fldChar w:fldCharType="begin"/>
+      </w:r>
+      <w:r>
+        <w:rPr>
+          <w:rFonts w:ascii="Times New Roman" w:hAnsi="Times New Roman" w:cs="Times New Roman"/>
+          <w:sz w:val="20"/>
+          <w:szCs w:val="20"/>
+        </w:rPr>
+        <w:instrText xml:space="preserve"> REF _Ref239269598 \h </w:instrText>
+      </w:r>
+      <w:r>
+        <w:rPr>
+          <w:rFonts w:ascii="Times New Roman" w:hAnsi="Times New Roman" w:cs="Times New Roman"/>
+          <w:sz w:val="20"/>
+          <w:szCs w:val="20"/>
+        </w:rPr>
+        <w:instrText xml:space="preserve"> \* MERGEFORMAT </w:instrText>
+      </w:r>
+      <w:r>
+        <w:rPr>
+          <w:rFonts w:ascii="Times New Roman" w:hAnsi="Times New Roman" w:cs="Times New Roman"/>
+          <w:sz w:val="20"/>
+          <w:szCs w:val="20"/>
+        </w:rPr>
+      </w:r>
+      <w:r>
+        <w:rPr>
+          <w:rFonts w:ascii="Times New Roman" w:hAnsi="Times New Roman" w:cs="Times New Roman"/>
+          <w:sz w:val="20"/>
+          <w:szCs w:val="20"/>
+        </w:rPr>
+        <w:fldChar w:fldCharType="separate"/>
+      </w:r>
+      <w:r>
+        <w:rPr>
+          <w:rFonts w:ascii="Times New Roman" w:hAnsi="Times New Roman" w:cs="Times New Roman"/>
+          <w:sz w:val="20"/>
+          <w:szCs w:val="20"/>
+        </w:rPr>
+        <w:t>Table 3</w:t>
+      </w:r>
+      <w:r>
+        <w:rPr>
+          <w:rFonts w:ascii="Times New Roman" w:hAnsi="Times New Roman" w:cs="Times New Roman"/>
+          <w:sz w:val="20"/>
+          <w:szCs w:val="20"/>
+        </w:rPr>
+        <w:fldChar w:fldCharType="end"/>
+      </w:r>
+      <w:r>
+        <w:rPr>
+          <w:rFonts w:ascii="Times New Roman" w:hAnsi="Times New Roman" w:cs="Times New Roman"/>
+          <w:sz w:val="20"/>
+          <w:szCs w:val="20"/>
+        </w:rPr>
+        <w:t xml:space="preserve"> ,</w:t>
+      </w:r>
+      <w:r>
+        <w:rPr>
+          <w:rFonts w:ascii="Times New Roman" w:hAnsi="Times New Roman" w:cs="Times New Roman"/>
+          <w:sz w:val="20"/>
+          <w:szCs w:val="20"/>
+        </w:rPr>
+        <w:t xml:space="preserve"> Appendix B) </w:t>
+      </w:r>
+      <w:r>
+        <w:rPr>
+          <w:rFonts w:ascii="Times New Roman" w:hAnsi="Times New Roman" w:cs="Times New Roman"/>
+          <w:sz w:val="20"/>
+          <w:szCs w:val="20"/>
+        </w:rPr>
+        <w:t>were removed.</w:t>
       </w:r>
     </w:p>
     <w:p>
@@ -1230,7 +1158,62 @@
           <w:sz w:val="20"/>
           <w:szCs w:val="20"/>
         </w:rPr>
-        <w:t xml:space="preserve">The dataset was filtered for duplicate trips. It was found that duplicate entries existed, therefore, all duplicate entries were removed. </w:t>
+        <w:t xml:space="preserve">The ranges of each numerical variable of the raw data were investigated and are presented in </w:t>
+      </w:r>
+      <w:r>
+        <w:rPr>
+          <w:rFonts w:ascii="Times New Roman" w:hAnsi="Times New Roman" w:cs="Times New Roman"/>
+          <w:sz w:val="20"/>
+          <w:szCs w:val="20"/>
+        </w:rPr>
+        <w:fldChar w:fldCharType="begin"/>
+      </w:r>
+      <w:r>
+        <w:rPr>
+          <w:rFonts w:ascii="Times New Roman" w:hAnsi="Times New Roman" w:cs="Times New Roman"/>
+          <w:sz w:val="20"/>
+          <w:szCs w:val="20"/>
+        </w:rPr>
+        <w:instrText xml:space="preserve"> REF _Ref239266761 \h  \* MERGEFORMAT </w:instrText>
+      </w:r>
+      <w:r>
+        <w:rPr>
+          <w:rFonts w:ascii="Times New Roman" w:hAnsi="Times New Roman" w:cs="Times New Roman"/>
+          <w:sz w:val="20"/>
+          <w:szCs w:val="20"/>
+        </w:rPr>
+      </w:r>
+      <w:r>
+        <w:rPr>
+          <w:rFonts w:ascii="Times New Roman" w:hAnsi="Times New Roman" w:cs="Times New Roman"/>
+          <w:sz w:val="20"/>
+          <w:szCs w:val="20"/>
+        </w:rPr>
+        <w:fldChar w:fldCharType="separate"/>
+      </w:r>
+      <w:r>
+        <w:rPr>
+          <w:rFonts w:ascii="Times New Roman" w:hAnsi="Times New Roman" w:cs="Times New Roman"/>
+          <w:sz w:val="20"/>
+          <w:szCs w:val="20"/>
+        </w:rPr>
+        <w:t>Table 4</w:t>
+      </w:r>
+      <w:r>
+        <w:rPr>
+          <w:rFonts w:ascii="Times New Roman" w:hAnsi="Times New Roman" w:cs="Times New Roman"/>
+          <w:sz w:val="20"/>
+          <w:szCs w:val="20"/>
+        </w:rPr>
+        <w:fldChar w:fldCharType="end"/>
+      </w:r>
+      <w:r>
+        <w:rPr>
+          <w:rFonts w:ascii="Times New Roman" w:hAnsi="Times New Roman" w:cs="Times New Roman"/>
+          <w:sz w:val="20"/>
+          <w:szCs w:val="20"/>
+        </w:rPr>
+        <w:t xml:space="preserve"> of Appendix B. These revealed some non-realistic entries and outliers, such as negative distances. This provided insight on how to filter the data for valid trips. </w:t>
       </w:r>
     </w:p>
     <w:p>
@@ -1253,42 +1236,70 @@
           <w:sz w:val="20"/>
           <w:szCs w:val="20"/>
         </w:rPr>
-        <w:t xml:space="preserve">Based on an initial assessment, the business objective was defined as described in Section xx and the following columns were seen as redundant to the business objective and were removed. </w:t>
-      </w:r>
-      <w:r>
-        <w:rPr>
-          <w:rFonts w:ascii="Times New Roman" w:hAnsi="Times New Roman" w:cs="Times New Roman"/>
-          <w:sz w:val="20"/>
-          <w:szCs w:val="20"/>
-        </w:rPr>
-        <w:t xml:space="preserve">These variables were </w:t>
-      </w:r>
-      <w:proofErr w:type="spellStart"/>
-      <w:r>
-        <w:rPr>
-          <w:rFonts w:ascii="Times New Roman" w:hAnsi="Times New Roman" w:cs="Times New Roman"/>
-          <w:sz w:val="20"/>
-          <w:szCs w:val="20"/>
-        </w:rPr>
-        <w:t>store_and_fwd_flag</w:t>
-      </w:r>
-      <w:proofErr w:type="spellEnd"/>
-      <w:r>
-        <w:rPr>
-          <w:rFonts w:ascii="Times New Roman" w:hAnsi="Times New Roman" w:cs="Times New Roman"/>
-          <w:sz w:val="20"/>
-          <w:szCs w:val="20"/>
-        </w:rPr>
-        <w:t xml:space="preserve">, </w:t>
-      </w:r>
-      <w:r>
-        <w:rPr>
-          <w:rFonts w:ascii="Times New Roman" w:hAnsi="Times New Roman" w:cs="Times New Roman"/>
-          <w:sz w:val="20"/>
-          <w:szCs w:val="20"/>
-          <w:highlight w:val="yellow"/>
-        </w:rPr>
-        <w:t>xxx, xxx.</w:t>
+        <w:t>The dataset was filtered for what was considered to be “valid trips”</w:t>
+      </w:r>
+      <w:r>
+        <w:rPr>
+          <w:rFonts w:ascii="Times New Roman" w:hAnsi="Times New Roman" w:cs="Times New Roman"/>
+          <w:sz w:val="20"/>
+          <w:szCs w:val="20"/>
+        </w:rPr>
+        <w:t xml:space="preserve">, for example only including trips with passengers or distances greater than zero. The full list of filters applied to each variable is presented in </w:t>
+      </w:r>
+      <w:r>
+        <w:rPr>
+          <w:rFonts w:ascii="Times New Roman" w:hAnsi="Times New Roman" w:cs="Times New Roman"/>
+          <w:sz w:val="20"/>
+          <w:szCs w:val="20"/>
+        </w:rPr>
+        <w:fldChar w:fldCharType="begin"/>
+      </w:r>
+      <w:r>
+        <w:rPr>
+          <w:rFonts w:ascii="Times New Roman" w:hAnsi="Times New Roman" w:cs="Times New Roman"/>
+          <w:sz w:val="20"/>
+          <w:szCs w:val="20"/>
+        </w:rPr>
+        <w:instrText xml:space="preserve"> REF _Ref239268454 \h  \* MERGEFORMAT </w:instrText>
+      </w:r>
+      <w:r>
+        <w:rPr>
+          <w:rFonts w:ascii="Times New Roman" w:hAnsi="Times New Roman" w:cs="Times New Roman"/>
+          <w:sz w:val="20"/>
+          <w:szCs w:val="20"/>
+        </w:rPr>
+      </w:r>
+      <w:r>
+        <w:rPr>
+          <w:rFonts w:ascii="Times New Roman" w:hAnsi="Times New Roman" w:cs="Times New Roman"/>
+          <w:sz w:val="20"/>
+          <w:szCs w:val="20"/>
+        </w:rPr>
+        <w:fldChar w:fldCharType="separate"/>
+      </w:r>
+      <w:r>
+        <w:rPr>
+          <w:rFonts w:ascii="Times New Roman" w:hAnsi="Times New Roman" w:cs="Times New Roman"/>
+          <w:sz w:val="20"/>
+          <w:szCs w:val="20"/>
+        </w:rPr>
+        <w:t>Table 5</w:t>
+      </w:r>
+      <w:r>
+        <w:rPr>
+          <w:rFonts w:ascii="Times New Roman" w:hAnsi="Times New Roman" w:cs="Times New Roman"/>
+          <w:sz w:val="20"/>
+          <w:szCs w:val="20"/>
+        </w:rPr>
+        <w:fldChar w:fldCharType="end"/>
+      </w:r>
+      <w:r>
+        <w:rPr>
+          <w:rFonts w:ascii="Times New Roman" w:hAnsi="Times New Roman" w:cs="Times New Roman"/>
+          <w:sz w:val="20"/>
+          <w:szCs w:val="20"/>
+        </w:rPr>
+        <w:t xml:space="preserve"> in Appendix B. </w:t>
       </w:r>
     </w:p>
     <w:p>
@@ -1311,59 +1322,7 @@
           <w:sz w:val="20"/>
           <w:szCs w:val="20"/>
         </w:rPr>
-        <w:t xml:space="preserve">One of the factors to be investigated included exploring the taxi speeds in different areas, and can be calculated from the </w:t>
-      </w:r>
-      <w:r>
-        <w:rPr>
-          <w:rFonts w:ascii="Times New Roman" w:hAnsi="Times New Roman" w:cs="Times New Roman"/>
-          <w:sz w:val="20"/>
-          <w:szCs w:val="20"/>
-        </w:rPr>
-        <w:t>pick-up</w:t>
-      </w:r>
-      <w:r>
-        <w:rPr>
-          <w:rFonts w:ascii="Times New Roman" w:hAnsi="Times New Roman" w:cs="Times New Roman"/>
-          <w:sz w:val="20"/>
-          <w:szCs w:val="20"/>
-        </w:rPr>
-        <w:t xml:space="preserve"> and drop off time and distance columns, this involved addition of columns titled </w:t>
-      </w:r>
-      <w:proofErr w:type="spellStart"/>
-      <w:r>
-        <w:rPr>
-          <w:rFonts w:ascii="Times New Roman" w:hAnsi="Times New Roman" w:cs="Times New Roman"/>
-          <w:sz w:val="20"/>
-          <w:szCs w:val="20"/>
-        </w:rPr>
-        <w:t>trip_duration</w:t>
-      </w:r>
-      <w:proofErr w:type="spellEnd"/>
-      <w:r>
-        <w:rPr>
-          <w:rFonts w:ascii="Times New Roman" w:hAnsi="Times New Roman" w:cs="Times New Roman"/>
-          <w:sz w:val="20"/>
-          <w:szCs w:val="20"/>
-        </w:rPr>
-        <w:t xml:space="preserve"> and </w:t>
-      </w:r>
-      <w:proofErr w:type="spellStart"/>
-      <w:r>
-        <w:rPr>
-          <w:rFonts w:ascii="Times New Roman" w:hAnsi="Times New Roman" w:cs="Times New Roman"/>
-          <w:sz w:val="20"/>
-          <w:szCs w:val="20"/>
-        </w:rPr>
-        <w:t>average_trip_speed</w:t>
-      </w:r>
-      <w:proofErr w:type="spellEnd"/>
-      <w:r>
-        <w:rPr>
-          <w:rFonts w:ascii="Times New Roman" w:hAnsi="Times New Roman" w:cs="Times New Roman"/>
-          <w:sz w:val="20"/>
-          <w:szCs w:val="20"/>
-        </w:rPr>
-        <w:t>.</w:t>
+        <w:t>All duplicate data entries were removed from the dataset.</w:t>
       </w:r>
     </w:p>
     <w:p>
@@ -1386,7 +1345,31 @@
           <w:sz w:val="20"/>
           <w:szCs w:val="20"/>
         </w:rPr>
-        <w:t>Outliers were investigated upon combining and outliers within xx standard deviations of the mean were removed.</w:t>
+        <w:t>Columns</w:t>
+      </w:r>
+      <w:r>
+        <w:rPr>
+          <w:rFonts w:ascii="Times New Roman" w:hAnsi="Times New Roman" w:cs="Times New Roman"/>
+          <w:sz w:val="20"/>
+          <w:szCs w:val="20"/>
+        </w:rPr>
+        <w:t xml:space="preserve"> titled trip_duration and average_trip_speed</w:t>
+      </w:r>
+      <w:r>
+        <w:rPr>
+          <w:rFonts w:ascii="Times New Roman" w:hAnsi="Times New Roman" w:cs="Times New Roman"/>
+          <w:sz w:val="20"/>
+          <w:szCs w:val="20"/>
+        </w:rPr>
+        <w:t xml:space="preserve"> were added to the dataset (calculated using the pickup and drop off times and trip distance)</w:t>
+      </w:r>
+      <w:r>
+        <w:rPr>
+          <w:rFonts w:ascii="Times New Roman" w:hAnsi="Times New Roman" w:cs="Times New Roman"/>
+          <w:sz w:val="20"/>
+          <w:szCs w:val="20"/>
+        </w:rPr>
+        <w:t>.</w:t>
       </w:r>
     </w:p>
     <w:p>
@@ -1409,8 +1392,39 @@
           <w:sz w:val="20"/>
           <w:szCs w:val="20"/>
         </w:rPr>
-        <w:lastRenderedPageBreak/>
-        <w:t xml:space="preserve">The workflow involved the cleaning of half of the data for each group member and then the extraction of cleaned parquet files to create the final dataset on which analysis is to be conducted. </w:t>
+        <w:t xml:space="preserve">The workflow involved </w:t>
+      </w:r>
+      <w:r>
+        <w:rPr>
+          <w:rFonts w:ascii="Times New Roman" w:hAnsi="Times New Roman" w:cs="Times New Roman"/>
+          <w:sz w:val="20"/>
+          <w:szCs w:val="20"/>
+        </w:rPr>
+        <w:t xml:space="preserve">each group member cleaning half of the data, followed by </w:t>
+      </w:r>
+      <w:r>
+        <w:rPr>
+          <w:rFonts w:ascii="Times New Roman" w:hAnsi="Times New Roman" w:cs="Times New Roman"/>
+          <w:sz w:val="20"/>
+          <w:szCs w:val="20"/>
+        </w:rPr>
+        <w:t xml:space="preserve">the extraction of cleaned parquet files to create the final dataset </w:t>
+      </w:r>
+      <w:r>
+        <w:rPr>
+          <w:rFonts w:ascii="Times New Roman" w:hAnsi="Times New Roman" w:cs="Times New Roman"/>
+          <w:sz w:val="20"/>
+          <w:szCs w:val="20"/>
+        </w:rPr>
+        <w:t>to be combined for analysis.</w:t>
+      </w:r>
+      <w:r>
+        <w:rPr>
+          <w:rFonts w:ascii="Times New Roman" w:hAnsi="Times New Roman" w:cs="Times New Roman"/>
+          <w:sz w:val="20"/>
+          <w:szCs w:val="20"/>
+        </w:rPr>
+        <w:t xml:space="preserve"> </w:t>
       </w:r>
     </w:p>
     <w:p>
@@ -2469,6 +2483,7 @@
           <w:sz w:val="20"/>
           <w:szCs w:val="20"/>
         </w:rPr>
+        <w:lastRenderedPageBreak/>
         <w:t>This section considers the business value and limitations of the NYC Yellow Taxi dataset, outlining the practical applications the data supports as well as the constraints that should be considered when interpreting results derived from it.</w:t>
       </w:r>
     </w:p>
@@ -2654,235 +2669,8 @@
           <w:sz w:val="20"/>
           <w:szCs w:val="20"/>
         </w:rPr>
-        <w:t xml:space="preserve">Data is released with a </w:t>
-      </w:r>
-      <w:proofErr w:type="gramStart"/>
-      <w:r>
-        <w:rPr>
-          <w:rFonts w:ascii="Times New Roman" w:hAnsi="Times New Roman" w:cs="Times New Roman"/>
-          <w:sz w:val="20"/>
-          <w:szCs w:val="20"/>
-        </w:rPr>
-        <w:t>2 month</w:t>
-      </w:r>
-      <w:proofErr w:type="gramEnd"/>
-      <w:r>
-        <w:rPr>
-          <w:rFonts w:ascii="Times New Roman" w:hAnsi="Times New Roman" w:cs="Times New Roman"/>
-          <w:sz w:val="20"/>
-          <w:szCs w:val="20"/>
-        </w:rPr>
-        <w:t xml:space="preserve"> lag making it not suitable </w:t>
-      </w:r>
-      <w:proofErr w:type="gramStart"/>
-      <w:r>
-        <w:rPr>
-          <w:rFonts w:ascii="Times New Roman" w:hAnsi="Times New Roman" w:cs="Times New Roman"/>
-          <w:sz w:val="20"/>
-          <w:szCs w:val="20"/>
-        </w:rPr>
-        <w:t>for  near</w:t>
-      </w:r>
-      <w:proofErr w:type="gramEnd"/>
-      <w:r>
-        <w:rPr>
-          <w:rFonts w:ascii="Times New Roman" w:hAnsi="Times New Roman" w:cs="Times New Roman"/>
-          <w:sz w:val="20"/>
-          <w:szCs w:val="20"/>
-        </w:rPr>
-        <w:t xml:space="preserve"> real time analysis. </w:t>
-      </w:r>
-    </w:p>
-    <w:p>
-      <w:pPr>
-        <w:jc w:val="both"/>
-        <w:rPr>
-          <w:rFonts w:ascii="Times New Roman" w:hAnsi="Times New Roman" w:cs="Times New Roman"/>
-          <w:sz w:val="20"/>
-          <w:szCs w:val="20"/>
-        </w:rPr>
-      </w:pPr>
-    </w:p>
-    <w:p>
-      <w:pPr>
-        <w:jc w:val="both"/>
-        <w:rPr>
-          <w:rFonts w:ascii="Times New Roman" w:hAnsi="Times New Roman" w:cs="Times New Roman"/>
-          <w:sz w:val="20"/>
-          <w:szCs w:val="20"/>
-        </w:rPr>
-      </w:pPr>
-    </w:p>
-    <w:p>
-      <w:pPr>
-        <w:jc w:val="both"/>
-        <w:rPr>
-          <w:rFonts w:ascii="Times New Roman" w:hAnsi="Times New Roman" w:cs="Times New Roman"/>
-          <w:sz w:val="20"/>
-          <w:szCs w:val="20"/>
-        </w:rPr>
-      </w:pPr>
-    </w:p>
-    <w:p>
-      <w:pPr>
-        <w:jc w:val="both"/>
-        <w:rPr>
-          <w:rFonts w:ascii="Times New Roman" w:hAnsi="Times New Roman" w:cs="Times New Roman"/>
-          <w:sz w:val="20"/>
-          <w:szCs w:val="20"/>
-        </w:rPr>
-      </w:pPr>
-    </w:p>
-    <w:p>
-      <w:pPr>
-        <w:jc w:val="both"/>
-        <w:rPr>
-          <w:rFonts w:ascii="Times New Roman" w:hAnsi="Times New Roman" w:cs="Times New Roman"/>
-          <w:sz w:val="20"/>
-          <w:szCs w:val="20"/>
-        </w:rPr>
-      </w:pPr>
-    </w:p>
-    <w:p>
-      <w:pPr>
-        <w:ind w:left="360"/>
-        <w:jc w:val="both"/>
-        <w:rPr>
-          <w:rFonts w:ascii="Times New Roman" w:hAnsi="Times New Roman" w:cs="Times New Roman"/>
-          <w:sz w:val="20"/>
-          <w:szCs w:val="20"/>
-        </w:rPr>
-      </w:pPr>
-    </w:p>
-    <w:p>
-      <w:pPr>
-        <w:ind w:left="360"/>
-        <w:jc w:val="both"/>
-        <w:rPr>
-          <w:rFonts w:ascii="Times New Roman" w:hAnsi="Times New Roman" w:cs="Times New Roman"/>
-          <w:sz w:val="20"/>
-          <w:szCs w:val="20"/>
-        </w:rPr>
-      </w:pPr>
-    </w:p>
-    <w:p>
-      <w:pPr>
-        <w:ind w:left="360"/>
-        <w:jc w:val="both"/>
-        <w:rPr>
-          <w:rFonts w:ascii="Times New Roman" w:hAnsi="Times New Roman" w:cs="Times New Roman"/>
-          <w:sz w:val="20"/>
-          <w:szCs w:val="20"/>
-        </w:rPr>
-      </w:pPr>
-    </w:p>
-    <w:p>
-      <w:pPr>
-        <w:ind w:left="360"/>
-        <w:jc w:val="both"/>
-        <w:rPr>
-          <w:rFonts w:ascii="Times New Roman" w:hAnsi="Times New Roman" w:cs="Times New Roman"/>
-          <w:sz w:val="20"/>
-          <w:szCs w:val="20"/>
-        </w:rPr>
-      </w:pPr>
-    </w:p>
-    <w:p>
-      <w:pPr>
-        <w:ind w:left="360"/>
-        <w:jc w:val="both"/>
-        <w:rPr>
-          <w:rFonts w:ascii="Times New Roman" w:hAnsi="Times New Roman" w:cs="Times New Roman"/>
-          <w:sz w:val="20"/>
-          <w:szCs w:val="20"/>
-        </w:rPr>
-      </w:pPr>
-    </w:p>
-    <w:p>
-      <w:pPr>
-        <w:ind w:left="360"/>
-        <w:jc w:val="both"/>
-        <w:rPr>
-          <w:rFonts w:ascii="Times New Roman" w:hAnsi="Times New Roman" w:cs="Times New Roman"/>
-          <w:sz w:val="20"/>
-          <w:szCs w:val="20"/>
-        </w:rPr>
-      </w:pPr>
-    </w:p>
-    <w:p>
-      <w:pPr>
-        <w:ind w:left="360"/>
-        <w:jc w:val="both"/>
-        <w:rPr>
-          <w:rFonts w:ascii="Times New Roman" w:hAnsi="Times New Roman" w:cs="Times New Roman"/>
-          <w:sz w:val="20"/>
-          <w:szCs w:val="20"/>
-        </w:rPr>
-      </w:pPr>
-    </w:p>
-    <w:p>
-      <w:pPr>
-        <w:ind w:left="360"/>
-        <w:jc w:val="both"/>
-        <w:rPr>
-          <w:rFonts w:ascii="Times New Roman" w:hAnsi="Times New Roman" w:cs="Times New Roman"/>
-          <w:sz w:val="20"/>
-          <w:szCs w:val="20"/>
-        </w:rPr>
-      </w:pPr>
-    </w:p>
-    <w:p>
-      <w:pPr>
-        <w:ind w:left="360"/>
-        <w:jc w:val="both"/>
-        <w:rPr>
-          <w:rFonts w:ascii="Times New Roman" w:hAnsi="Times New Roman" w:cs="Times New Roman"/>
-          <w:sz w:val="20"/>
-          <w:szCs w:val="20"/>
-        </w:rPr>
-      </w:pPr>
-    </w:p>
-    <w:p>
-      <w:pPr>
-        <w:ind w:left="360"/>
-        <w:jc w:val="both"/>
-        <w:rPr>
-          <w:rFonts w:ascii="Times New Roman" w:hAnsi="Times New Roman" w:cs="Times New Roman"/>
-          <w:sz w:val="20"/>
-          <w:szCs w:val="20"/>
-        </w:rPr>
-      </w:pPr>
-    </w:p>
-    <w:p>
-      <w:pPr>
-        <w:ind w:left="360"/>
-        <w:jc w:val="both"/>
-        <w:rPr>
-          <w:rFonts w:ascii="Times New Roman" w:hAnsi="Times New Roman" w:cs="Times New Roman"/>
-          <w:sz w:val="20"/>
-          <w:szCs w:val="20"/>
-        </w:rPr>
-      </w:pPr>
-    </w:p>
-    <w:p>
-      <w:pPr>
-        <w:jc w:val="both"/>
-        <w:rPr>
-          <w:rFonts w:ascii="Times New Roman" w:hAnsi="Times New Roman" w:cs="Times New Roman"/>
-          <w:sz w:val="20"/>
-          <w:szCs w:val="20"/>
-        </w:rPr>
-      </w:pPr>
-    </w:p>
-    <w:p>
-      <w:pPr>
-        <w:jc w:val="both"/>
-        <w:rPr>
-          <w:rFonts w:ascii="Times New Roman" w:hAnsi="Times New Roman" w:cs="Times New Roman"/>
-          <w:sz w:val="20"/>
-          <w:szCs w:val="20"/>
-        </w:rPr>
-      </w:pPr>
+        <w:t xml:space="preserve">Data is released with a 2 month lag making it not suitable for  near real time analysis. </w:t>
+      </w:r>
     </w:p>
     <w:p>
       <w:pPr>
@@ -2928,7 +2716,6 @@
           <w:sz w:val="20"/>
           <w:szCs w:val="20"/>
         </w:rPr>
-        <w:lastRenderedPageBreak/>
         <w:t>Reference List</w:t>
       </w:r>
       <w:r>
@@ -3101,27 +2888,135 @@
       <w:pPr>
         <w:pStyle w:val="Caption"/>
         <w:keepNext/>
-        <w:rPr>
+        <w:jc w:val="both"/>
+        <w:rPr>
+          <w:rFonts w:ascii="Times New Roman" w:hAnsi="Times New Roman" w:cs="Times New Roman"/>
           <w:i w:val="0"/>
           <w:iCs w:val="0"/>
-          <w:color w:val="EE0000"/>
-        </w:rPr>
-      </w:pPr>
-      <w:r>
-        <w:rPr>
+          <w:color w:val="auto"/>
+          <w:sz w:val="24"/>
+          <w:szCs w:val="24"/>
+        </w:rPr>
+      </w:pPr>
+      <w:r>
+        <w:rPr>
+          <w:rFonts w:ascii="Times New Roman" w:hAnsi="Times New Roman" w:cs="Times New Roman"/>
           <w:i w:val="0"/>
           <w:iCs w:val="0"/>
-          <w:color w:val="EE0000"/>
-          <w:highlight w:val="yellow"/>
-        </w:rPr>
-        <w:t># Add summary of pre-cleaning ranges</w:t>
+          <w:color w:val="auto"/>
+          <w:sz w:val="24"/>
+          <w:szCs w:val="24"/>
+        </w:rPr>
+        <w:t xml:space="preserve">To </w:t>
+      </w:r>
+      <w:r>
+        <w:rPr>
+          <w:rFonts w:ascii="Times New Roman" w:hAnsi="Times New Roman" w:cs="Times New Roman"/>
+          <w:i w:val="0"/>
+          <w:iCs w:val="0"/>
+          <w:color w:val="auto"/>
+          <w:sz w:val="24"/>
+          <w:szCs w:val="24"/>
+        </w:rPr>
+        <w:t xml:space="preserve">obtain an idea of the distribution of the data in the raw dataset, the ranges of the raw numerical data were checked and are presented in </w:t>
+      </w:r>
+      <w:r>
+        <w:rPr>
+          <w:rFonts w:ascii="Times New Roman" w:hAnsi="Times New Roman" w:cs="Times New Roman"/>
+          <w:i w:val="0"/>
+          <w:iCs w:val="0"/>
+          <w:color w:val="auto"/>
+          <w:sz w:val="24"/>
+          <w:szCs w:val="24"/>
+        </w:rPr>
+        <w:fldChar w:fldCharType="begin"/>
+      </w:r>
+      <w:r>
+        <w:rPr>
+          <w:rFonts w:ascii="Times New Roman" w:hAnsi="Times New Roman" w:cs="Times New Roman"/>
+          <w:i w:val="0"/>
+          <w:iCs w:val="0"/>
+          <w:color w:val="auto"/>
+          <w:sz w:val="24"/>
+          <w:szCs w:val="24"/>
+        </w:rPr>
+        <w:instrText xml:space="preserve"> REF _Ref239266761 \h  \* MERGEFORMAT </w:instrText>
+      </w:r>
+      <w:r>
+        <w:rPr>
+          <w:rFonts w:ascii="Times New Roman" w:hAnsi="Times New Roman" w:cs="Times New Roman"/>
+          <w:i w:val="0"/>
+          <w:iCs w:val="0"/>
+          <w:color w:val="auto"/>
+          <w:sz w:val="24"/>
+          <w:szCs w:val="24"/>
+        </w:rPr>
+      </w:r>
+      <w:r>
+        <w:rPr>
+          <w:rFonts w:ascii="Times New Roman" w:hAnsi="Times New Roman" w:cs="Times New Roman"/>
+          <w:i w:val="0"/>
+          <w:iCs w:val="0"/>
+          <w:color w:val="auto"/>
+          <w:sz w:val="24"/>
+          <w:szCs w:val="24"/>
+        </w:rPr>
+        <w:fldChar w:fldCharType="separate"/>
+      </w:r>
+      <w:r>
+        <w:rPr>
+          <w:rFonts w:ascii="Times New Roman" w:hAnsi="Times New Roman" w:cs="Times New Roman"/>
+          <w:i w:val="0"/>
+          <w:iCs w:val="0"/>
+          <w:color w:val="auto"/>
+          <w:sz w:val="24"/>
+          <w:szCs w:val="24"/>
+        </w:rPr>
+        <w:t>Table 3</w:t>
+      </w:r>
+      <w:r>
+        <w:rPr>
+          <w:rFonts w:ascii="Times New Roman" w:hAnsi="Times New Roman" w:cs="Times New Roman"/>
+          <w:i w:val="0"/>
+          <w:iCs w:val="0"/>
+          <w:color w:val="auto"/>
+          <w:sz w:val="24"/>
+          <w:szCs w:val="24"/>
+        </w:rPr>
+        <w:fldChar w:fldCharType="end"/>
+      </w:r>
+      <w:r>
+        <w:rPr>
+          <w:rFonts w:ascii="Times New Roman" w:hAnsi="Times New Roman" w:cs="Times New Roman"/>
+          <w:i w:val="0"/>
+          <w:iCs w:val="0"/>
+          <w:color w:val="auto"/>
+          <w:sz w:val="24"/>
+          <w:szCs w:val="24"/>
+        </w:rPr>
+        <w:t xml:space="preserve">. </w:t>
       </w:r>
     </w:p>
     <w:p>
       <w:pPr>
+        <w:jc w:val="both"/>
+        <w:rPr>
+          <w:rFonts w:ascii="Times New Roman" w:hAnsi="Times New Roman" w:cs="Times New Roman"/>
+        </w:rPr>
+      </w:pPr>
+      <w:r>
+        <w:rPr>
+          <w:rFonts w:ascii="Times New Roman" w:hAnsi="Times New Roman" w:cs="Times New Roman"/>
+        </w:rPr>
+        <w:t xml:space="preserve">These indicate that there are some unrealistic ranges present (such as a fare for billions of dollars, negative distances, or large numbers of passengers that would not fit into a typical yellow taxi that can take 4 passengers and a driver, or zero passengers). </w:t>
+      </w:r>
+    </w:p>
+    <w:p>
+      <w:pPr>
         <w:pStyle w:val="Caption"/>
         <w:keepNext/>
       </w:pPr>
+      <w:bookmarkStart w:id="2" w:name="_Ref239269598"/>
       <w:r>
         <w:t xml:space="preserve">Table </w:t>
       </w:r>
@@ -3135,19 +3030,1403 @@
         <w:fldChar w:fldCharType="separate"/>
       </w:r>
       <w:r>
+        <w:rPr>
+          <w:noProof/>
+        </w:rPr>
         <w:t>3</w:t>
       </w:r>
       <w:r>
         <w:fldChar w:fldCharType="end"/>
       </w:r>
-      <w:r>
-        <w:t xml:space="preserve">: </w:t>
-      </w:r>
-      <w:r>
-        <w:t>Data cleaning summary</w:t>
-      </w:r>
-      <w:r>
-        <w:t>.</w:t>
+      <w:bookmarkEnd w:id="2"/>
+      <w:r>
+        <w:t>: Columns removed from the dataset.</w:t>
+      </w:r>
+    </w:p>
+    <w:tbl>
+      <w:tblPr>
+        <w:tblStyle w:val="TableGrid"/>
+        <w:tblW w:w="0" w:type="auto"/>
+        <w:tblLook w:val="04A0" w:firstRow="1" w:lastRow="0" w:firstColumn="1" w:lastColumn="0" w:noHBand="0" w:noVBand="1"/>
+      </w:tblPr>
+      <w:tblGrid>
+        <w:gridCol w:w="3145"/>
+      </w:tblGrid>
+      <w:tr>
+        <w:trPr>
+          <w:trHeight w:val="269"/>
+          <w:tblHeader/>
+        </w:trPr>
+        <w:tc>
+          <w:tcPr>
+            <w:tcW w:w="3145" w:type="dxa"/>
+            <w:tcBorders>
+              <w:right w:val="single" w:sz="4" w:space="0" w:color="FFFFFF" w:themeColor="background1"/>
+            </w:tcBorders>
+            <w:shd w:val="clear" w:color="auto" w:fill="262626" w:themeFill="text1" w:themeFillTint="D9"/>
+            <w:vAlign w:val="center"/>
+          </w:tcPr>
+          <w:p>
+            <w:pPr>
+              <w:jc w:val="center"/>
+              <w:rPr>
+                <w:rFonts w:ascii="Times New Roman" w:hAnsi="Times New Roman" w:cs="Times New Roman"/>
+                <w:b/>
+                <w:bCs/>
+                <w:sz w:val="22"/>
+                <w:szCs w:val="22"/>
+              </w:rPr>
+            </w:pPr>
+            <w:r>
+              <w:rPr>
+                <w:rFonts w:ascii="Times New Roman" w:hAnsi="Times New Roman" w:cs="Times New Roman"/>
+                <w:b/>
+                <w:bCs/>
+                <w:sz w:val="22"/>
+                <w:szCs w:val="22"/>
+              </w:rPr>
+              <w:t>Variable</w:t>
+            </w:r>
+          </w:p>
+        </w:tc>
+      </w:tr>
+      <w:tr>
+        <w:tc>
+          <w:tcPr>
+            <w:tcW w:w="3145" w:type="dxa"/>
+          </w:tcPr>
+          <w:p>
+            <w:pPr>
+              <w:jc w:val="both"/>
+              <w:rPr>
+                <w:rFonts w:ascii="Times New Roman" w:hAnsi="Times New Roman" w:cs="Times New Roman"/>
+                <w:sz w:val="22"/>
+                <w:szCs w:val="22"/>
+              </w:rPr>
+            </w:pPr>
+            <w:r>
+              <w:rPr>
+                <w:rFonts w:ascii="Times New Roman" w:hAnsi="Times New Roman" w:cs="Times New Roman"/>
+                <w:sz w:val="22"/>
+                <w:szCs w:val="22"/>
+              </w:rPr>
+              <w:t>store_and_fwd_flag</w:t>
+            </w:r>
+          </w:p>
+        </w:tc>
+      </w:tr>
+      <w:tr>
+        <w:tc>
+          <w:tcPr>
+            <w:tcW w:w="3145" w:type="dxa"/>
+          </w:tcPr>
+          <w:p>
+            <w:pPr>
+              <w:jc w:val="both"/>
+              <w:rPr>
+                <w:rFonts w:ascii="Times New Roman" w:hAnsi="Times New Roman" w:cs="Times New Roman"/>
+                <w:sz w:val="22"/>
+                <w:szCs w:val="22"/>
+              </w:rPr>
+            </w:pPr>
+            <w:r>
+              <w:rPr>
+                <w:rFonts w:ascii="Times New Roman" w:hAnsi="Times New Roman" w:cs="Times New Roman"/>
+                <w:sz w:val="22"/>
+                <w:szCs w:val="22"/>
+              </w:rPr>
+              <w:t>extra</w:t>
+            </w:r>
+          </w:p>
+        </w:tc>
+      </w:tr>
+      <w:tr>
+        <w:tc>
+          <w:tcPr>
+            <w:tcW w:w="3145" w:type="dxa"/>
+          </w:tcPr>
+          <w:p>
+            <w:pPr>
+              <w:jc w:val="both"/>
+              <w:rPr>
+                <w:rFonts w:ascii="Times New Roman" w:hAnsi="Times New Roman" w:cs="Times New Roman"/>
+                <w:sz w:val="22"/>
+                <w:szCs w:val="22"/>
+              </w:rPr>
+            </w:pPr>
+            <w:r>
+              <w:rPr>
+                <w:rFonts w:ascii="Times New Roman" w:hAnsi="Times New Roman" w:cs="Times New Roman"/>
+                <w:sz w:val="22"/>
+                <w:szCs w:val="22"/>
+              </w:rPr>
+              <w:t>mta_tax</w:t>
+            </w:r>
+          </w:p>
+        </w:tc>
+      </w:tr>
+      <w:tr>
+        <w:tc>
+          <w:tcPr>
+            <w:tcW w:w="3145" w:type="dxa"/>
+          </w:tcPr>
+          <w:p>
+            <w:pPr>
+              <w:jc w:val="both"/>
+              <w:rPr>
+                <w:rFonts w:ascii="Times New Roman" w:hAnsi="Times New Roman" w:cs="Times New Roman"/>
+                <w:sz w:val="22"/>
+                <w:szCs w:val="22"/>
+              </w:rPr>
+            </w:pPr>
+            <w:r>
+              <w:rPr>
+                <w:rFonts w:ascii="Times New Roman" w:hAnsi="Times New Roman" w:cs="Times New Roman"/>
+                <w:sz w:val="22"/>
+                <w:szCs w:val="22"/>
+              </w:rPr>
+              <w:t>tolls_amount</w:t>
+            </w:r>
+          </w:p>
+        </w:tc>
+      </w:tr>
+      <w:tr>
+        <w:tc>
+          <w:tcPr>
+            <w:tcW w:w="3145" w:type="dxa"/>
+          </w:tcPr>
+          <w:p>
+            <w:pPr>
+              <w:jc w:val="both"/>
+              <w:rPr>
+                <w:rFonts w:ascii="Times New Roman" w:hAnsi="Times New Roman" w:cs="Times New Roman"/>
+                <w:sz w:val="22"/>
+                <w:szCs w:val="22"/>
+              </w:rPr>
+            </w:pPr>
+            <w:r>
+              <w:rPr>
+                <w:rFonts w:ascii="Times New Roman" w:hAnsi="Times New Roman" w:cs="Times New Roman"/>
+                <w:sz w:val="22"/>
+                <w:szCs w:val="22"/>
+              </w:rPr>
+              <w:t>improvement_surcharge</w:t>
+            </w:r>
+          </w:p>
+        </w:tc>
+      </w:tr>
+      <w:tr>
+        <w:tc>
+          <w:tcPr>
+            <w:tcW w:w="3145" w:type="dxa"/>
+          </w:tcPr>
+          <w:p>
+            <w:pPr>
+              <w:jc w:val="both"/>
+              <w:rPr>
+                <w:rFonts w:ascii="Times New Roman" w:hAnsi="Times New Roman" w:cs="Times New Roman"/>
+                <w:sz w:val="22"/>
+                <w:szCs w:val="22"/>
+              </w:rPr>
+            </w:pPr>
+            <w:r>
+              <w:rPr>
+                <w:rFonts w:ascii="Times New Roman" w:hAnsi="Times New Roman" w:cs="Times New Roman"/>
+                <w:sz w:val="22"/>
+                <w:szCs w:val="22"/>
+              </w:rPr>
+              <w:t>congestion_surcharge</w:t>
+            </w:r>
+          </w:p>
+        </w:tc>
+      </w:tr>
+      <w:tr>
+        <w:tc>
+          <w:tcPr>
+            <w:tcW w:w="3145" w:type="dxa"/>
+          </w:tcPr>
+          <w:p>
+            <w:pPr>
+              <w:jc w:val="both"/>
+              <w:rPr>
+                <w:rFonts w:ascii="Times New Roman" w:hAnsi="Times New Roman" w:cs="Times New Roman"/>
+                <w:sz w:val="22"/>
+                <w:szCs w:val="22"/>
+              </w:rPr>
+            </w:pPr>
+            <w:r>
+              <w:rPr>
+                <w:rFonts w:ascii="Times New Roman" w:hAnsi="Times New Roman" w:cs="Times New Roman"/>
+                <w:sz w:val="22"/>
+                <w:szCs w:val="22"/>
+              </w:rPr>
+              <w:t>airport_fee</w:t>
+            </w:r>
+          </w:p>
+        </w:tc>
+      </w:tr>
+    </w:tbl>
+    <w:p>
+      <w:pPr>
+        <w:jc w:val="both"/>
+        <w:rPr>
+          <w:rFonts w:ascii="Times New Roman" w:hAnsi="Times New Roman" w:cs="Times New Roman"/>
+        </w:rPr>
+      </w:pPr>
+    </w:p>
+    <w:p>
+      <w:pPr>
+        <w:pStyle w:val="Caption"/>
+        <w:keepNext/>
+      </w:pPr>
+      <w:bookmarkStart w:id="3" w:name="_Ref239266761"/>
+      <w:r>
+        <w:t xml:space="preserve">Table </w:t>
+      </w:r>
+      <w:r>
+        <w:fldChar w:fldCharType="begin"/>
+      </w:r>
+      <w:r>
+        <w:instrText xml:space="preserve"> SEQ Table \* ARABIC </w:instrText>
+      </w:r>
+      <w:r>
+        <w:fldChar w:fldCharType="separate"/>
+      </w:r>
+      <w:r>
+        <w:rPr>
+          <w:noProof/>
+        </w:rPr>
+        <w:t>4</w:t>
+      </w:r>
+      <w:r>
+        <w:fldChar w:fldCharType="end"/>
+      </w:r>
+      <w:bookmarkEnd w:id="3"/>
+      <w:r>
+        <w:t>: Minimum and maximum ranges of the raw data set, obtained in order to better filter the dataset.</w:t>
+      </w:r>
+    </w:p>
+    <w:tbl>
+      <w:tblPr>
+        <w:tblStyle w:val="TableGrid"/>
+        <w:tblW w:w="0" w:type="auto"/>
+        <w:tblLook w:val="04A0" w:firstRow="1" w:lastRow="0" w:firstColumn="1" w:lastColumn="0" w:noHBand="0" w:noVBand="1"/>
+      </w:tblPr>
+      <w:tblGrid>
+        <w:gridCol w:w="3145"/>
+        <w:gridCol w:w="2790"/>
+        <w:gridCol w:w="3060"/>
+      </w:tblGrid>
+      <w:tr>
+        <w:trPr>
+          <w:trHeight w:val="269"/>
+          <w:tblHeader/>
+        </w:trPr>
+        <w:tc>
+          <w:tcPr>
+            <w:tcW w:w="3145" w:type="dxa"/>
+            <w:tcBorders>
+              <w:right w:val="single" w:sz="4" w:space="0" w:color="FFFFFF" w:themeColor="background1"/>
+            </w:tcBorders>
+            <w:shd w:val="clear" w:color="auto" w:fill="262626" w:themeFill="text1" w:themeFillTint="D9"/>
+            <w:vAlign w:val="center"/>
+          </w:tcPr>
+          <w:p>
+            <w:pPr>
+              <w:jc w:val="center"/>
+              <w:rPr>
+                <w:rFonts w:ascii="Times New Roman" w:hAnsi="Times New Roman" w:cs="Times New Roman"/>
+                <w:b/>
+                <w:bCs/>
+                <w:sz w:val="22"/>
+                <w:szCs w:val="22"/>
+              </w:rPr>
+            </w:pPr>
+            <w:r>
+              <w:rPr>
+                <w:rFonts w:ascii="Times New Roman" w:hAnsi="Times New Roman" w:cs="Times New Roman"/>
+                <w:b/>
+                <w:bCs/>
+                <w:sz w:val="22"/>
+                <w:szCs w:val="22"/>
+              </w:rPr>
+              <w:t>Variable</w:t>
+            </w:r>
+          </w:p>
+        </w:tc>
+        <w:tc>
+          <w:tcPr>
+            <w:tcW w:w="2790" w:type="dxa"/>
+            <w:tcBorders>
+              <w:left w:val="single" w:sz="4" w:space="0" w:color="FFFFFF" w:themeColor="background1"/>
+              <w:right w:val="single" w:sz="4" w:space="0" w:color="FFFFFF" w:themeColor="background1"/>
+            </w:tcBorders>
+            <w:shd w:val="clear" w:color="auto" w:fill="262626" w:themeFill="text1" w:themeFillTint="D9"/>
+          </w:tcPr>
+          <w:p>
+            <w:pPr>
+              <w:jc w:val="center"/>
+              <w:rPr>
+                <w:rFonts w:ascii="Times New Roman" w:hAnsi="Times New Roman" w:cs="Times New Roman"/>
+                <w:b/>
+                <w:bCs/>
+                <w:sz w:val="22"/>
+                <w:szCs w:val="22"/>
+              </w:rPr>
+            </w:pPr>
+            <w:r>
+              <w:rPr>
+                <w:rFonts w:ascii="Times New Roman" w:hAnsi="Times New Roman" w:cs="Times New Roman"/>
+                <w:b/>
+                <w:bCs/>
+                <w:sz w:val="22"/>
+                <w:szCs w:val="22"/>
+              </w:rPr>
+              <w:t>Minimum</w:t>
+            </w:r>
+          </w:p>
+        </w:tc>
+        <w:tc>
+          <w:tcPr>
+            <w:tcW w:w="3060" w:type="dxa"/>
+            <w:tcBorders>
+              <w:left w:val="single" w:sz="4" w:space="0" w:color="FFFFFF" w:themeColor="background1"/>
+              <w:right w:val="single" w:sz="4" w:space="0" w:color="FFFFFF" w:themeColor="background1"/>
+            </w:tcBorders>
+            <w:shd w:val="clear" w:color="auto" w:fill="262626" w:themeFill="text1" w:themeFillTint="D9"/>
+          </w:tcPr>
+          <w:p>
+            <w:pPr>
+              <w:jc w:val="center"/>
+              <w:rPr>
+                <w:rFonts w:ascii="Times New Roman" w:hAnsi="Times New Roman" w:cs="Times New Roman"/>
+                <w:b/>
+                <w:bCs/>
+                <w:sz w:val="22"/>
+                <w:szCs w:val="22"/>
+              </w:rPr>
+            </w:pPr>
+            <w:r>
+              <w:rPr>
+                <w:rFonts w:ascii="Times New Roman" w:hAnsi="Times New Roman" w:cs="Times New Roman"/>
+                <w:b/>
+                <w:bCs/>
+                <w:sz w:val="22"/>
+                <w:szCs w:val="22"/>
+              </w:rPr>
+              <w:t xml:space="preserve">Maximum </w:t>
+            </w:r>
+          </w:p>
+        </w:tc>
+      </w:tr>
+      <w:tr>
+        <w:tc>
+          <w:tcPr>
+            <w:tcW w:w="3145" w:type="dxa"/>
+          </w:tcPr>
+          <w:p>
+            <w:pPr>
+              <w:jc w:val="both"/>
+              <w:rPr>
+                <w:rFonts w:ascii="Times New Roman" w:hAnsi="Times New Roman" w:cs="Times New Roman"/>
+                <w:sz w:val="22"/>
+                <w:szCs w:val="22"/>
+              </w:rPr>
+            </w:pPr>
+            <w:r>
+              <w:rPr>
+                <w:rFonts w:ascii="Times New Roman" w:hAnsi="Times New Roman" w:cs="Times New Roman"/>
+                <w:sz w:val="22"/>
+                <w:szCs w:val="22"/>
+              </w:rPr>
+              <w:t>passenger_count</w:t>
+            </w:r>
+          </w:p>
+        </w:tc>
+        <w:tc>
+          <w:tcPr>
+            <w:tcW w:w="2790" w:type="dxa"/>
+          </w:tcPr>
+          <w:p>
+            <w:pPr>
+              <w:jc w:val="center"/>
+              <w:rPr>
+                <w:rFonts w:ascii="Times New Roman" w:hAnsi="Times New Roman" w:cs="Times New Roman"/>
+                <w:sz w:val="22"/>
+                <w:szCs w:val="22"/>
+              </w:rPr>
+            </w:pPr>
+            <w:r>
+              <w:rPr>
+                <w:rFonts w:ascii="Times New Roman" w:hAnsi="Times New Roman" w:cs="Times New Roman"/>
+                <w:sz w:val="22"/>
+                <w:szCs w:val="22"/>
+              </w:rPr>
+              <w:t>0</w:t>
+            </w:r>
+          </w:p>
+        </w:tc>
+        <w:tc>
+          <w:tcPr>
+            <w:tcW w:w="3060" w:type="dxa"/>
+          </w:tcPr>
+          <w:p>
+            <w:pPr>
+              <w:jc w:val="center"/>
+              <w:rPr>
+                <w:rFonts w:ascii="Times New Roman" w:hAnsi="Times New Roman" w:cs="Times New Roman"/>
+                <w:sz w:val="22"/>
+                <w:szCs w:val="22"/>
+              </w:rPr>
+            </w:pPr>
+            <w:r>
+              <w:rPr>
+                <w:rFonts w:ascii="Times New Roman" w:hAnsi="Times New Roman" w:cs="Times New Roman"/>
+                <w:sz w:val="22"/>
+                <w:szCs w:val="22"/>
+              </w:rPr>
+              <w:t>208</w:t>
+            </w:r>
+          </w:p>
+        </w:tc>
+      </w:tr>
+      <w:tr>
+        <w:tc>
+          <w:tcPr>
+            <w:tcW w:w="3145" w:type="dxa"/>
+          </w:tcPr>
+          <w:p>
+            <w:pPr>
+              <w:jc w:val="both"/>
+              <w:rPr>
+                <w:rFonts w:ascii="Times New Roman" w:hAnsi="Times New Roman" w:cs="Times New Roman"/>
+                <w:sz w:val="22"/>
+                <w:szCs w:val="22"/>
+              </w:rPr>
+            </w:pPr>
+            <w:r>
+              <w:rPr>
+                <w:rFonts w:ascii="Times New Roman" w:hAnsi="Times New Roman" w:cs="Times New Roman"/>
+                <w:sz w:val="22"/>
+                <w:szCs w:val="22"/>
+              </w:rPr>
+              <w:t>trip_distance</w:t>
+            </w:r>
+          </w:p>
+        </w:tc>
+        <w:tc>
+          <w:tcPr>
+            <w:tcW w:w="2790" w:type="dxa"/>
+          </w:tcPr>
+          <w:p>
+            <w:pPr>
+              <w:jc w:val="center"/>
+              <w:rPr>
+                <w:rFonts w:ascii="Times New Roman" w:hAnsi="Times New Roman" w:cs="Times New Roman"/>
+                <w:sz w:val="22"/>
+                <w:szCs w:val="22"/>
+              </w:rPr>
+            </w:pPr>
+            <w:r>
+              <w:rPr>
+                <w:rFonts w:ascii="Times New Roman" w:hAnsi="Times New Roman" w:cs="Times New Roman"/>
+                <w:sz w:val="22"/>
+                <w:szCs w:val="22"/>
+              </w:rPr>
+              <w:t>-4.08E7</w:t>
+            </w:r>
+          </w:p>
+        </w:tc>
+        <w:tc>
+          <w:tcPr>
+            <w:tcW w:w="3060" w:type="dxa"/>
+          </w:tcPr>
+          <w:p>
+            <w:pPr>
+              <w:jc w:val="center"/>
+              <w:rPr>
+                <w:rFonts w:ascii="Times New Roman" w:hAnsi="Times New Roman" w:cs="Times New Roman"/>
+                <w:sz w:val="22"/>
+                <w:szCs w:val="22"/>
+              </w:rPr>
+            </w:pPr>
+            <w:r>
+              <w:rPr>
+                <w:rFonts w:ascii="Times New Roman" w:hAnsi="Times New Roman" w:cs="Times New Roman"/>
+                <w:sz w:val="22"/>
+                <w:szCs w:val="22"/>
+              </w:rPr>
+              <w:t>1.35E8</w:t>
+            </w:r>
+          </w:p>
+        </w:tc>
+      </w:tr>
+      <w:tr>
+        <w:tc>
+          <w:tcPr>
+            <w:tcW w:w="3145" w:type="dxa"/>
+          </w:tcPr>
+          <w:p>
+            <w:pPr>
+              <w:jc w:val="both"/>
+              <w:rPr>
+                <w:rFonts w:ascii="Times New Roman" w:hAnsi="Times New Roman" w:cs="Times New Roman"/>
+                <w:sz w:val="22"/>
+                <w:szCs w:val="22"/>
+              </w:rPr>
+            </w:pPr>
+            <w:r>
+              <w:rPr>
+                <w:rFonts w:ascii="Times New Roman" w:hAnsi="Times New Roman" w:cs="Times New Roman"/>
+                <w:sz w:val="22"/>
+                <w:szCs w:val="22"/>
+              </w:rPr>
+              <w:t>fare_amount</w:t>
+            </w:r>
+          </w:p>
+        </w:tc>
+        <w:tc>
+          <w:tcPr>
+            <w:tcW w:w="2790" w:type="dxa"/>
+          </w:tcPr>
+          <w:p>
+            <w:pPr>
+              <w:jc w:val="center"/>
+              <w:rPr>
+                <w:rFonts w:ascii="Times New Roman" w:hAnsi="Times New Roman" w:cs="Times New Roman"/>
+                <w:sz w:val="22"/>
+                <w:szCs w:val="22"/>
+              </w:rPr>
+            </w:pPr>
+            <w:r>
+              <w:rPr>
+                <w:rFonts w:ascii="Times New Roman" w:hAnsi="Times New Roman" w:cs="Times New Roman"/>
+                <w:sz w:val="22"/>
+                <w:szCs w:val="22"/>
+              </w:rPr>
+              <w:t>-957.6</w:t>
+            </w:r>
+          </w:p>
+        </w:tc>
+        <w:tc>
+          <w:tcPr>
+            <w:tcW w:w="3060" w:type="dxa"/>
+          </w:tcPr>
+          <w:p>
+            <w:pPr>
+              <w:jc w:val="center"/>
+              <w:rPr>
+                <w:rFonts w:ascii="Times New Roman" w:hAnsi="Times New Roman" w:cs="Times New Roman"/>
+                <w:sz w:val="22"/>
+                <w:szCs w:val="22"/>
+              </w:rPr>
+            </w:pPr>
+            <w:r>
+              <w:rPr>
+                <w:rFonts w:ascii="Times New Roman" w:hAnsi="Times New Roman" w:cs="Times New Roman"/>
+                <w:sz w:val="22"/>
+                <w:szCs w:val="22"/>
+              </w:rPr>
+              <w:t>861604.49</w:t>
+            </w:r>
+          </w:p>
+        </w:tc>
+      </w:tr>
+      <w:tr>
+        <w:tc>
+          <w:tcPr>
+            <w:tcW w:w="3145" w:type="dxa"/>
+          </w:tcPr>
+          <w:p>
+            <w:pPr>
+              <w:jc w:val="both"/>
+              <w:rPr>
+                <w:rFonts w:ascii="Times New Roman" w:hAnsi="Times New Roman" w:cs="Times New Roman"/>
+                <w:sz w:val="22"/>
+                <w:szCs w:val="22"/>
+              </w:rPr>
+            </w:pPr>
+            <w:r>
+              <w:rPr>
+                <w:rFonts w:ascii="Times New Roman" w:hAnsi="Times New Roman" w:cs="Times New Roman"/>
+                <w:sz w:val="22"/>
+                <w:szCs w:val="22"/>
+              </w:rPr>
+              <w:t>tip_amount</w:t>
+            </w:r>
+          </w:p>
+        </w:tc>
+        <w:tc>
+          <w:tcPr>
+            <w:tcW w:w="2790" w:type="dxa"/>
+          </w:tcPr>
+          <w:p>
+            <w:pPr>
+              <w:jc w:val="center"/>
+              <w:rPr>
+                <w:rFonts w:ascii="Times New Roman" w:hAnsi="Times New Roman" w:cs="Times New Roman"/>
+                <w:sz w:val="22"/>
+                <w:szCs w:val="22"/>
+              </w:rPr>
+            </w:pPr>
+            <w:r>
+              <w:rPr>
+                <w:rFonts w:ascii="Times New Roman" w:hAnsi="Times New Roman" w:cs="Times New Roman"/>
+                <w:sz w:val="22"/>
+                <w:szCs w:val="22"/>
+              </w:rPr>
+              <w:t>-448.91</w:t>
+            </w:r>
+          </w:p>
+        </w:tc>
+        <w:tc>
+          <w:tcPr>
+            <w:tcW w:w="3060" w:type="dxa"/>
+          </w:tcPr>
+          <w:p>
+            <w:pPr>
+              <w:jc w:val="center"/>
+              <w:rPr>
+                <w:rFonts w:ascii="Times New Roman" w:hAnsi="Times New Roman" w:cs="Times New Roman"/>
+                <w:sz w:val="22"/>
+                <w:szCs w:val="22"/>
+              </w:rPr>
+            </w:pPr>
+            <w:r>
+              <w:rPr>
+                <w:rFonts w:ascii="Times New Roman" w:hAnsi="Times New Roman" w:cs="Times New Roman"/>
+                <w:sz w:val="22"/>
+                <w:szCs w:val="22"/>
+              </w:rPr>
+              <w:t>3950588.8</w:t>
+            </w:r>
+          </w:p>
+        </w:tc>
+      </w:tr>
+      <w:tr>
+        <w:tc>
+          <w:tcPr>
+            <w:tcW w:w="3145" w:type="dxa"/>
+          </w:tcPr>
+          <w:p>
+            <w:pPr>
+              <w:jc w:val="both"/>
+              <w:rPr>
+                <w:rFonts w:ascii="Times New Roman" w:hAnsi="Times New Roman" w:cs="Times New Roman"/>
+                <w:sz w:val="22"/>
+                <w:szCs w:val="22"/>
+              </w:rPr>
+            </w:pPr>
+            <w:r>
+              <w:rPr>
+                <w:rFonts w:ascii="Times New Roman" w:hAnsi="Times New Roman" w:cs="Times New Roman"/>
+                <w:sz w:val="22"/>
+                <w:szCs w:val="22"/>
+              </w:rPr>
+              <w:t>total_amount</w:t>
+            </w:r>
+          </w:p>
+        </w:tc>
+        <w:tc>
+          <w:tcPr>
+            <w:tcW w:w="2790" w:type="dxa"/>
+          </w:tcPr>
+          <w:p>
+            <w:pPr>
+              <w:jc w:val="center"/>
+              <w:rPr>
+                <w:rFonts w:ascii="Times New Roman" w:hAnsi="Times New Roman" w:cs="Times New Roman"/>
+                <w:sz w:val="22"/>
+                <w:szCs w:val="22"/>
+              </w:rPr>
+            </w:pPr>
+            <w:r>
+              <w:rPr>
+                <w:rFonts w:ascii="Times New Roman" w:hAnsi="Times New Roman" w:cs="Times New Roman"/>
+                <w:sz w:val="22"/>
+                <w:szCs w:val="22"/>
+              </w:rPr>
+              <w:t>-958.4</w:t>
+            </w:r>
+          </w:p>
+        </w:tc>
+        <w:tc>
+          <w:tcPr>
+            <w:tcW w:w="3060" w:type="dxa"/>
+          </w:tcPr>
+          <w:p>
+            <w:pPr>
+              <w:jc w:val="center"/>
+              <w:rPr>
+                <w:rFonts w:ascii="Times New Roman" w:hAnsi="Times New Roman" w:cs="Times New Roman"/>
+                <w:sz w:val="22"/>
+                <w:szCs w:val="22"/>
+              </w:rPr>
+            </w:pPr>
+            <w:r>
+              <w:rPr>
+                <w:rFonts w:ascii="Times New Roman" w:hAnsi="Times New Roman" w:cs="Times New Roman"/>
+                <w:sz w:val="22"/>
+                <w:szCs w:val="22"/>
+              </w:rPr>
+              <w:t>1E07</w:t>
+            </w:r>
+          </w:p>
+        </w:tc>
+      </w:tr>
+      <w:tr>
+        <w:tc>
+          <w:tcPr>
+            <w:tcW w:w="3145" w:type="dxa"/>
+          </w:tcPr>
+          <w:p>
+            <w:pPr>
+              <w:jc w:val="both"/>
+              <w:rPr>
+                <w:rFonts w:ascii="Times New Roman" w:hAnsi="Times New Roman" w:cs="Times New Roman"/>
+                <w:sz w:val="22"/>
+                <w:szCs w:val="22"/>
+              </w:rPr>
+            </w:pPr>
+            <w:r>
+              <w:rPr>
+                <w:rFonts w:ascii="Times New Roman" w:hAnsi="Times New Roman" w:cs="Times New Roman"/>
+                <w:sz w:val="22"/>
+                <w:szCs w:val="22"/>
+              </w:rPr>
+              <w:t>trip_duration</w:t>
+            </w:r>
+          </w:p>
+        </w:tc>
+        <w:tc>
+          <w:tcPr>
+            <w:tcW w:w="2790" w:type="dxa"/>
+          </w:tcPr>
+          <w:p>
+            <w:pPr>
+              <w:jc w:val="center"/>
+              <w:rPr>
+                <w:rFonts w:ascii="Times New Roman" w:hAnsi="Times New Roman" w:cs="Times New Roman"/>
+                <w:sz w:val="22"/>
+                <w:szCs w:val="22"/>
+              </w:rPr>
+            </w:pPr>
+            <w:r>
+              <w:rPr>
+                <w:rFonts w:ascii="Times New Roman" w:hAnsi="Times New Roman" w:cs="Times New Roman"/>
+                <w:sz w:val="22"/>
+                <w:szCs w:val="22"/>
+              </w:rPr>
+              <w:t>-1016695.4</w:t>
+            </w:r>
+          </w:p>
+        </w:tc>
+        <w:tc>
+          <w:tcPr>
+            <w:tcW w:w="3060" w:type="dxa"/>
+          </w:tcPr>
+          <w:p>
+            <w:pPr>
+              <w:jc w:val="center"/>
+              <w:rPr>
+                <w:rFonts w:ascii="Times New Roman" w:hAnsi="Times New Roman" w:cs="Times New Roman"/>
+                <w:sz w:val="22"/>
+                <w:szCs w:val="22"/>
+              </w:rPr>
+            </w:pPr>
+            <w:r>
+              <w:rPr>
+                <w:rFonts w:ascii="Times New Roman" w:hAnsi="Times New Roman" w:cs="Times New Roman"/>
+                <w:sz w:val="22"/>
+                <w:szCs w:val="22"/>
+              </w:rPr>
+              <w:t>21308.13</w:t>
+            </w:r>
+          </w:p>
+        </w:tc>
+      </w:tr>
+      <w:tr>
+        <w:tc>
+          <w:tcPr>
+            <w:tcW w:w="3145" w:type="dxa"/>
+          </w:tcPr>
+          <w:p>
+            <w:pPr>
+              <w:jc w:val="both"/>
+              <w:rPr>
+                <w:rFonts w:ascii="Times New Roman" w:hAnsi="Times New Roman" w:cs="Times New Roman"/>
+                <w:sz w:val="22"/>
+                <w:szCs w:val="22"/>
+              </w:rPr>
+            </w:pPr>
+            <w:r>
+              <w:rPr>
+                <w:rFonts w:ascii="Times New Roman" w:hAnsi="Times New Roman" w:cs="Times New Roman"/>
+                <w:sz w:val="22"/>
+                <w:szCs w:val="22"/>
+              </w:rPr>
+              <w:t>average_trip_speed</w:t>
+            </w:r>
+          </w:p>
+        </w:tc>
+        <w:tc>
+          <w:tcPr>
+            <w:tcW w:w="2790" w:type="dxa"/>
+          </w:tcPr>
+          <w:p>
+            <w:pPr>
+              <w:jc w:val="center"/>
+              <w:rPr>
+                <w:rFonts w:ascii="Times New Roman" w:hAnsi="Times New Roman" w:cs="Times New Roman"/>
+                <w:sz w:val="22"/>
+                <w:szCs w:val="22"/>
+              </w:rPr>
+            </w:pPr>
+            <w:r>
+              <w:rPr>
+                <w:rFonts w:ascii="Times New Roman" w:hAnsi="Times New Roman" w:cs="Times New Roman"/>
+                <w:sz w:val="22"/>
+                <w:szCs w:val="22"/>
+              </w:rPr>
+              <w:t>-4.9</w:t>
+            </w:r>
+          </w:p>
+        </w:tc>
+        <w:tc>
+          <w:tcPr>
+            <w:tcW w:w="3060" w:type="dxa"/>
+          </w:tcPr>
+          <w:p>
+            <w:pPr>
+              <w:jc w:val="center"/>
+              <w:rPr>
+                <w:rFonts w:ascii="Times New Roman" w:hAnsi="Times New Roman" w:cs="Times New Roman"/>
+                <w:sz w:val="22"/>
+                <w:szCs w:val="22"/>
+              </w:rPr>
+            </w:pPr>
+            <w:r>
+              <w:rPr>
+                <w:rFonts w:ascii="Times New Roman" w:hAnsi="Times New Roman" w:cs="Times New Roman"/>
+                <w:sz w:val="22"/>
+                <w:szCs w:val="22"/>
+              </w:rPr>
+              <w:t>9.9E9</w:t>
+            </w:r>
+          </w:p>
+        </w:tc>
+      </w:tr>
+    </w:tbl>
+    <w:p/>
+    <w:p>
+      <w:pPr>
+        <w:pStyle w:val="Caption"/>
+        <w:keepNext/>
+      </w:pPr>
+      <w:bookmarkStart w:id="4" w:name="_Ref239268454"/>
+      <w:r>
+        <w:t xml:space="preserve">Table </w:t>
+      </w:r>
+      <w:r>
+        <w:fldChar w:fldCharType="begin"/>
+      </w:r>
+      <w:r>
+        <w:instrText xml:space="preserve"> SEQ Table \* ARABIC </w:instrText>
+      </w:r>
+      <w:r>
+        <w:fldChar w:fldCharType="separate"/>
+      </w:r>
+      <w:r>
+        <w:rPr>
+          <w:noProof/>
+        </w:rPr>
+        <w:t>5</w:t>
+      </w:r>
+      <w:r>
+        <w:fldChar w:fldCharType="end"/>
+      </w:r>
+      <w:bookmarkEnd w:id="4"/>
+      <w:r>
+        <w:t>: Filters applied.</w:t>
+      </w:r>
+    </w:p>
+    <w:tbl>
+      <w:tblPr>
+        <w:tblStyle w:val="TableGrid"/>
+        <w:tblW w:w="9085" w:type="dxa"/>
+        <w:tblLook w:val="04A0" w:firstRow="1" w:lastRow="0" w:firstColumn="1" w:lastColumn="0" w:noHBand="0" w:noVBand="1"/>
+      </w:tblPr>
+      <w:tblGrid>
+        <w:gridCol w:w="3145"/>
+        <w:gridCol w:w="5940"/>
+      </w:tblGrid>
+      <w:tr>
+        <w:trPr>
+          <w:trHeight w:val="269"/>
+          <w:tblHeader/>
+        </w:trPr>
+        <w:tc>
+          <w:tcPr>
+            <w:tcW w:w="3145" w:type="dxa"/>
+            <w:tcBorders>
+              <w:right w:val="single" w:sz="4" w:space="0" w:color="FFFFFF" w:themeColor="background1"/>
+            </w:tcBorders>
+            <w:shd w:val="clear" w:color="auto" w:fill="262626" w:themeFill="text1" w:themeFillTint="D9"/>
+            <w:vAlign w:val="center"/>
+          </w:tcPr>
+          <w:p>
+            <w:pPr>
+              <w:jc w:val="center"/>
+              <w:rPr>
+                <w:rFonts w:ascii="Times New Roman" w:hAnsi="Times New Roman" w:cs="Times New Roman"/>
+                <w:b/>
+                <w:bCs/>
+                <w:sz w:val="22"/>
+                <w:szCs w:val="22"/>
+              </w:rPr>
+            </w:pPr>
+            <w:r>
+              <w:rPr>
+                <w:rFonts w:ascii="Times New Roman" w:hAnsi="Times New Roman" w:cs="Times New Roman"/>
+                <w:b/>
+                <w:bCs/>
+                <w:sz w:val="22"/>
+                <w:szCs w:val="22"/>
+              </w:rPr>
+              <w:t>Variable</w:t>
+            </w:r>
+          </w:p>
+        </w:tc>
+        <w:tc>
+          <w:tcPr>
+            <w:tcW w:w="5940" w:type="dxa"/>
+            <w:tcBorders>
+              <w:left w:val="single" w:sz="4" w:space="0" w:color="FFFFFF" w:themeColor="background1"/>
+              <w:right w:val="single" w:sz="4" w:space="0" w:color="FFFFFF" w:themeColor="background1"/>
+            </w:tcBorders>
+            <w:shd w:val="clear" w:color="auto" w:fill="262626" w:themeFill="text1" w:themeFillTint="D9"/>
+          </w:tcPr>
+          <w:p>
+            <w:pPr>
+              <w:jc w:val="center"/>
+              <w:rPr>
+                <w:rFonts w:ascii="Times New Roman" w:hAnsi="Times New Roman" w:cs="Times New Roman"/>
+                <w:b/>
+                <w:bCs/>
+                <w:sz w:val="22"/>
+                <w:szCs w:val="22"/>
+              </w:rPr>
+            </w:pPr>
+            <w:r>
+              <w:rPr>
+                <w:rFonts w:ascii="Times New Roman" w:hAnsi="Times New Roman" w:cs="Times New Roman"/>
+                <w:b/>
+                <w:bCs/>
+                <w:sz w:val="22"/>
+                <w:szCs w:val="22"/>
+              </w:rPr>
+              <w:t>Filter applied</w:t>
+            </w:r>
+          </w:p>
+        </w:tc>
+      </w:tr>
+      <w:tr>
+        <w:tc>
+          <w:tcPr>
+            <w:tcW w:w="3145" w:type="dxa"/>
+          </w:tcPr>
+          <w:p>
+            <w:pPr>
+              <w:jc w:val="both"/>
+              <w:rPr>
+                <w:rFonts w:ascii="Times New Roman" w:hAnsi="Times New Roman" w:cs="Times New Roman"/>
+                <w:sz w:val="22"/>
+                <w:szCs w:val="22"/>
+              </w:rPr>
+            </w:pPr>
+            <w:r>
+              <w:rPr>
+                <w:rFonts w:ascii="Times New Roman" w:hAnsi="Times New Roman" w:cs="Times New Roman"/>
+                <w:sz w:val="22"/>
+                <w:szCs w:val="22"/>
+              </w:rPr>
+              <w:t xml:space="preserve">passenger_count </w:t>
+            </w:r>
+          </w:p>
+        </w:tc>
+        <w:tc>
+          <w:tcPr>
+            <w:tcW w:w="5940" w:type="dxa"/>
+          </w:tcPr>
+          <w:p>
+            <w:pPr>
+              <w:jc w:val="center"/>
+              <w:rPr>
+                <w:rFonts w:ascii="Times New Roman" w:hAnsi="Times New Roman" w:cs="Times New Roman"/>
+                <w:sz w:val="22"/>
+                <w:szCs w:val="22"/>
+              </w:rPr>
+            </w:pPr>
+            <w:r>
+              <w:rPr>
+                <w:rFonts w:ascii="Times New Roman" w:hAnsi="Times New Roman" w:cs="Times New Roman"/>
+                <w:sz w:val="22"/>
+                <w:szCs w:val="22"/>
+              </w:rPr>
+              <w:t>0 &lt; passenger_count &lt; 5</w:t>
+            </w:r>
+          </w:p>
+        </w:tc>
+      </w:tr>
+      <w:tr>
+        <w:tc>
+          <w:tcPr>
+            <w:tcW w:w="3145" w:type="dxa"/>
+          </w:tcPr>
+          <w:p>
+            <w:pPr>
+              <w:jc w:val="both"/>
+              <w:rPr>
+                <w:rFonts w:ascii="Times New Roman" w:hAnsi="Times New Roman" w:cs="Times New Roman"/>
+                <w:sz w:val="22"/>
+                <w:szCs w:val="22"/>
+              </w:rPr>
+            </w:pPr>
+            <w:r>
+              <w:rPr>
+                <w:rFonts w:ascii="Times New Roman" w:hAnsi="Times New Roman" w:cs="Times New Roman"/>
+                <w:sz w:val="22"/>
+                <w:szCs w:val="22"/>
+              </w:rPr>
+              <w:t>trip_distance</w:t>
+            </w:r>
+          </w:p>
+        </w:tc>
+        <w:tc>
+          <w:tcPr>
+            <w:tcW w:w="5940" w:type="dxa"/>
+          </w:tcPr>
+          <w:p>
+            <w:pPr>
+              <w:jc w:val="center"/>
+              <w:rPr>
+                <w:rFonts w:ascii="Times New Roman" w:hAnsi="Times New Roman" w:cs="Times New Roman"/>
+                <w:sz w:val="22"/>
+                <w:szCs w:val="22"/>
+              </w:rPr>
+            </w:pPr>
+            <w:r>
+              <w:rPr>
+                <w:rFonts w:ascii="Times New Roman" w:hAnsi="Times New Roman" w:cs="Times New Roman"/>
+                <w:sz w:val="22"/>
+                <w:szCs w:val="22"/>
+              </w:rPr>
+              <w:t>0 miles &lt; trip_distance &lt; 20 miles</w:t>
+            </w:r>
+          </w:p>
+        </w:tc>
+      </w:tr>
+      <w:tr>
+        <w:tc>
+          <w:tcPr>
+            <w:tcW w:w="3145" w:type="dxa"/>
+          </w:tcPr>
+          <w:p>
+            <w:pPr>
+              <w:jc w:val="both"/>
+              <w:rPr>
+                <w:rFonts w:ascii="Times New Roman" w:hAnsi="Times New Roman" w:cs="Times New Roman"/>
+                <w:sz w:val="22"/>
+                <w:szCs w:val="22"/>
+              </w:rPr>
+            </w:pPr>
+            <w:r>
+              <w:rPr>
+                <w:rFonts w:ascii="Times New Roman" w:hAnsi="Times New Roman" w:cs="Times New Roman"/>
+                <w:sz w:val="22"/>
+                <w:szCs w:val="22"/>
+              </w:rPr>
+              <w:t>fare_amount</w:t>
+            </w:r>
+          </w:p>
+        </w:tc>
+        <w:tc>
+          <w:tcPr>
+            <w:tcW w:w="5940" w:type="dxa"/>
+          </w:tcPr>
+          <w:p>
+            <w:pPr>
+              <w:jc w:val="center"/>
+              <w:rPr>
+                <w:rFonts w:ascii="Times New Roman" w:hAnsi="Times New Roman" w:cs="Times New Roman"/>
+                <w:sz w:val="22"/>
+                <w:szCs w:val="22"/>
+              </w:rPr>
+            </w:pPr>
+            <w:r>
+              <w:rPr>
+                <w:rFonts w:ascii="Times New Roman" w:hAnsi="Times New Roman" w:cs="Times New Roman"/>
+                <w:sz w:val="22"/>
+                <w:szCs w:val="22"/>
+              </w:rPr>
+              <w:t>0 dollars &lt; fare_amount &lt; 100 dollars</w:t>
+            </w:r>
+          </w:p>
+        </w:tc>
+      </w:tr>
+      <w:tr>
+        <w:tc>
+          <w:tcPr>
+            <w:tcW w:w="3145" w:type="dxa"/>
+          </w:tcPr>
+          <w:p>
+            <w:pPr>
+              <w:jc w:val="both"/>
+              <w:rPr>
+                <w:rFonts w:ascii="Times New Roman" w:hAnsi="Times New Roman" w:cs="Times New Roman"/>
+                <w:sz w:val="22"/>
+                <w:szCs w:val="22"/>
+              </w:rPr>
+            </w:pPr>
+            <w:r>
+              <w:rPr>
+                <w:rFonts w:ascii="Times New Roman" w:hAnsi="Times New Roman" w:cs="Times New Roman"/>
+                <w:sz w:val="22"/>
+                <w:szCs w:val="22"/>
+              </w:rPr>
+              <w:t>tip_amount</w:t>
+            </w:r>
+          </w:p>
+        </w:tc>
+        <w:tc>
+          <w:tcPr>
+            <w:tcW w:w="5940" w:type="dxa"/>
+          </w:tcPr>
+          <w:p>
+            <w:pPr>
+              <w:jc w:val="center"/>
+              <w:rPr>
+                <w:rFonts w:ascii="Times New Roman" w:hAnsi="Times New Roman" w:cs="Times New Roman"/>
+                <w:sz w:val="22"/>
+                <w:szCs w:val="22"/>
+              </w:rPr>
+            </w:pPr>
+            <w:r>
+              <w:rPr>
+                <w:rFonts w:ascii="Times New Roman" w:hAnsi="Times New Roman" w:cs="Times New Roman"/>
+                <w:sz w:val="22"/>
+                <w:szCs w:val="22"/>
+              </w:rPr>
+              <w:t>tip_amount &gt;= 0 dollars</w:t>
+            </w:r>
+          </w:p>
+        </w:tc>
+      </w:tr>
+      <w:tr>
+        <w:tc>
+          <w:tcPr>
+            <w:tcW w:w="3145" w:type="dxa"/>
+          </w:tcPr>
+          <w:p>
+            <w:pPr>
+              <w:jc w:val="both"/>
+              <w:rPr>
+                <w:rFonts w:ascii="Times New Roman" w:hAnsi="Times New Roman" w:cs="Times New Roman"/>
+                <w:sz w:val="22"/>
+                <w:szCs w:val="22"/>
+              </w:rPr>
+            </w:pPr>
+            <w:r>
+              <w:rPr>
+                <w:rFonts w:ascii="Times New Roman" w:hAnsi="Times New Roman" w:cs="Times New Roman"/>
+                <w:sz w:val="22"/>
+                <w:szCs w:val="22"/>
+              </w:rPr>
+              <w:t>total_amount</w:t>
+            </w:r>
+          </w:p>
+        </w:tc>
+        <w:tc>
+          <w:tcPr>
+            <w:tcW w:w="5940" w:type="dxa"/>
+          </w:tcPr>
+          <w:p>
+            <w:pPr>
+              <w:jc w:val="center"/>
+              <w:rPr>
+                <w:rFonts w:ascii="Times New Roman" w:hAnsi="Times New Roman" w:cs="Times New Roman"/>
+                <w:sz w:val="22"/>
+                <w:szCs w:val="22"/>
+              </w:rPr>
+            </w:pPr>
+            <w:r>
+              <w:rPr>
+                <w:rFonts w:ascii="Times New Roman" w:hAnsi="Times New Roman" w:cs="Times New Roman"/>
+                <w:sz w:val="22"/>
+                <w:szCs w:val="22"/>
+              </w:rPr>
+              <w:t>0  dollars &lt; total_amount &lt; 2000 dollars</w:t>
+            </w:r>
+          </w:p>
+        </w:tc>
+      </w:tr>
+      <w:tr>
+        <w:tc>
+          <w:tcPr>
+            <w:tcW w:w="3145" w:type="dxa"/>
+          </w:tcPr>
+          <w:p>
+            <w:pPr>
+              <w:jc w:val="both"/>
+              <w:rPr>
+                <w:rFonts w:ascii="Times New Roman" w:hAnsi="Times New Roman" w:cs="Times New Roman"/>
+                <w:sz w:val="22"/>
+                <w:szCs w:val="22"/>
+              </w:rPr>
+            </w:pPr>
+            <w:r>
+              <w:rPr>
+                <w:rFonts w:ascii="Times New Roman" w:hAnsi="Times New Roman" w:cs="Times New Roman"/>
+                <w:sz w:val="22"/>
+                <w:szCs w:val="22"/>
+              </w:rPr>
+              <w:t>trip_duration</w:t>
+            </w:r>
+          </w:p>
+        </w:tc>
+        <w:tc>
+          <w:tcPr>
+            <w:tcW w:w="5940" w:type="dxa"/>
+          </w:tcPr>
+          <w:p>
+            <w:pPr>
+              <w:jc w:val="center"/>
+              <w:rPr>
+                <w:rFonts w:ascii="Times New Roman" w:hAnsi="Times New Roman" w:cs="Times New Roman"/>
+                <w:sz w:val="22"/>
+                <w:szCs w:val="22"/>
+              </w:rPr>
+            </w:pPr>
+            <w:r>
+              <w:rPr>
+                <w:rFonts w:ascii="Times New Roman" w:hAnsi="Times New Roman" w:cs="Times New Roman"/>
+                <w:sz w:val="22"/>
+                <w:szCs w:val="22"/>
+              </w:rPr>
+              <w:t>0 &lt; trip_duration &lt; 3 hours</w:t>
+            </w:r>
+          </w:p>
+          <w:p>
+            <w:pPr>
+              <w:jc w:val="center"/>
+              <w:rPr>
+                <w:rFonts w:ascii="Times New Roman" w:hAnsi="Times New Roman" w:cs="Times New Roman"/>
+                <w:sz w:val="22"/>
+                <w:szCs w:val="22"/>
+              </w:rPr>
+            </w:pPr>
+          </w:p>
+        </w:tc>
+      </w:tr>
+      <w:tr>
+        <w:tc>
+          <w:tcPr>
+            <w:tcW w:w="3145" w:type="dxa"/>
+          </w:tcPr>
+          <w:p>
+            <w:pPr>
+              <w:jc w:val="both"/>
+              <w:rPr>
+                <w:rFonts w:ascii="Times New Roman" w:hAnsi="Times New Roman" w:cs="Times New Roman"/>
+                <w:sz w:val="22"/>
+                <w:szCs w:val="22"/>
+              </w:rPr>
+            </w:pPr>
+            <w:r>
+              <w:rPr>
+                <w:rFonts w:ascii="Times New Roman" w:hAnsi="Times New Roman" w:cs="Times New Roman"/>
+                <w:sz w:val="22"/>
+                <w:szCs w:val="22"/>
+              </w:rPr>
+              <w:t>average_trip_speed</w:t>
+            </w:r>
+          </w:p>
+        </w:tc>
+        <w:tc>
+          <w:tcPr>
+            <w:tcW w:w="5940" w:type="dxa"/>
+          </w:tcPr>
+          <w:p>
+            <w:pPr>
+              <w:jc w:val="center"/>
+              <w:rPr>
+                <w:rFonts w:ascii="Times New Roman" w:hAnsi="Times New Roman" w:cs="Times New Roman"/>
+                <w:sz w:val="22"/>
+                <w:szCs w:val="22"/>
+              </w:rPr>
+            </w:pPr>
+            <w:r>
+              <w:rPr>
+                <w:rFonts w:ascii="Times New Roman" w:hAnsi="Times New Roman" w:cs="Times New Roman"/>
+                <w:sz w:val="22"/>
+                <w:szCs w:val="22"/>
+              </w:rPr>
+              <w:t>0 &lt; average_trip_speed &lt; 55</w:t>
+            </w:r>
+          </w:p>
+          <w:p>
+            <w:pPr>
+              <w:jc w:val="center"/>
+              <w:rPr>
+                <w:rFonts w:ascii="Times New Roman" w:hAnsi="Times New Roman" w:cs="Times New Roman"/>
+                <w:sz w:val="22"/>
+                <w:szCs w:val="22"/>
+              </w:rPr>
+            </w:pPr>
+            <w:r>
+              <w:rPr>
+                <w:rFonts w:ascii="Times New Roman" w:hAnsi="Times New Roman" w:cs="Times New Roman"/>
+                <w:sz w:val="22"/>
+                <w:szCs w:val="22"/>
+              </w:rPr>
+              <w:t>(The maximum speed limit of 55 mph was considered as the upper bound)</w:t>
+            </w:r>
+          </w:p>
+        </w:tc>
+      </w:tr>
+    </w:tbl>
+    <w:p/>
+    <w:p>
+      <w:pPr>
+        <w:pStyle w:val="Caption"/>
+        <w:keepNext/>
+      </w:pPr>
+      <w:r>
+        <w:t xml:space="preserve">Table </w:t>
+      </w:r>
+      <w:r>
+        <w:fldChar w:fldCharType="begin"/>
+      </w:r>
+      <w:r>
+        <w:instrText xml:space="preserve"> SEQ Table \* ARABIC </w:instrText>
+      </w:r>
+      <w:r>
+        <w:fldChar w:fldCharType="separate"/>
+      </w:r>
+      <w:r>
+        <w:rPr>
+          <w:noProof/>
+        </w:rPr>
+        <w:t>6</w:t>
+      </w:r>
+      <w:r>
+        <w:rPr>
+          <w:noProof/>
+        </w:rPr>
+        <w:fldChar w:fldCharType="end"/>
+      </w:r>
+      <w:r>
+        <w:t>: Data cleaning summary.</w:t>
       </w:r>
     </w:p>
     <w:tbl>
@@ -3333,6 +4612,14 @@
                 <w:szCs w:val="22"/>
               </w:rPr>
             </w:pPr>
+            <w:r>
+              <w:rPr>
+                <w:rFonts w:ascii="Times New Roman" w:hAnsi="Times New Roman" w:cs="Times New Roman"/>
+                <w:sz w:val="22"/>
+                <w:szCs w:val="22"/>
+              </w:rPr>
+              <w:t>521 176 000</w:t>
+            </w:r>
           </w:p>
         </w:tc>
         <w:tc>
@@ -3456,6 +4743,7 @@
                 <w:sz w:val="22"/>
                 <w:szCs w:val="22"/>
               </w:rPr>
+              <w:lastRenderedPageBreak/>
               <w:t>Total entries after removal of invalid trips</w:t>
             </w:r>
           </w:p>
@@ -3526,7 +4814,7 @@
                 <w:sz w:val="22"/>
                 <w:szCs w:val="22"/>
               </w:rPr>
-              <w:t>Final no. entries to be used in processing dataset</w:t>
+              <w:t>Final no. entries to be used in processing dataset (after sampling)</w:t>
             </w:r>
           </w:p>
         </w:tc>
@@ -3585,7 +4873,6 @@
     </w:tbl>
     <w:p>
       <w:pPr>
-        <w:ind w:left="360"/>
         <w:jc w:val="both"/>
         <w:rPr>
           <w:rFonts w:ascii="Times New Roman" w:hAnsi="Times New Roman" w:cs="Times New Roman"/>
@@ -3813,19 +5100,7 @@
           <w:sz w:val="20"/>
           <w:szCs w:val="20"/>
         </w:rPr>
-        <w:t xml:space="preserve"> 2: </w:t>
-      </w:r>
-      <w:r>
-        <w:rPr>
-          <w:rFonts w:ascii="Times New Roman" w:hAnsi="Times New Roman" w:cs="Times New Roman"/>
-          <w:b/>
-          <w:bCs/>
-          <w:noProof/>
-          <w:color w:val="000000" w:themeColor="text1"/>
-          <w:sz w:val="20"/>
-          <w:szCs w:val="20"/>
-        </w:rPr>
-        <w:t>Average fare and Speed vs hour of day</w:t>
+        <w:t xml:space="preserve"> 2: Average fare and Speed vs hour of day</w:t>
       </w:r>
     </w:p>
     <w:p>
@@ -3895,140 +5170,212 @@
     </w:p>
     <w:p>
       <w:pPr>
-        <w:keepNext/>
-        <w:rPr>
-          <w:color w:val="EE0000"/>
-          <w:sz w:val="56"/>
-          <w:szCs w:val="56"/>
+        <w:ind w:left="360"/>
+        <w:jc w:val="both"/>
+        <w:rPr>
+          <w:rFonts w:ascii="Times New Roman" w:hAnsi="Times New Roman" w:cs="Times New Roman"/>
+          <w:b/>
+          <w:bCs/>
+          <w:sz w:val="40"/>
+          <w:szCs w:val="40"/>
         </w:rPr>
       </w:pPr>
     </w:p>
     <w:p>
       <w:pPr>
-        <w:keepNext/>
-        <w:rPr>
-          <w:color w:val="EE0000"/>
-          <w:sz w:val="56"/>
-          <w:szCs w:val="56"/>
-        </w:rPr>
-      </w:pPr>
+        <w:ind w:left="360"/>
+        <w:jc w:val="center"/>
+        <w:rPr>
+          <w:rFonts w:ascii="Times New Roman" w:hAnsi="Times New Roman" w:cs="Times New Roman"/>
+          <w:b/>
+          <w:bCs/>
+          <w:noProof/>
+          <w:color w:val="000000" w:themeColor="text1"/>
+          <w:sz w:val="20"/>
+          <w:szCs w:val="20"/>
+        </w:rPr>
+      </w:pPr>
+      <w:r>
+        <w:rPr>
+          <w:rFonts w:ascii="Times New Roman" w:hAnsi="Times New Roman" w:cs="Times New Roman"/>
+          <w:b/>
+          <w:bCs/>
+          <w:noProof/>
+          <w:color w:val="000000" w:themeColor="text1"/>
+          <w:sz w:val="20"/>
+          <w:szCs w:val="20"/>
+        </w:rPr>
+        <w:t>Image</w:t>
+      </w:r>
+      <w:r>
+        <w:rPr>
+          <w:rFonts w:ascii="Times New Roman" w:hAnsi="Times New Roman" w:cs="Times New Roman"/>
+          <w:b/>
+          <w:bCs/>
+          <w:noProof/>
+          <w:color w:val="000000" w:themeColor="text1"/>
+          <w:sz w:val="20"/>
+          <w:szCs w:val="20"/>
+        </w:rPr>
+        <w:t xml:space="preserve"> </w:t>
+      </w:r>
+      <w:r>
+        <w:rPr>
+          <w:rFonts w:ascii="Times New Roman" w:hAnsi="Times New Roman" w:cs="Times New Roman"/>
+          <w:b/>
+          <w:bCs/>
+          <w:noProof/>
+          <w:color w:val="000000" w:themeColor="text1"/>
+          <w:sz w:val="20"/>
+          <w:szCs w:val="20"/>
+        </w:rPr>
+        <w:t>3</w:t>
+      </w:r>
+      <w:r>
+        <w:rPr>
+          <w:rFonts w:ascii="Times New Roman" w:hAnsi="Times New Roman" w:cs="Times New Roman"/>
+          <w:b/>
+          <w:bCs/>
+          <w:noProof/>
+          <w:color w:val="000000" w:themeColor="text1"/>
+          <w:sz w:val="20"/>
+          <w:szCs w:val="20"/>
+        </w:rPr>
+        <w:t xml:space="preserve">: </w:t>
+      </w:r>
+      <w:r>
+        <w:rPr>
+          <w:rFonts w:ascii="Times New Roman" w:hAnsi="Times New Roman" w:cs="Times New Roman"/>
+          <w:b/>
+          <w:bCs/>
+          <w:noProof/>
+          <w:color w:val="000000" w:themeColor="text1"/>
+          <w:sz w:val="20"/>
+          <w:szCs w:val="20"/>
+        </w:rPr>
+        <w:t>Correlation matrix for numerical variables</w:t>
+      </w:r>
     </w:p>
     <w:p>
       <w:pPr>
         <w:keepNext/>
-        <w:rPr>
-          <w:color w:val="EE0000"/>
-          <w:sz w:val="56"/>
-          <w:szCs w:val="56"/>
-        </w:rPr>
-      </w:pPr>
+      </w:pPr>
+      <w:r>
+        <w:rPr>
+          <w:noProof/>
+        </w:rPr>
+        <mc:AlternateContent>
+          <mc:Choice Requires="wpc">
+            <w:drawing>
+              <wp:inline distT="0" distB="0" distL="0" distR="0" wp14:anchorId="03E5F328" wp14:editId="27AE0A8B">
+                <wp:extent cx="5740400" cy="4127500"/>
+                <wp:effectExtent l="0" t="0" r="0" b="6350"/>
+                <wp:docPr id="1811916890" name="Canvas 1"/>
+                <wp:cNvGraphicFramePr>
+                  <a:graphicFrameLocks xmlns:a="http://schemas.openxmlformats.org/drawingml/2006/main" noChangeAspect="1"/>
+                </wp:cNvGraphicFramePr>
+                <a:graphic xmlns:a="http://schemas.openxmlformats.org/drawingml/2006/main">
+                  <a:graphicData uri="http://schemas.microsoft.com/office/word/2010/wordprocessingCanvas">
+                    <wpc:wpc>
+                      <wpc:bg>
+                        <a:solidFill>
+                          <a:prstClr val="white"/>
+                        </a:solidFill>
+                      </wpc:bg>
+                      <wpc:whole/>
+                      <pic:pic xmlns:pic="http://schemas.openxmlformats.org/drawingml/2006/picture">
+                        <pic:nvPicPr>
+                          <pic:cNvPr id="677462690" name="Picture 677462690"/>
+                          <pic:cNvPicPr>
+                            <a:picLocks noChangeAspect="1"/>
+                          </pic:cNvPicPr>
+                        </pic:nvPicPr>
+                        <pic:blipFill>
+                          <a:blip r:embed="rId9"/>
+                          <a:stretch>
+                            <a:fillRect/>
+                          </a:stretch>
+                        </pic:blipFill>
+                        <pic:spPr>
+                          <a:xfrm>
+                            <a:off x="839461" y="0"/>
+                            <a:ext cx="4045254" cy="4038600"/>
+                          </a:xfrm>
+                          <a:prstGeom prst="rect">
+                            <a:avLst/>
+                          </a:prstGeom>
+                        </pic:spPr>
+                      </pic:pic>
+                    </wpc:wpc>
+                  </a:graphicData>
+                </a:graphic>
+              </wp:inline>
+            </w:drawing>
+          </mc:Choice>
+          <mc:Fallback>
+            <w:pict>
+              <v:group w14:anchorId="0CCDB1C5" id="Canvas 1" o:spid="_x0000_s1026" editas="canvas" style="width:452pt;height:325pt;mso-position-horizontal-relative:char;mso-position-vertical-relative:line" coordsize="57404,41275" o:gfxdata="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">
+                <v:shapetype id="_x0000_t75" coordsize="21600,21600" o:spt="75" o:preferrelative="t" path="m@4@5l@4@11@9@11@9@5xe" filled="f" stroked="f">
+                  <v:stroke joinstyle="miter"/>
+                  <v:formulas>
+                    <v:f eqn="if lineDrawn pixelLineWidth 0"/>
+                    <v:f eqn="sum @0 1 0"/>
+                    <v:f eqn="sum 0 0 @1"/>
+                    <v:f eqn="prod @2 1 2"/>
+                    <v:f eqn="prod @3 21600 pixelWidth"/>
+                    <v:f eqn="prod @3 21600 pixelHeight"/>
+                    <v:f eqn="sum @0 0 1"/>
+                    <v:f eqn="prod @6 1 2"/>
+                    <v:f eqn="prod @7 21600 pixelWidth"/>
+                    <v:f eqn="sum @8 21600 0"/>
+                    <v:f eqn="prod @7 21600 pixelHeight"/>
+                    <v:f eqn="sum @10 21600 0"/>
+                  </v:formulas>
+                  <v:path o:extrusionok="f" gradientshapeok="t" o:connecttype="rect"/>
+                  <o:lock v:ext="edit" aspectratio="t"/>
+                </v:shapetype>
+                <v:shape id="_x0000_s1027" type="#_x0000_t75" style="position:absolute;width:57404;height:41275;visibility:visible;mso-wrap-style:square" filled="t">
+                  <v:fill o:detectmouseclick="t"/>
+                  <v:path o:connecttype="none"/>
+                </v:shape>
+                <v:shape id="Picture 677462690" o:spid="_x0000_s1028" type="#_x0000_t75" style="position:absolute;left:8394;width:40453;height:40386;visibility:visible;mso-wrap-style:square" o:gfxdata="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">
+                  <v:imagedata r:id="rId10" o:title=""/>
+                </v:shape>
+                <w10:anchorlock/>
+              </v:group>
+            </w:pict>
+          </mc:Fallback>
+        </mc:AlternateContent>
+      </w:r>
     </w:p>
     <w:p>
       <w:pPr>
-        <w:keepNext/>
-        <w:rPr>
-          <w:color w:val="EE0000"/>
-          <w:sz w:val="56"/>
-          <w:szCs w:val="56"/>
+        <w:ind w:left="360"/>
+        <w:jc w:val="both"/>
+        <w:rPr>
+          <w:rFonts w:ascii="Times New Roman" w:hAnsi="Times New Roman" w:cs="Times New Roman"/>
+          <w:b/>
+          <w:bCs/>
+          <w:sz w:val="40"/>
+          <w:szCs w:val="40"/>
         </w:rPr>
       </w:pPr>
     </w:p>
     <w:p>
       <w:pPr>
-        <w:keepNext/>
-        <w:rPr>
-          <w:color w:val="EE0000"/>
-          <w:sz w:val="56"/>
-          <w:szCs w:val="56"/>
-        </w:rPr>
-      </w:pPr>
-    </w:p>
-    <w:p>
-      <w:pPr>
-        <w:keepNext/>
-        <w:rPr>
-          <w:color w:val="EE0000"/>
-          <w:sz w:val="56"/>
-          <w:szCs w:val="56"/>
-        </w:rPr>
-      </w:pPr>
-    </w:p>
-    <w:p>
-      <w:pPr>
-        <w:keepNext/>
-        <w:rPr>
-          <w:color w:val="EE0000"/>
-          <w:sz w:val="56"/>
-          <w:szCs w:val="56"/>
-        </w:rPr>
-      </w:pPr>
-    </w:p>
-    <w:p>
-      <w:pPr>
-        <w:keepNext/>
-        <w:rPr>
-          <w:color w:val="EE0000"/>
-          <w:sz w:val="56"/>
-          <w:szCs w:val="56"/>
-        </w:rPr>
-      </w:pPr>
-    </w:p>
-    <w:p>
-      <w:pPr>
-        <w:keepNext/>
-      </w:pPr>
-    </w:p>
-    <w:p>
-      <w:pPr>
-        <w:pStyle w:val="Caption"/>
-      </w:pPr>
-      <w:r>
-        <w:t xml:space="preserve">Figure </w:t>
-      </w:r>
-      <w:r>
-        <w:fldChar w:fldCharType="begin"/>
-      </w:r>
-      <w:r>
-        <w:instrText xml:space="preserve"> SEQ Figure \* ARABIC </w:instrText>
-      </w:r>
-      <w:r>
-        <w:fldChar w:fldCharType="separate"/>
-      </w:r>
-      <w:r>
-        <w:t>1</w:t>
-      </w:r>
-      <w:r>
-        <w:fldChar w:fldCharType="end"/>
-      </w:r>
-      <w:r>
-        <w:t>: Correlation matrix for the pertinent numerical variables in the dataset.</w:t>
-      </w:r>
-    </w:p>
-    <w:p>
-      <w:pPr>
         <w:pStyle w:val="Caption"/>
         <w:keepNext/>
       </w:pPr>
-      <w:bookmarkStart w:id="2" w:name="_Ref238916291"/>
+      <w:bookmarkStart w:id="5" w:name="_Ref238916291"/>
       <w:r>
         <w:t xml:space="preserve">Table </w:t>
       </w:r>
-      <w:r>
-        <w:fldChar w:fldCharType="begin"/>
-      </w:r>
-      <w:r>
-        <w:instrText xml:space="preserve"> SEQ Table \* ARABIC </w:instrText>
-      </w:r>
-      <w:r>
-        <w:fldChar w:fldCharType="separate"/>
-      </w:r>
-      <w:r>
-        <w:t>4</w:t>
-      </w:r>
-      <w:r>
-        <w:fldChar w:fldCharType="end"/>
-      </w:r>
-      <w:bookmarkEnd w:id="2"/>
+      <w:fldSimple w:instr=" SEQ Table \* ARABIC ">
+        <w:r>
+          <w:t>4</w:t>
+        </w:r>
+      </w:fldSimple>
+      <w:bookmarkEnd w:id="5"/>
       <w:r>
         <w:t>: Numerical variables statistical summary.</w:t>
       </w:r>
@@ -4718,26 +6065,16 @@
         <w:pStyle w:val="Caption"/>
         <w:keepNext/>
       </w:pPr>
-      <w:bookmarkStart w:id="3" w:name="_Ref238916300"/>
+      <w:bookmarkStart w:id="6" w:name="_Ref238916300"/>
       <w:r>
         <w:t xml:space="preserve">Table </w:t>
       </w:r>
-      <w:r>
-        <w:fldChar w:fldCharType="begin"/>
-      </w:r>
-      <w:r>
-        <w:instrText xml:space="preserve"> SEQ Table \* ARABIC </w:instrText>
-      </w:r>
-      <w:r>
-        <w:fldChar w:fldCharType="separate"/>
-      </w:r>
-      <w:r>
-        <w:t>5</w:t>
-      </w:r>
-      <w:r>
-        <w:fldChar w:fldCharType="end"/>
-      </w:r>
-      <w:bookmarkEnd w:id="3"/>
+      <w:fldSimple w:instr=" SEQ Table \* ARABIC ">
+        <w:r>
+          <w:t>5</w:t>
+        </w:r>
+      </w:fldSimple>
+      <w:bookmarkEnd w:id="6"/>
       <w:r>
         <w:t>: Categorical variables summary.</w:t>
       </w:r>
@@ -5115,425 +6452,6 @@
           <w:szCs w:val="40"/>
         </w:rPr>
         <w:t xml:space="preserve"> – Code used for the EDA </w:t>
-      </w:r>
-    </w:p>
-    <w:p>
-      <w:pPr>
-        <w:pStyle w:val="ListParagraph"/>
-        <w:numPr>
-          <w:ilvl w:val="0"/>
-          <w:numId w:val="1"/>
-        </w:numPr>
-        <w:rPr>
-          <w:rFonts w:ascii="Times New Roman" w:hAnsi="Times New Roman" w:cs="Times New Roman"/>
-          <w:color w:val="EE0000"/>
-          <w:sz w:val="22"/>
-          <w:szCs w:val="22"/>
-        </w:rPr>
-      </w:pPr>
-      <w:r>
-        <w:rPr>
-          <w:rFonts w:ascii="Times New Roman" w:hAnsi="Times New Roman" w:cs="Times New Roman"/>
-          <w:color w:val="EE0000"/>
-          <w:sz w:val="22"/>
-          <w:szCs w:val="22"/>
-        </w:rPr>
-        <w:t>Exploratory Data Analysis</w:t>
-      </w:r>
-    </w:p>
-    <w:p>
-      <w:pPr>
-        <w:pStyle w:val="ListParagraph"/>
-        <w:rPr>
-          <w:rFonts w:ascii="Times New Roman" w:hAnsi="Times New Roman" w:cs="Times New Roman"/>
-          <w:b/>
-          <w:bCs/>
-          <w:color w:val="EE0000"/>
-          <w:sz w:val="22"/>
-          <w:szCs w:val="22"/>
-        </w:rPr>
-      </w:pPr>
-      <w:r>
-        <w:rPr>
-          <w:rFonts w:ascii="Times New Roman" w:hAnsi="Times New Roman" w:cs="Times New Roman"/>
-          <w:b/>
-          <w:bCs/>
-          <w:color w:val="EE0000"/>
-          <w:sz w:val="22"/>
-          <w:szCs w:val="22"/>
-        </w:rPr>
-        <w:t xml:space="preserve">Correlation matrix for all variables </w:t>
-      </w:r>
-    </w:p>
-    <w:p>
-      <w:pPr>
-        <w:pStyle w:val="ListParagraph"/>
-        <w:rPr>
-          <w:rFonts w:ascii="Times New Roman" w:hAnsi="Times New Roman" w:cs="Times New Roman"/>
-          <w:b/>
-          <w:bCs/>
-          <w:color w:val="EE0000"/>
-          <w:sz w:val="22"/>
-          <w:szCs w:val="22"/>
-        </w:rPr>
-      </w:pPr>
-      <w:r>
-        <w:rPr>
-          <w:rFonts w:ascii="Times New Roman" w:hAnsi="Times New Roman" w:cs="Times New Roman"/>
-          <w:b/>
-          <w:bCs/>
-          <w:color w:val="EE0000"/>
-          <w:sz w:val="22"/>
-          <w:szCs w:val="22"/>
-        </w:rPr>
-        <w:t>Range, average, for each variable</w:t>
-      </w:r>
-    </w:p>
-    <w:p>
-      <w:pPr>
-        <w:pStyle w:val="ListParagraph"/>
-        <w:rPr>
-          <w:rFonts w:ascii="Times New Roman" w:hAnsi="Times New Roman" w:cs="Times New Roman"/>
-          <w:b/>
-          <w:bCs/>
-          <w:color w:val="EE0000"/>
-          <w:sz w:val="22"/>
-          <w:szCs w:val="22"/>
-        </w:rPr>
-      </w:pPr>
-      <w:r>
-        <w:rPr>
-          <w:rFonts w:ascii="Times New Roman" w:hAnsi="Times New Roman" w:cs="Times New Roman"/>
-          <w:b/>
-          <w:bCs/>
-          <w:color w:val="EE0000"/>
-          <w:sz w:val="22"/>
-          <w:szCs w:val="22"/>
-        </w:rPr>
-        <w:t>Outliers for each variable</w:t>
-      </w:r>
-    </w:p>
-    <w:p>
-      <w:pPr>
-        <w:pStyle w:val="ListParagraph"/>
-        <w:rPr>
-          <w:rFonts w:ascii="Times New Roman" w:hAnsi="Times New Roman" w:cs="Times New Roman"/>
-          <w:color w:val="EE0000"/>
-          <w:sz w:val="22"/>
-          <w:szCs w:val="22"/>
-        </w:rPr>
-      </w:pPr>
-      <w:r>
-        <w:rPr>
-          <w:rFonts w:ascii="Times New Roman" w:hAnsi="Times New Roman" w:cs="Times New Roman"/>
-          <w:color w:val="EE0000"/>
-          <w:sz w:val="22"/>
-          <w:szCs w:val="22"/>
-        </w:rPr>
-        <w:t xml:space="preserve">Patterns – Speed versus area code? </w:t>
-      </w:r>
-    </w:p>
-    <w:p>
-      <w:pPr>
-        <w:pStyle w:val="ListParagraph"/>
-        <w:rPr>
-          <w:rFonts w:ascii="Times New Roman" w:hAnsi="Times New Roman" w:cs="Times New Roman"/>
-          <w:color w:val="EE0000"/>
-          <w:sz w:val="22"/>
-          <w:szCs w:val="22"/>
-        </w:rPr>
-      </w:pPr>
-      <w:r>
-        <w:rPr>
-          <w:rFonts w:ascii="Times New Roman" w:hAnsi="Times New Roman" w:cs="Times New Roman"/>
-          <w:color w:val="EE0000"/>
-          <w:sz w:val="22"/>
-          <w:szCs w:val="22"/>
-        </w:rPr>
-        <w:t>Average fare over time</w:t>
-      </w:r>
-    </w:p>
-    <w:p>
-      <w:pPr>
-        <w:pStyle w:val="ListParagraph"/>
-        <w:rPr>
-          <w:rFonts w:ascii="Times New Roman" w:hAnsi="Times New Roman" w:cs="Times New Roman"/>
-          <w:color w:val="EE0000"/>
-          <w:sz w:val="22"/>
-          <w:szCs w:val="22"/>
-        </w:rPr>
-      </w:pPr>
-      <w:r>
-        <w:rPr>
-          <w:rFonts w:ascii="Times New Roman" w:hAnsi="Times New Roman" w:cs="Times New Roman"/>
-          <w:color w:val="EE0000"/>
-          <w:sz w:val="22"/>
-          <w:szCs w:val="22"/>
-        </w:rPr>
-        <w:t>Total trips over time</w:t>
-      </w:r>
-    </w:p>
-    <w:p>
-      <w:pPr>
-        <w:pStyle w:val="ListParagraph"/>
-        <w:rPr>
-          <w:rFonts w:ascii="Times New Roman" w:hAnsi="Times New Roman" w:cs="Times New Roman"/>
-          <w:color w:val="EE0000"/>
-          <w:sz w:val="22"/>
-          <w:szCs w:val="22"/>
-        </w:rPr>
-      </w:pPr>
-      <w:r>
-        <w:rPr>
-          <w:rFonts w:ascii="Times New Roman" w:hAnsi="Times New Roman" w:cs="Times New Roman"/>
-          <w:color w:val="EE0000"/>
-          <w:sz w:val="22"/>
-          <w:szCs w:val="22"/>
-        </w:rPr>
-        <w:t>Payment splits – how it changes over time between electronic versus cash payments</w:t>
-      </w:r>
-    </w:p>
-    <w:p>
-      <w:pPr>
-        <w:pStyle w:val="ListParagraph"/>
-        <w:rPr>
-          <w:rFonts w:ascii="Times New Roman" w:hAnsi="Times New Roman" w:cs="Times New Roman"/>
-          <w:color w:val="EE0000"/>
-          <w:sz w:val="22"/>
-          <w:szCs w:val="22"/>
-        </w:rPr>
-      </w:pPr>
-      <w:r>
-        <w:rPr>
-          <w:rFonts w:ascii="Times New Roman" w:hAnsi="Times New Roman" w:cs="Times New Roman"/>
-          <w:color w:val="EE0000"/>
-          <w:sz w:val="22"/>
-          <w:szCs w:val="22"/>
-        </w:rPr>
-        <w:t>What affects the tipping?</w:t>
-      </w:r>
-    </w:p>
-    <w:p>
-      <w:pPr>
-        <w:pStyle w:val="ListParagraph"/>
-        <w:ind w:left="1440"/>
-        <w:rPr>
-          <w:rFonts w:ascii="Times New Roman" w:hAnsi="Times New Roman" w:cs="Times New Roman"/>
-          <w:color w:val="EE0000"/>
-          <w:sz w:val="22"/>
-          <w:szCs w:val="22"/>
-        </w:rPr>
-      </w:pPr>
-      <w:r>
-        <w:rPr>
-          <w:rFonts w:ascii="Times New Roman" w:hAnsi="Times New Roman" w:cs="Times New Roman"/>
-          <w:color w:val="EE0000"/>
-          <w:sz w:val="22"/>
-          <w:szCs w:val="22"/>
-        </w:rPr>
-        <w:t xml:space="preserve">Tip versus distance </w:t>
-      </w:r>
-    </w:p>
-    <w:p>
-      <w:pPr>
-        <w:pStyle w:val="ListParagraph"/>
-        <w:ind w:left="1440"/>
-        <w:rPr>
-          <w:rFonts w:ascii="Times New Roman" w:hAnsi="Times New Roman" w:cs="Times New Roman"/>
-          <w:color w:val="EE0000"/>
-          <w:sz w:val="22"/>
-          <w:szCs w:val="22"/>
-        </w:rPr>
-      </w:pPr>
-      <w:r>
-        <w:rPr>
-          <w:rFonts w:ascii="Times New Roman" w:hAnsi="Times New Roman" w:cs="Times New Roman"/>
-          <w:color w:val="EE0000"/>
-          <w:sz w:val="22"/>
-          <w:szCs w:val="22"/>
-        </w:rPr>
-        <w:t>Tip versus payment type</w:t>
-      </w:r>
-    </w:p>
-    <w:p>
-      <w:pPr>
-        <w:pStyle w:val="ListParagraph"/>
-        <w:ind w:left="1440"/>
-        <w:rPr>
-          <w:rFonts w:ascii="Times New Roman" w:hAnsi="Times New Roman" w:cs="Times New Roman"/>
-          <w:color w:val="EE0000"/>
-          <w:sz w:val="22"/>
-          <w:szCs w:val="22"/>
-        </w:rPr>
-      </w:pPr>
-      <w:r>
-        <w:rPr>
-          <w:rFonts w:ascii="Times New Roman" w:hAnsi="Times New Roman" w:cs="Times New Roman"/>
-          <w:color w:val="EE0000"/>
-          <w:sz w:val="22"/>
-          <w:szCs w:val="22"/>
-        </w:rPr>
-        <w:t>Tip versus area codes</w:t>
-      </w:r>
-    </w:p>
-    <w:p>
-      <w:pPr>
-        <w:pStyle w:val="ListParagraph"/>
-        <w:ind w:left="1440"/>
-        <w:rPr>
-          <w:rFonts w:ascii="Times New Roman" w:hAnsi="Times New Roman" w:cs="Times New Roman"/>
-          <w:color w:val="EE0000"/>
-          <w:sz w:val="22"/>
-          <w:szCs w:val="22"/>
-        </w:rPr>
-      </w:pPr>
-      <w:r>
-        <w:rPr>
-          <w:rFonts w:ascii="Times New Roman" w:hAnsi="Times New Roman" w:cs="Times New Roman"/>
-          <w:color w:val="EE0000"/>
-          <w:sz w:val="22"/>
-          <w:szCs w:val="22"/>
-        </w:rPr>
-        <w:t xml:space="preserve">Tip versus no passengers </w:t>
-      </w:r>
-    </w:p>
-    <w:p>
-      <w:pPr>
-        <w:pStyle w:val="ListParagraph"/>
-        <w:ind w:left="1440"/>
-        <w:rPr>
-          <w:rFonts w:ascii="Times New Roman" w:hAnsi="Times New Roman" w:cs="Times New Roman"/>
-          <w:color w:val="EE0000"/>
-          <w:sz w:val="22"/>
-          <w:szCs w:val="22"/>
-        </w:rPr>
-      </w:pPr>
-      <w:r>
-        <w:rPr>
-          <w:rFonts w:ascii="Times New Roman" w:hAnsi="Times New Roman" w:cs="Times New Roman"/>
-          <w:color w:val="EE0000"/>
-          <w:sz w:val="22"/>
-          <w:szCs w:val="22"/>
-        </w:rPr>
-        <w:t>Tip versus vendors</w:t>
-      </w:r>
-    </w:p>
-    <w:p>
-      <w:pPr>
-        <w:rPr>
-          <w:rFonts w:ascii="Times New Roman" w:hAnsi="Times New Roman" w:cs="Times New Roman"/>
-          <w:color w:val="EE0000"/>
-          <w:sz w:val="22"/>
-          <w:szCs w:val="22"/>
-        </w:rPr>
-      </w:pPr>
-      <w:r>
-        <w:rPr>
-          <w:rFonts w:ascii="Times New Roman" w:hAnsi="Times New Roman" w:cs="Times New Roman"/>
-          <w:color w:val="EE0000"/>
-          <w:sz w:val="22"/>
-          <w:szCs w:val="22"/>
-        </w:rPr>
-        <w:tab/>
-        <w:t>*</w:t>
-      </w:r>
-      <w:proofErr w:type="gramStart"/>
-      <w:r>
-        <w:rPr>
-          <w:rFonts w:ascii="Times New Roman" w:hAnsi="Times New Roman" w:cs="Times New Roman"/>
-          <w:color w:val="EE0000"/>
-          <w:sz w:val="22"/>
-          <w:szCs w:val="22"/>
-        </w:rPr>
-        <w:t>check</w:t>
-      </w:r>
-      <w:proofErr w:type="gramEnd"/>
-      <w:r>
-        <w:rPr>
-          <w:rFonts w:ascii="Times New Roman" w:hAnsi="Times New Roman" w:cs="Times New Roman"/>
-          <w:color w:val="EE0000"/>
-          <w:sz w:val="22"/>
-          <w:szCs w:val="22"/>
-        </w:rPr>
-        <w:t xml:space="preserve"> major events in NYC over the 2014-current period</w:t>
-      </w:r>
-    </w:p>
-    <w:p>
-      <w:pPr>
-        <w:rPr>
-          <w:rFonts w:ascii="Times New Roman" w:hAnsi="Times New Roman" w:cs="Times New Roman"/>
-          <w:color w:val="EE0000"/>
-          <w:sz w:val="22"/>
-          <w:szCs w:val="22"/>
-        </w:rPr>
-      </w:pPr>
-      <w:r>
-        <w:rPr>
-          <w:rFonts w:ascii="Times New Roman" w:hAnsi="Times New Roman" w:cs="Times New Roman"/>
-          <w:color w:val="EE0000"/>
-          <w:sz w:val="22"/>
-          <w:szCs w:val="22"/>
-        </w:rPr>
-        <w:tab/>
-      </w:r>
-      <w:proofErr w:type="spellStart"/>
-      <w:r>
-        <w:rPr>
-          <w:rFonts w:ascii="Times New Roman" w:hAnsi="Times New Roman" w:cs="Times New Roman"/>
-          <w:color w:val="EE0000"/>
-          <w:sz w:val="22"/>
-          <w:szCs w:val="22"/>
-        </w:rPr>
-        <w:t>Location_ID</w:t>
-      </w:r>
-      <w:proofErr w:type="spellEnd"/>
-      <w:r>
-        <w:rPr>
-          <w:rFonts w:ascii="Times New Roman" w:hAnsi="Times New Roman" w:cs="Times New Roman"/>
-          <w:color w:val="EE0000"/>
-          <w:sz w:val="22"/>
-          <w:szCs w:val="22"/>
-        </w:rPr>
-        <w:t xml:space="preserve"> versus the trip times by vendor</w:t>
-      </w:r>
-    </w:p>
-    <w:p>
-      <w:pPr>
-        <w:rPr>
-          <w:rFonts w:ascii="Times New Roman" w:hAnsi="Times New Roman" w:cs="Times New Roman"/>
-          <w:color w:val="EE0000"/>
-          <w:sz w:val="22"/>
-          <w:szCs w:val="22"/>
-        </w:rPr>
-      </w:pPr>
-      <w:r>
-        <w:rPr>
-          <w:rFonts w:ascii="Times New Roman" w:hAnsi="Times New Roman" w:cs="Times New Roman"/>
-          <w:color w:val="EE0000"/>
-          <w:sz w:val="22"/>
-          <w:szCs w:val="22"/>
-        </w:rPr>
-        <w:tab/>
-      </w:r>
-      <w:proofErr w:type="spellStart"/>
-      <w:r>
-        <w:rPr>
-          <w:rFonts w:ascii="Times New Roman" w:hAnsi="Times New Roman" w:cs="Times New Roman"/>
-          <w:color w:val="EE0000"/>
-          <w:sz w:val="22"/>
-          <w:szCs w:val="22"/>
-        </w:rPr>
-        <w:t>Location_IDs</w:t>
-      </w:r>
-      <w:proofErr w:type="spellEnd"/>
-      <w:r>
-        <w:rPr>
-          <w:rFonts w:ascii="Times New Roman" w:hAnsi="Times New Roman" w:cs="Times New Roman"/>
-          <w:color w:val="EE0000"/>
-          <w:sz w:val="22"/>
-          <w:szCs w:val="22"/>
-        </w:rPr>
-        <w:t xml:space="preserve"> – are the start and end ones the same</w:t>
       </w:r>
     </w:p>
     <w:sectPr>
@@ -6801,6 +7719,7 @@
   <w:style w:type="character" w:default="1" w:styleId="DefaultParagraphFont">
     <w:name w:val="Default Paragraph Font"/>
     <w:uiPriority w:val="1"/>
+    <w:semiHidden/>
     <w:unhideWhenUsed/>
   </w:style>
   <w:style w:type="table" w:default="1" w:styleId="TableNormal">

</xml_diff>